<commit_message>
E2-B3 independent sealed round: qualification-gate protocol, strict GP attribution, failure autopsy, main-report convergence, docx audit
</commit_message>
<xml_diff>
--- a/docs/主报告.docx
+++ b/docs/主报告.docx
@@ -31,7 +31,7 @@
           <w:color w:val="595959"/>
           <w:sz w:val="19"/>
         </w:rPr>
-        <w:t>范围声明（必读）：本报告主结论限定为 E2“已冻结策略在同一 v4 仿真条件下的重评”+ E1/E3–E5 工程验证。</w:t>
+        <w:t>范围声明（必读）：本报告主结论为 E2-B3 独立密封重评 + E1/E3–E5 工程验证。</w:t>
       </w:r>
     </w:p>
     <w:p>
@@ -47,7 +47,7 @@
           <w:color w:val="595959"/>
           <w:sz w:val="19"/>
         </w:rPr>
-        <w:t>E2 有两轮：B1 混合冻结重评（</w:t>
+        <w:t>B3（</w:t>
       </w:r>
       <w:r>
         <w:rPr>
@@ -57,7 +57,7 @@
           <w:color w:val="A31515"/>
           <w:sz w:val="17"/>
         </w:rPr>
-        <w:t>sealed-80x7-v4</w:t>
+        <w:t>sealed-80x7-b3</w:t>
       </w:r>
       <w:r>
         <w:rPr>
@@ -67,7 +67,7 @@
           <w:color w:val="595959"/>
           <w:sz w:val="19"/>
         </w:rPr>
-        <w:t>，v3 冻结 + legacy 保守 + replay）与</w:t>
+        <w:t>）：统一重训冻结 + 部署门仅用资格集 + 密封集选择全程未见 + LLM 在完整 48 训练集冻结。</w:t>
       </w:r>
     </w:p>
     <w:p>
@@ -83,47 +83,7 @@
           <w:color w:val="595959"/>
           <w:sz w:val="19"/>
         </w:rPr>
-        <w:t>B2 统一重训后重评（</w:t>
-      </w:r>
-      <w:r>
-        <w:rPr>
-          <w:rFonts w:ascii="Consolas" w:hAnsi="Consolas" w:eastAsia="微软雅黑"/>
-          <w:b w:val="0"/>
-          <w:i w:val="0"/>
-          <w:color w:val="A31515"/>
-          <w:sz w:val="17"/>
-        </w:rPr>
-        <w:t>sealed-80x7-v4-retrain</w:t>
-      </w:r>
-      <w:r>
-        <w:rPr>
-          <w:rFonts w:ascii="微软雅黑" w:hAnsi="微软雅黑" w:eastAsia="微软雅黑"/>
-          <w:b w:val="0"/>
-          <w:i w:val="0"/>
-          <w:color w:val="595959"/>
-          <w:sz w:val="19"/>
-        </w:rPr>
-        <w:t xml:space="preserve">，同一 48/16/16 流水线 </w:t>
-      </w:r>
-      <w:r>
-        <w:rPr>
-          <w:rFonts w:ascii="Consolas" w:hAnsi="Consolas" w:eastAsia="微软雅黑"/>
-          <w:b w:val="0"/>
-          <w:i w:val="0"/>
-          <w:color w:val="A31515"/>
-          <w:sz w:val="17"/>
-        </w:rPr>
-        <w:t>v4-20260907-8f3fd5f</w:t>
-      </w:r>
-      <w:r>
-        <w:rPr>
-          <w:rFonts w:ascii="微软雅黑" w:hAnsi="微软雅黑" w:eastAsia="微软雅黑"/>
-          <w:b w:val="0"/>
-          <w:i w:val="0"/>
-          <w:color w:val="595959"/>
-          <w:sz w:val="19"/>
-        </w:rPr>
-        <w:t xml:space="preserve"> 全量重训冻结，legacy 双清零）。</w:t>
+        <w:t>B1（混合冻结）与 B2（部署门误用密封集）保留为历史对照，不再承担主结论。</w:t>
       </w:r>
     </w:p>
     <w:p>
@@ -139,7 +99,43 @@
           <w:color w:val="595959"/>
           <w:sz w:val="19"/>
         </w:rPr>
-        <w:t>B2 为统一训练预算比较，B1 不是。教程式操作步骤、分算法曲线、历史批次说明分别见附件（</w:t>
+        <w:t xml:space="preserve">各方法训练预算不同（台账见 §4 </w:t>
+      </w:r>
+      <w:r>
+        <w:rPr>
+          <w:rFonts w:ascii="Consolas" w:hAnsi="Consolas" w:eastAsia="微软雅黑"/>
+          <w:b w:val="0"/>
+          <w:i w:val="0"/>
+          <w:color w:val="A31515"/>
+          <w:sz w:val="17"/>
+        </w:rPr>
+        <w:t>budget_table.csv</w:t>
+      </w:r>
+      <w:r>
+        <w:rPr>
+          <w:rFonts w:ascii="微软雅黑" w:hAnsi="微软雅黑" w:eastAsia="微软雅黑"/>
+          <w:b w:val="0"/>
+          <w:i w:val="0"/>
+          <w:color w:val="595959"/>
+          <w:sz w:val="19"/>
+        </w:rPr>
+        <w:t>），只有 BO/随机臂可用“同预算”措辞。</w:t>
+      </w:r>
+    </w:p>
+    <w:p>
+      <w:pPr>
+        <w:spacing w:after="40"/>
+        <w:ind w:left="340"/>
+      </w:pPr>
+      <w:r>
+        <w:rPr>
+          <w:rFonts w:ascii="微软雅黑" w:hAnsi="微软雅黑" w:eastAsia="微软雅黑"/>
+          <w:b w:val="0"/>
+          <w:i w:val="0"/>
+          <w:color w:val="595959"/>
+          <w:sz w:val="19"/>
+        </w:rPr>
+        <w:t>教程式操作步骤、分算法曲线、历史批次说明分别见附件（</w:t>
       </w:r>
       <w:r>
         <w:rPr>
@@ -186,26 +182,6 @@
           <w:sz w:val="17"/>
         </w:rPr>
         <w:t>EXPERIMENTS.md 登记编号 + 文件 + 行/列 + code_sha</w:t>
-      </w:r>
-      <w:r>
-        <w:rPr>
-          <w:rFonts w:ascii="微软雅黑" w:hAnsi="微软雅黑" w:eastAsia="微软雅黑"/>
-          <w:b w:val="0"/>
-          <w:i w:val="0"/>
-          <w:color w:val="595959"/>
-          <w:sz w:val="19"/>
-        </w:rPr>
-        <w:t xml:space="preserve">；E2 两轮证据见 </w:t>
-      </w:r>
-      <w:r>
-        <w:rPr>
-          <w:rFonts w:ascii="Consolas" w:hAnsi="Consolas" w:eastAsia="微软雅黑"/>
-          <w:b w:val="0"/>
-          <w:i w:val="0"/>
-          <w:color w:val="A31515"/>
-          <w:sz w:val="17"/>
-        </w:rPr>
-        <w:t>artifacts/runs/sealed-80x7-v4*/</w:t>
       </w:r>
       <w:r>
         <w:rPr>
@@ -272,7 +248,21 @@
           <w:i w:val="0"/>
           <w:sz w:val="21"/>
         </w:rPr>
-        <w:t>主实验 E2 将 7 种已冻结策略放在同一 80 场景密封清单、同一噪声种子、同一六子步 v4 积分器、同一指标下重评（每轮 560 条记录）。</w:t>
+        <w:t>主实验 E2-B3 将 7 种冻结策略放在同一 80 场景独立密封清单（部署门在资格集已结束，密封场景选择全程未见）、</w:t>
+      </w:r>
+    </w:p>
+    <w:p>
+      <w:pPr>
+        <w:spacing w:after="80"/>
+      </w:pPr>
+      <w:r>
+        <w:rPr>
+          <w:rFonts w:ascii="微软雅黑" w:hAnsi="微软雅黑" w:eastAsia="微软雅黑"/>
+          <w:b w:val="0"/>
+          <w:i w:val="0"/>
+          <w:sz w:val="21"/>
+        </w:rPr>
+        <w:t>同一噪声种子、同一六子步 v4 积分器、同一指标下评价（560 条记录）。</w:t>
       </w:r>
     </w:p>
     <w:p>
@@ -305,26 +295,7 @@
           <w:i w:val="0"/>
           <w:sz w:val="21"/>
         </w:rPr>
-        <w:t xml:space="preserve"> + bootstrap 95% CI；验收为 </w:t>
-      </w:r>
-      <w:r>
-        <w:rPr>
-          <w:rFonts w:ascii="Consolas" w:hAnsi="Consolas" w:eastAsia="微软雅黑"/>
-          <w:b w:val="0"/>
-          <w:i w:val="0"/>
-          <w:color w:val="A31515"/>
-          <w:sz w:val="19"/>
-        </w:rPr>
-        <w:t>bounded &amp; comfort_held &amp; recovery_ok &amp; actuator_compliant</w:t>
-      </w:r>
-      <w:r>
-        <w:rPr>
-          <w:rFonts w:ascii="微软雅黑" w:hAnsi="微软雅黑" w:eastAsia="微软雅黑"/>
-          <w:b w:val="0"/>
-          <w:i w:val="0"/>
-          <w:sz w:val="21"/>
-        </w:rPr>
-        <w:t xml:space="preserve"> 四项全过。</w:t>
+        <w:t xml:space="preserve"> + bootstrap 95% CI；验收为四项全过；非劣界 1.02。</w:t>
       </w:r>
     </w:p>
     <w:p>
@@ -338,7 +309,7 @@
           <w:i w:val="0"/>
           <w:sz w:val="21"/>
         </w:rPr>
-        <w:t>B1（混合冻结）主要发现：数值有界 7/7 达 80/80，但温控验收仅 Safe-BO 保守参数 51/80 明显领先，其余 38–40/80，Z-N 6/80。</w:t>
+        <w:t>主要发现：数值有界 7/7 达 80/80，但温控验收最高仅 40/80（IMC/Safe-BO/FNN/LLM 并列），Z-N 6/80。</w:t>
       </w:r>
     </w:p>
     <w:p>
@@ -352,7 +323,7 @@
           <w:i w:val="0"/>
           <w:sz w:val="21"/>
         </w:rPr>
-        <w:t>性能上仅 Safe-BO 保守参数显著优于 IMC（0.9185 [0.8863,0.9516]），BO/FNN/RL/LLM-replay 与 IMC 持平区间（RL 0.9817 [0.9620,1.0070] 含 1，未证显著优；旧版 0.9664 实为均值之比，已更正）。</w:t>
+        <w:t>性能上无任何方法显著优于 IMC：BO 1.0785 [1.0424,1.1146] 显著更差（原因尚未完成归因，禁止径称过拟合），</w:t>
       </w:r>
     </w:p>
     <w:p>
@@ -366,26 +337,7 @@
           <w:i w:val="0"/>
           <w:sz w:val="21"/>
         </w:rPr>
-        <w:t xml:space="preserve">B2（统一重训 </w:t>
-      </w:r>
-      <w:r>
-        <w:rPr>
-          <w:rFonts w:ascii="Consolas" w:hAnsi="Consolas" w:eastAsia="微软雅黑"/>
-          <w:b w:val="0"/>
-          <w:i w:val="0"/>
-          <w:color w:val="A31515"/>
-          <w:sz w:val="19"/>
-        </w:rPr>
-        <w:t>v4-20260907-8f3fd5f</w:t>
-      </w:r>
-      <w:r>
-        <w:rPr>
-          <w:rFonts w:ascii="微软雅黑" w:hAnsi="微软雅黑" w:eastAsia="微软雅黑"/>
-          <w:b w:val="0"/>
-          <w:i w:val="0"/>
-          <w:sz w:val="21"/>
-        </w:rPr>
-        <w:t>，48/16/16，legacy 双清零）主要发现：在同一训练预算下，</w:t>
+        <w:t>Safe-BO 与 FNN 回落到等于 IMC（前者选中基线本身，后者资格集门未通过→回退），RL 0.9801 [0.9611,1.0041] 未发现显著优势（非劣成立）。</w:t>
       </w:r>
     </w:p>
     <w:p>
@@ -399,7 +351,7 @@
           <w:i w:val="0"/>
           <w:sz w:val="21"/>
         </w:rPr>
-        <w:t>没有任何方法显著优于 IMC——BO 1.0785 [1.0424,1.1146] 显著更差（训练过拟合），Safe-BO 回落到等于 IMC（选中基线本身），</w:t>
+        <w:t>失败归因：7 个场景全算法失败（1 容量紧张 + 6 观察窗不足）；33 个调参残余失败全部卡在扰动恢复，</w:t>
       </w:r>
     </w:p>
     <w:p>
@@ -413,7 +365,7 @@
           <w:i w:val="0"/>
           <w:sz w:val="21"/>
         </w:rPr>
-        <w:t>FNN 0.9920 [0.9762,1.0102]、RL 0.9801 [0.9611,1.0041] 均与 IMC 持平。这是诚实的阴性结果，见 §5 第二表。</w:t>
+        <w:t>无任何方法系统性挽救 IMC 失败场景——下一步优先级是解释并改善合格率，而非继续排名。</w:t>
       </w:r>
     </w:p>
     <w:p>
@@ -427,7 +379,7 @@
           <w:i w:val="0"/>
           <w:sz w:val="21"/>
         </w:rPr>
-        <w:t>E3 消融显示随机增益差 3–8×，保守公式差 5.9×；Safe-BO 证据支持该保守参数集，不证明 GP 搜索机制。</w:t>
+        <w:t>E3+ 严格对照（同初值同噪声，4 搜索种子）：GP 对同预算随机的混合池配对差 −0.0057 [−0.0373,+0.0284]（含 0），</w:t>
       </w:r>
     </w:p>
     <w:p>
@@ -441,26 +393,7 @@
           <w:i w:val="0"/>
           <w:sz w:val="21"/>
         </w:rPr>
-        <w:t>E3+ 同预算归因（B2 训练谱，</w:t>
-      </w:r>
-      <w:r>
-        <w:rPr>
-          <w:rFonts w:ascii="Consolas" w:hAnsi="Consolas" w:eastAsia="微软雅黑"/>
-          <w:b w:val="0"/>
-          <w:i w:val="0"/>
-          <w:color w:val="A31515"/>
-          <w:sz w:val="19"/>
-        </w:rPr>
-        <w:t>gp_attribution.csv</w:t>
-      </w:r>
-      <w:r>
-        <w:rPr>
-          <w:rFonts w:ascii="微软雅黑" w:hAnsi="微软雅黑" w:eastAsia="微软雅黑"/>
-          <w:b w:val="0"/>
-          <w:i w:val="0"/>
-          <w:sz w:val="21"/>
-        </w:rPr>
-        <w:t>）：GP 为 BO 带来训练均值 +6.0%/密封配对比 +6.8% 的相对增益（BO-full 1.0785 vs 同初值 1.1567 vs 同预算纯随机 1.3266），</w:t>
+        <w:t>机制贡献未经证实。E4 LLM 真实矩阵独立报告（v3 5/18 部署，v4 1/18 部署），不参与排名。</w:t>
       </w:r>
     </w:p>
     <w:p>
@@ -474,35 +407,7 @@
           <w:i w:val="0"/>
           <w:sz w:val="21"/>
         </w:rPr>
-        <w:t>但三者绝对值均差于 IMC——GP 机制有效但不足以让 BO 在本预算下超过调好的 IMC。</w:t>
-      </w:r>
-    </w:p>
-    <w:p>
-      <w:pPr>
-        <w:spacing w:after="80"/>
-      </w:pPr>
-      <w:r>
-        <w:rPr>
-          <w:rFonts w:ascii="微软雅黑" w:hAnsi="微软雅黑" w:eastAsia="微软雅黑"/>
-          <w:b w:val="0"/>
-          <w:i w:val="0"/>
-          <w:sz w:val="21"/>
-        </w:rPr>
-        <w:t>E4 LLM 真实矩阵独立报告采用率与回退（v3 矩阵 5/18 部署，v4 矩阵 1/18 部署），不参与 E2 排名。</w:t>
-      </w:r>
-    </w:p>
-    <w:p>
-      <w:pPr>
-        <w:spacing w:after="80"/>
-      </w:pPr>
-      <w:r>
-        <w:rPr>
-          <w:rFonts w:ascii="微软雅黑" w:hAnsi="微软雅黑" w:eastAsia="微软雅黑"/>
-          <w:b w:val="0"/>
-          <w:i w:val="0"/>
-          <w:sz w:val="21"/>
-        </w:rPr>
-        <w:t>E5 PC-SIL/Python-C++ 对拍/ESP32 编译证明软件一致性，不代替实体温控实验（实体遥测/目标 WCET/HIL 三门待外部验证，本机 ESP32 编译因工具链路径含中文失败未刷新，见尝试日志）。</w:t>
+        <w:t>E5 软件一致性成立（PC-SIL PASS），实体三门仍待验证。</w:t>
       </w:r>
     </w:p>
     <w:p>
@@ -669,6 +574,60 @@
     </w:p>
     <w:p>
       <w:pPr>
+        <w:jc w:val="center"/>
+      </w:pPr>
+      <w:r>
+        <w:drawing>
+          <wp:inline xmlns:a="http://schemas.openxmlformats.org/drawingml/2006/main" xmlns:pic="http://schemas.openxmlformats.org/drawingml/2006/picture">
+            <wp:extent cx="5580000" cy="1826182"/>
+            <wp:docPr id="1" name="Picture 1"/>
+            <wp:cNvGraphicFramePr>
+              <a:graphicFrameLocks noChangeAspect="1"/>
+            </wp:cNvGraphicFramePr>
+            <a:graphic>
+              <a:graphicData uri="http://schemas.openxmlformats.org/drawingml/2006/picture">
+                <pic:pic>
+                  <pic:nvPicPr>
+                    <pic:cNvPr id="0" name="run_arch.png"/>
+                    <pic:cNvPicPr/>
+                  </pic:nvPicPr>
+                  <pic:blipFill>
+                    <a:blip r:embed="rId9"/>
+                    <a:stretch>
+                      <a:fillRect/>
+                    </a:stretch>
+                  </pic:blipFill>
+                  <pic:spPr>
+                    <a:xfrm>
+                      <a:off x="0" y="0"/>
+                      <a:ext cx="5580000" cy="1826182"/>
+                    </a:xfrm>
+                    <a:prstGeom prst="rect"/>
+                  </pic:spPr>
+                </pic:pic>
+              </a:graphicData>
+            </a:graphic>
+          </wp:inline>
+        </w:drawing>
+      </w:r>
+    </w:p>
+    <w:p>
+      <w:pPr>
+        <w:jc w:val="center"/>
+      </w:pPr>
+      <w:r>
+        <w:rPr>
+          <w:rFonts w:ascii="微软雅黑" w:hAnsi="微软雅黑" w:eastAsia="微软雅黑"/>
+          <w:b w:val="0"/>
+          <w:i w:val="0"/>
+          <w:color w:val="595959"/>
+          <w:sz w:val="18"/>
+        </w:rPr>
+        <w:t>运行架构</w:t>
+      </w:r>
+    </w:p>
+    <w:p>
+      <w:pPr>
         <w:spacing w:after="80"/>
       </w:pPr>
       <w:r>
@@ -678,7 +637,7 @@
           <w:i w:val="0"/>
           <w:sz w:val="21"/>
         </w:rPr>
-        <w:t>运行架构：上位机离线整定/训练 → 冻结策略（</w:t>
+        <w:t>运行架构（上图）：上位机离线整定/训练 → 冻结策略（</w:t>
       </w:r>
       <w:r>
         <w:rPr>
@@ -697,7 +656,61 @@
           <w:i w:val="0"/>
           <w:sz w:val="21"/>
         </w:rPr>
-        <w:t xml:space="preserve"> 同目录版本锁定）→ 在线增益调度（FNN/RL 按状态查表/覆盖掩码回退 IMC）→ 安全 PI（含 ±10% 限幅与回退）→ 执行器（延迟/惯性/slew/量化/最小开停机）→ 3R2C 热对象 → 传感器（噪声/滤波）→ 闭环。</w:t>
+        <w:t xml:space="preserve"> 同目录版本锁定）→ 在线增益调度（FNN/RL 按状态查表/覆盖掩码回退 IMC；LLM 只在离线提建议）→ 安全 PI（含 ±10% 限幅与回退）→ 执行器（延迟/惯性/slew/量化/最小开停机）→ 3R2C 热对象 → 传感器（噪声/滤波）→ 闭环。</w:t>
+      </w:r>
+    </w:p>
+    <w:p>
+      <w:pPr>
+        <w:jc w:val="center"/>
+      </w:pPr>
+      <w:r>
+        <w:drawing>
+          <wp:inline xmlns:a="http://schemas.openxmlformats.org/drawingml/2006/main" xmlns:pic="http://schemas.openxmlformats.org/drawingml/2006/picture">
+            <wp:extent cx="5580000" cy="4836000"/>
+            <wp:docPr id="2" name="Picture 2"/>
+            <wp:cNvGraphicFramePr>
+              <a:graphicFrameLocks noChangeAspect="1"/>
+            </wp:cNvGraphicFramePr>
+            <a:graphic>
+              <a:graphicData uri="http://schemas.openxmlformats.org/drawingml/2006/picture">
+                <pic:pic>
+                  <pic:nvPicPr>
+                    <pic:cNvPr id="0" name="evidence_flow.png"/>
+                    <pic:cNvPicPr/>
+                  </pic:nvPicPr>
+                  <pic:blipFill>
+                    <a:blip r:embed="rId10"/>
+                    <a:stretch>
+                      <a:fillRect/>
+                    </a:stretch>
+                  </pic:blipFill>
+                  <pic:spPr>
+                    <a:xfrm>
+                      <a:off x="0" y="0"/>
+                      <a:ext cx="5580000" cy="4836000"/>
+                    </a:xfrm>
+                    <a:prstGeom prst="rect"/>
+                  </pic:spPr>
+                </pic:pic>
+              </a:graphicData>
+            </a:graphic>
+          </wp:inline>
+        </w:drawing>
+      </w:r>
+    </w:p>
+    <w:p>
+      <w:pPr>
+        <w:jc w:val="center"/>
+      </w:pPr>
+      <w:r>
+        <w:rPr>
+          <w:rFonts w:ascii="微软雅黑" w:hAnsi="微软雅黑" w:eastAsia="微软雅黑"/>
+          <w:b w:val="0"/>
+          <w:i w:val="0"/>
+          <w:color w:val="595959"/>
+          <w:sz w:val="18"/>
+        </w:rPr>
+        <w:t>证据流程</w:t>
       </w:r>
     </w:p>
     <w:p>
@@ -711,7 +724,7 @@
           <w:i w:val="0"/>
           <w:sz w:val="21"/>
         </w:rPr>
-        <w:t>证据流程：实验配置（</w:t>
+        <w:t>证据流程（上图）：实验配置（</w:t>
       </w:r>
       <w:r>
         <w:rPr>
@@ -730,7 +743,7 @@
           <w:i w:val="0"/>
           <w:sz w:val="21"/>
         </w:rPr>
-        <w:t xml:space="preserve"> 唯一事实源）→ 数据划分（48 训练/16 验证/16 测试 + 5×16=80 密封，种子固定）→ 训练/选择 → 冻结 → 独立评估（E2）→ 统计（主/次分开）→ 报告（本主报告 + 附件）。</w:t>
+        <w:t xml:space="preserve"> 唯一事实源）→ 数据划分（48 训练/16 验证/16 资格/80 密封，四向隔离 + SHA-256 泄漏检查）→ 训练/选择/资格门 → 冻结 → 独立密封评价（只打分）→ 统计（主/次分开）→ 报告（本主报告 + 附件）。</w:t>
       </w:r>
     </w:p>
     <w:p>
@@ -773,7 +786,7 @@
           <w:color w:val="1F4E79"/>
           <w:sz w:val="30"/>
         </w:rPr>
-        <w:t>3 七类方法及统一接口</w:t>
+        <w:t>3 七类方法及统一接口（B3 冻结值；B1/B2 值见历史批次附件）</w:t>
       </w:r>
     </w:p>
     <w:tbl>
@@ -865,7 +878,7 @@
                 <w:i w:val="0"/>
                 <w:sz w:val="18"/>
               </w:rPr>
-              <w:t>训练与部署区别</w:t>
+              <w:t>B3 冻结（Kp/Ki）</w:t>
             </w:r>
           </w:p>
         </w:tc>
@@ -915,7 +928,7 @@
                 <w:i w:val="0"/>
                 <w:sz w:val="18"/>
               </w:rPr>
-              <w:t>FOPDT→固定 Kp/Ki（限幅后 1.5/0.08）</w:t>
+              <w:t>FOPDT→固定增益（限幅后）</w:t>
             </w:r>
           </w:p>
         </w:tc>
@@ -931,7 +944,7 @@
                 <w:i w:val="0"/>
                 <w:sz w:val="18"/>
               </w:rPr>
-              <w:t>无训练，E2 对照基线</w:t>
+              <w:t>1.5 / 0.08，对照基线</w:t>
             </w:r>
           </w:p>
         </w:tc>
@@ -981,7 +994,7 @@
                 <w:i w:val="0"/>
                 <w:sz w:val="18"/>
               </w:rPr>
-              <w:t>FOPDT+λ→固定 0.5175/0.004054</w:t>
+              <w:t>FOPDT+λ→固定增益</w:t>
             </w:r>
           </w:p>
         </w:tc>
@@ -997,7 +1010,7 @@
                 <w:i w:val="0"/>
                 <w:sz w:val="18"/>
               </w:rPr>
-              <w:t>21 λ 穷举，冻结即回退基准</w:t>
+              <w:t>0.5180 / 0.004057，回退基准</w:t>
             </w:r>
           </w:p>
         </w:tc>
@@ -1047,7 +1060,7 @@
                 <w:i w:val="0"/>
                 <w:sz w:val="18"/>
               </w:rPr>
-              <w:t>训练 J→固定 0.5355/0.006345</w:t>
+              <w:t>训练 J→固定增益</w:t>
             </w:r>
           </w:p>
         </w:tc>
@@ -1063,7 +1076,7 @@
                 <w:i w:val="0"/>
                 <w:sz w:val="18"/>
               </w:rPr>
-              <w:t>14 评估，冻结部署</w:t>
+              <w:t>0.6265 / 0.005896，14 评估</w:t>
             </w:r>
           </w:p>
         </w:tc>
@@ -1113,7 +1126,7 @@
                 <w:i w:val="0"/>
                 <w:sz w:val="18"/>
               </w:rPr>
-              <w:t>训练 J+风险→固定 0.3838/0.004441（本轮为初始保守种子）</w:t>
+              <w:t>训练 J+风险→固定增益</w:t>
             </w:r>
           </w:p>
         </w:tc>
@@ -1129,7 +1142,7 @@
                 <w:i w:val="0"/>
                 <w:sz w:val="18"/>
               </w:rPr>
-              <w:t>本轮证明参数集，不证搜索机制</w:t>
+              <w:t>等于 IMC（选中基线本身）</w:t>
             </w:r>
           </w:p>
         </w:tc>
@@ -1179,7 +1192,7 @@
                 <w:i w:val="0"/>
                 <w:sz w:val="18"/>
               </w:rPr>
-              <w:t>状态→Δ增益（IMC 附近 ±10%）</w:t>
+              <w:t>状态→Δ增益（±10%）</w:t>
             </w:r>
           </w:p>
         </w:tc>
@@ -1195,7 +1208,7 @@
                 <w:i w:val="0"/>
                 <w:sz w:val="18"/>
               </w:rPr>
-              <w:t>离线训表，在线查表</w:t>
+              <w:t>资格门未通过→回退 IMC</w:t>
             </w:r>
           </w:p>
         </w:tc>
@@ -1245,7 +1258,7 @@
                 <w:i w:val="0"/>
                 <w:sz w:val="18"/>
               </w:rPr>
-              <w:t>状态→Δ增益，未覆盖回退 IMC</w:t>
+              <w:t>状态→Δ增益，未覆盖回退</w:t>
             </w:r>
           </w:p>
         </w:tc>
@@ -1261,7 +1274,7 @@
                 <w:i w:val="0"/>
                 <w:sz w:val="18"/>
               </w:rPr>
-              <w:t>离线训表，在线掩码门控</w:t>
+              <w:t>Q 表 + 冻结掩码，门通过</w:t>
             </w:r>
           </w:p>
         </w:tc>
@@ -1311,7 +1324,7 @@
                 <w:i w:val="0"/>
                 <w:sz w:val="18"/>
               </w:rPr>
-              <w:t>工况描述→候选增益（replay 冻结等于 IMC）</w:t>
+              <w:t>工况描述→候选增益</w:t>
             </w:r>
           </w:p>
         </w:tc>
@@ -1327,7 +1340,7 @@
                 <w:i w:val="0"/>
                 <w:sz w:val="18"/>
               </w:rPr>
-              <w:t>E2 为 replay 冻结；真实调用见 E4 独立矩阵</w:t>
+              <w:t>完整 48 训练集仍无接受候选，等于 IMC；真实调用见 E4</w:t>
             </w:r>
           </w:p>
         </w:tc>
@@ -1426,7 +1439,54 @@
           <w:i w:val="0"/>
           <w:sz w:val="21"/>
         </w:rPr>
-        <w:t>E2 密封重评：80 场景（</w:t>
+        <w:t>E2-B3 独立密封：四向隔离（48 训练/16 验证/16 资格/80 密封，</w:t>
+      </w:r>
+      <w:r>
+        <w:rPr>
+          <w:rFonts w:ascii="Consolas" w:hAnsi="Consolas" w:eastAsia="微软雅黑"/>
+          <w:b w:val="0"/>
+          <w:i w:val="0"/>
+          <w:color w:val="A31515"/>
+          <w:sz w:val="19"/>
+        </w:rPr>
+        <w:t>dataset_manifest.csv</w:t>
+      </w:r>
+      <w:r>
+        <w:rPr>
+          <w:rFonts w:ascii="微软雅黑" w:hAnsi="微软雅黑" w:eastAsia="微软雅黑"/>
+          <w:b w:val="0"/>
+          <w:i w:val="0"/>
+          <w:sz w:val="21"/>
+        </w:rPr>
+        <w:t xml:space="preserve"> SHA-256 防泄漏）；</w:t>
+      </w:r>
+    </w:p>
+    <w:p>
+      <w:pPr>
+        <w:spacing w:after="80"/>
+      </w:pPr>
+      <w:r>
+        <w:rPr>
+          <w:rFonts w:ascii="微软雅黑" w:hAnsi="微软雅黑" w:eastAsia="微软雅黑"/>
+          <w:b w:val="0"/>
+          <w:i w:val="0"/>
+          <w:sz w:val="21"/>
+        </w:rPr>
+        <w:t>部署门只用资格集（FNN 未通过→回退 IMC，RL 通过），冻结后密封集只打分；</w:t>
+      </w:r>
+    </w:p>
+    <w:p>
+      <w:pPr>
+        <w:spacing w:after="80"/>
+      </w:pPr>
+      <w:r>
+        <w:rPr>
+          <w:rFonts w:ascii="微软雅黑" w:hAnsi="微软雅黑" w:eastAsia="微软雅黑"/>
+          <w:b w:val="0"/>
+          <w:i w:val="0"/>
+          <w:sz w:val="21"/>
+        </w:rPr>
+        <w:t>80 场景（</w:t>
       </w:r>
       <w:r>
         <w:rPr>
@@ -1437,25 +1497,6 @@
           <w:sz w:val="19"/>
         </w:rPr>
         <w:t>acceptance_seeds=101,211,307,401,503</w:t>
-      </w:r>
-      <w:r>
-        <w:rPr>
-          <w:rFonts w:ascii="微软雅黑" w:hAnsi="微软雅黑" w:eastAsia="微软雅黑"/>
-          <w:b w:val="0"/>
-          <w:i w:val="0"/>
-          <w:sz w:val="21"/>
-        </w:rPr>
-        <w:t>，</w:t>
-      </w:r>
-      <w:r>
-        <w:rPr>
-          <w:rFonts w:ascii="Consolas" w:hAnsi="Consolas" w:eastAsia="微软雅黑"/>
-          <w:b w:val="0"/>
-          <w:i w:val="0"/>
-          <w:color w:val="A31515"/>
-          <w:sz w:val="19"/>
-        </w:rPr>
-        <w:t>seed+100003+seed_i</w:t>
       </w:r>
       <w:r>
         <w:rPr>
@@ -1483,7 +1524,7 @@
           <w:i w:val="0"/>
           <w:sz w:val="21"/>
         </w:rPr>
-        <w:t>），七算法同场景同种子同积分器同指标；FNN/RL 记候选 vs 执行；测试后调参换新密封集。</w:t>
+        <w:t>，门噪声系独立）；</w:t>
       </w:r>
     </w:p>
     <w:p>
@@ -1497,7 +1538,827 @@
           <w:i w:val="0"/>
           <w:sz w:val="21"/>
         </w:rPr>
-        <w:t>E3 消融：同 80 场景 4 组随机固定增益 + 保守 IMC 公式，隔离“搜索 vs 保守初值”。</w:t>
+        <w:t>七算法同场景同种子同积分器同指标；测试后调参换新密封集。</w:t>
+      </w:r>
+    </w:p>
+    <w:p>
+      <w:pPr>
+        <w:spacing w:after="80"/>
+      </w:pPr>
+      <w:r>
+        <w:rPr>
+          <w:rFonts w:ascii="微软雅黑" w:hAnsi="微软雅黑" w:eastAsia="微软雅黑"/>
+          <w:b w:val="0"/>
+          <w:i w:val="0"/>
+          <w:sz w:val="21"/>
+        </w:rPr>
+        <w:t>训练预算台账（</w:t>
+      </w:r>
+      <w:r>
+        <w:rPr>
+          <w:rFonts w:ascii="Consolas" w:hAnsi="Consolas" w:eastAsia="微软雅黑"/>
+          <w:b w:val="0"/>
+          <w:i w:val="0"/>
+          <w:color w:val="A31515"/>
+          <w:sz w:val="19"/>
+        </w:rPr>
+        <w:t>sealed-80x7-b3/budget_table.csv</w:t>
+      </w:r>
+      <w:r>
+        <w:rPr>
+          <w:rFonts w:ascii="微软雅黑" w:hAnsi="微软雅黑" w:eastAsia="微软雅黑"/>
+          <w:b w:val="0"/>
+          <w:i w:val="0"/>
+          <w:sz w:val="21"/>
+        </w:rPr>
+        <w:t>，每闭环 = 5 对象小时）：</w:t>
+      </w:r>
+    </w:p>
+    <w:tbl>
+      <w:tblPr>
+        <w:tblStyle w:val="TableGrid"/>
+        <w:tblW w:type="auto" w:w="0"/>
+        <w:tblLook w:firstColumn="1" w:firstRow="1" w:lastColumn="0" w:lastRow="0" w:noHBand="0" w:noVBand="1" w:val="04A0"/>
+      </w:tblPr>
+      <w:tblGrid>
+        <w:gridCol w:w="1904"/>
+        <w:gridCol w:w="1904"/>
+        <w:gridCol w:w="1904"/>
+        <w:gridCol w:w="1904"/>
+        <w:gridCol w:w="1904"/>
+      </w:tblGrid>
+      <w:tr>
+        <w:tc>
+          <w:tcPr>
+            <w:tcW w:type="dxa" w:w="1904"/>
+            <w:shd w:fill="DEEAF6" w:val="clear"/>
+          </w:tcPr>
+          <w:p>
+            <w:pPr>
+              <w:jc w:val="center"/>
+            </w:pPr>
+            <w:r>
+              <w:rPr>
+                <w:rFonts w:ascii="微软雅黑" w:hAnsi="微软雅黑" w:eastAsia="微软雅黑"/>
+                <w:b/>
+                <w:i w:val="0"/>
+                <w:sz w:val="18"/>
+              </w:rPr>
+              <w:t>方法</w:t>
+            </w:r>
+          </w:p>
+        </w:tc>
+        <w:tc>
+          <w:tcPr>
+            <w:tcW w:type="dxa" w:w="1904"/>
+            <w:shd w:fill="DEEAF6" w:val="clear"/>
+          </w:tcPr>
+          <w:p>
+            <w:pPr>
+              <w:jc w:val="center"/>
+            </w:pPr>
+            <w:r>
+              <w:rPr>
+                <w:rFonts w:ascii="微软雅黑" w:hAnsi="微软雅黑" w:eastAsia="微软雅黑"/>
+                <w:b/>
+                <w:i w:val="0"/>
+                <w:sz w:val="18"/>
+              </w:rPr>
+              <w:t>训练场景</w:t>
+            </w:r>
+          </w:p>
+        </w:tc>
+        <w:tc>
+          <w:tcPr>
+            <w:tcW w:type="dxa" w:w="1904"/>
+            <w:shd w:fill="DEEAF6" w:val="clear"/>
+          </w:tcPr>
+          <w:p>
+            <w:pPr>
+              <w:jc w:val="center"/>
+            </w:pPr>
+            <w:r>
+              <w:rPr>
+                <w:rFonts w:ascii="微软雅黑" w:hAnsi="微软雅黑" w:eastAsia="微软雅黑"/>
+                <w:b/>
+                <w:i w:val="0"/>
+                <w:sz w:val="18"/>
+              </w:rPr>
+              <w:t>候选评估</w:t>
+            </w:r>
+          </w:p>
+        </w:tc>
+        <w:tc>
+          <w:tcPr>
+            <w:tcW w:type="dxa" w:w="1904"/>
+            <w:shd w:fill="DEEAF6" w:val="clear"/>
+          </w:tcPr>
+          <w:p>
+            <w:pPr>
+              <w:jc w:val="center"/>
+            </w:pPr>
+            <w:r>
+              <w:rPr>
+                <w:rFonts w:ascii="微软雅黑" w:hAnsi="微软雅黑" w:eastAsia="微软雅黑"/>
+                <w:b/>
+                <w:i w:val="0"/>
+                <w:sz w:val="18"/>
+              </w:rPr>
+              <w:t>闭环仿真</w:t>
+            </w:r>
+          </w:p>
+        </w:tc>
+        <w:tc>
+          <w:tcPr>
+            <w:tcW w:type="dxa" w:w="1904"/>
+            <w:shd w:fill="DEEAF6" w:val="clear"/>
+          </w:tcPr>
+          <w:p>
+            <w:pPr>
+              <w:jc w:val="center"/>
+            </w:pPr>
+            <w:r>
+              <w:rPr>
+                <w:rFonts w:ascii="微软雅黑" w:hAnsi="微软雅黑" w:eastAsia="微软雅黑"/>
+                <w:b/>
+                <w:i w:val="0"/>
+                <w:sz w:val="18"/>
+              </w:rPr>
+              <w:t>等效对象小时</w:t>
+            </w:r>
+          </w:p>
+        </w:tc>
+      </w:tr>
+      <w:tr>
+        <w:tc>
+          <w:tcPr>
+            <w:tcW w:type="dxa" w:w="1904"/>
+          </w:tcPr>
+          <w:p>
+            <w:r>
+              <w:rPr>
+                <w:rFonts w:ascii="微软雅黑" w:hAnsi="微软雅黑" w:eastAsia="微软雅黑"/>
+                <w:b w:val="0"/>
+                <w:i w:val="0"/>
+                <w:sz w:val="18"/>
+              </w:rPr>
+              <w:t>Z-N 公式</w:t>
+            </w:r>
+          </w:p>
+        </w:tc>
+        <w:tc>
+          <w:tcPr>
+            <w:tcW w:type="dxa" w:w="1904"/>
+          </w:tcPr>
+          <w:p>
+            <w:r>
+              <w:rPr>
+                <w:rFonts w:ascii="微软雅黑" w:hAnsi="微软雅黑" w:eastAsia="微软雅黑"/>
+                <w:b w:val="0"/>
+                <w:i w:val="0"/>
+                <w:sz w:val="18"/>
+              </w:rPr>
+              <w:t>1（标定）</w:t>
+            </w:r>
+          </w:p>
+        </w:tc>
+        <w:tc>
+          <w:tcPr>
+            <w:tcW w:type="dxa" w:w="1904"/>
+          </w:tcPr>
+          <w:p>
+            <w:r>
+              <w:rPr>
+                <w:rFonts w:ascii="微软雅黑" w:hAnsi="微软雅黑" w:eastAsia="微软雅黑"/>
+                <w:b w:val="0"/>
+                <w:i w:val="0"/>
+                <w:sz w:val="18"/>
+              </w:rPr>
+              <w:t>0</w:t>
+            </w:r>
+          </w:p>
+        </w:tc>
+        <w:tc>
+          <w:tcPr>
+            <w:tcW w:type="dxa" w:w="1904"/>
+          </w:tcPr>
+          <w:p>
+            <w:r>
+              <w:rPr>
+                <w:rFonts w:ascii="微软雅黑" w:hAnsi="微软雅黑" w:eastAsia="微软雅黑"/>
+                <w:b w:val="0"/>
+                <w:i w:val="0"/>
+                <w:sz w:val="18"/>
+              </w:rPr>
+              <w:t>0</w:t>
+            </w:r>
+          </w:p>
+        </w:tc>
+        <w:tc>
+          <w:tcPr>
+            <w:tcW w:type="dxa" w:w="1904"/>
+          </w:tcPr>
+          <w:p>
+            <w:r>
+              <w:rPr>
+                <w:rFonts w:ascii="微软雅黑" w:hAnsi="微软雅黑" w:eastAsia="微软雅黑"/>
+                <w:b w:val="0"/>
+                <w:i w:val="0"/>
+                <w:sz w:val="18"/>
+              </w:rPr>
+              <w:t>0</w:t>
+            </w:r>
+          </w:p>
+        </w:tc>
+      </w:tr>
+      <w:tr>
+        <w:tc>
+          <w:tcPr>
+            <w:tcW w:type="dxa" w:w="1904"/>
+          </w:tcPr>
+          <w:p>
+            <w:r>
+              <w:rPr>
+                <w:rFonts w:ascii="微软雅黑" w:hAnsi="微软雅黑" w:eastAsia="微软雅黑"/>
+                <w:b w:val="0"/>
+                <w:i w:val="0"/>
+                <w:sz w:val="18"/>
+              </w:rPr>
+              <w:t>IMC λ 扫描</w:t>
+            </w:r>
+          </w:p>
+        </w:tc>
+        <w:tc>
+          <w:tcPr>
+            <w:tcW w:type="dxa" w:w="1904"/>
+          </w:tcPr>
+          <w:p>
+            <w:r>
+              <w:rPr>
+                <w:rFonts w:ascii="微软雅黑" w:hAnsi="微软雅黑" w:eastAsia="微软雅黑"/>
+                <w:b w:val="0"/>
+                <w:i w:val="0"/>
+                <w:sz w:val="18"/>
+              </w:rPr>
+              <w:t>48</w:t>
+            </w:r>
+          </w:p>
+        </w:tc>
+        <w:tc>
+          <w:tcPr>
+            <w:tcW w:type="dxa" w:w="1904"/>
+          </w:tcPr>
+          <w:p>
+            <w:r>
+              <w:rPr>
+                <w:rFonts w:ascii="微软雅黑" w:hAnsi="微软雅黑" w:eastAsia="微软雅黑"/>
+                <w:b w:val="0"/>
+                <w:i w:val="0"/>
+                <w:sz w:val="18"/>
+              </w:rPr>
+              <w:t>21</w:t>
+            </w:r>
+          </w:p>
+        </w:tc>
+        <w:tc>
+          <w:tcPr>
+            <w:tcW w:type="dxa" w:w="1904"/>
+          </w:tcPr>
+          <w:p>
+            <w:r>
+              <w:rPr>
+                <w:rFonts w:ascii="微软雅黑" w:hAnsi="微软雅黑" w:eastAsia="微软雅黑"/>
+                <w:b w:val="0"/>
+                <w:i w:val="0"/>
+                <w:sz w:val="18"/>
+              </w:rPr>
+              <w:t>1008</w:t>
+            </w:r>
+          </w:p>
+        </w:tc>
+        <w:tc>
+          <w:tcPr>
+            <w:tcW w:type="dxa" w:w="1904"/>
+          </w:tcPr>
+          <w:p>
+            <w:r>
+              <w:rPr>
+                <w:rFonts w:ascii="微软雅黑" w:hAnsi="微软雅黑" w:eastAsia="微软雅黑"/>
+                <w:b w:val="0"/>
+                <w:i w:val="0"/>
+                <w:sz w:val="18"/>
+              </w:rPr>
+              <w:t>5040</w:t>
+            </w:r>
+          </w:p>
+        </w:tc>
+      </w:tr>
+      <w:tr>
+        <w:tc>
+          <w:tcPr>
+            <w:tcW w:type="dxa" w:w="1904"/>
+          </w:tcPr>
+          <w:p>
+            <w:r>
+              <w:rPr>
+                <w:rFonts w:ascii="微软雅黑" w:hAnsi="微软雅黑" w:eastAsia="微软雅黑"/>
+                <w:b w:val="0"/>
+                <w:i w:val="0"/>
+                <w:sz w:val="18"/>
+              </w:rPr>
+              <w:t>BO（7 初值 + 7 GP）</w:t>
+            </w:r>
+          </w:p>
+        </w:tc>
+        <w:tc>
+          <w:tcPr>
+            <w:tcW w:type="dxa" w:w="1904"/>
+          </w:tcPr>
+          <w:p>
+            <w:r>
+              <w:rPr>
+                <w:rFonts w:ascii="微软雅黑" w:hAnsi="微软雅黑" w:eastAsia="微软雅黑"/>
+                <w:b w:val="0"/>
+                <w:i w:val="0"/>
+                <w:sz w:val="18"/>
+              </w:rPr>
+              <w:t>48</w:t>
+            </w:r>
+          </w:p>
+        </w:tc>
+        <w:tc>
+          <w:tcPr>
+            <w:tcW w:type="dxa" w:w="1904"/>
+          </w:tcPr>
+          <w:p>
+            <w:r>
+              <w:rPr>
+                <w:rFonts w:ascii="微软雅黑" w:hAnsi="微软雅黑" w:eastAsia="微软雅黑"/>
+                <w:b w:val="0"/>
+                <w:i w:val="0"/>
+                <w:sz w:val="18"/>
+              </w:rPr>
+              <w:t>14</w:t>
+            </w:r>
+          </w:p>
+        </w:tc>
+        <w:tc>
+          <w:tcPr>
+            <w:tcW w:type="dxa" w:w="1904"/>
+          </w:tcPr>
+          <w:p>
+            <w:r>
+              <w:rPr>
+                <w:rFonts w:ascii="微软雅黑" w:hAnsi="微软雅黑" w:eastAsia="微软雅黑"/>
+                <w:b w:val="0"/>
+                <w:i w:val="0"/>
+                <w:sz w:val="18"/>
+              </w:rPr>
+              <w:t>672</w:t>
+            </w:r>
+          </w:p>
+        </w:tc>
+        <w:tc>
+          <w:tcPr>
+            <w:tcW w:type="dxa" w:w="1904"/>
+          </w:tcPr>
+          <w:p>
+            <w:r>
+              <w:rPr>
+                <w:rFonts w:ascii="微软雅黑" w:hAnsi="微软雅黑" w:eastAsia="微软雅黑"/>
+                <w:b w:val="0"/>
+                <w:i w:val="0"/>
+                <w:sz w:val="18"/>
+              </w:rPr>
+              <w:t>3360</w:t>
+            </w:r>
+          </w:p>
+        </w:tc>
+      </w:tr>
+      <w:tr>
+        <w:tc>
+          <w:tcPr>
+            <w:tcW w:type="dxa" w:w="1904"/>
+          </w:tcPr>
+          <w:p>
+            <w:r>
+              <w:rPr>
+                <w:rFonts w:ascii="微软雅黑" w:hAnsi="微软雅黑" w:eastAsia="微软雅黑"/>
+                <w:b w:val="0"/>
+                <w:i w:val="0"/>
+                <w:sz w:val="18"/>
+              </w:rPr>
+              <w:t>Safe-BO</w:t>
+            </w:r>
+          </w:p>
+        </w:tc>
+        <w:tc>
+          <w:tcPr>
+            <w:tcW w:type="dxa" w:w="1904"/>
+          </w:tcPr>
+          <w:p>
+            <w:r>
+              <w:rPr>
+                <w:rFonts w:ascii="微软雅黑" w:hAnsi="微软雅黑" w:eastAsia="微软雅黑"/>
+                <w:b w:val="0"/>
+                <w:i w:val="0"/>
+                <w:sz w:val="18"/>
+              </w:rPr>
+              <w:t>48</w:t>
+            </w:r>
+          </w:p>
+        </w:tc>
+        <w:tc>
+          <w:tcPr>
+            <w:tcW w:type="dxa" w:w="1904"/>
+          </w:tcPr>
+          <w:p>
+            <w:r>
+              <w:rPr>
+                <w:rFonts w:ascii="微软雅黑" w:hAnsi="微软雅黑" w:eastAsia="微软雅黑"/>
+                <w:b w:val="0"/>
+                <w:i w:val="0"/>
+                <w:sz w:val="18"/>
+              </w:rPr>
+              <w:t>4</w:t>
+            </w:r>
+          </w:p>
+        </w:tc>
+        <w:tc>
+          <w:tcPr>
+            <w:tcW w:type="dxa" w:w="1904"/>
+          </w:tcPr>
+          <w:p>
+            <w:r>
+              <w:rPr>
+                <w:rFonts w:ascii="微软雅黑" w:hAnsi="微软雅黑" w:eastAsia="微软雅黑"/>
+                <w:b w:val="0"/>
+                <w:i w:val="0"/>
+                <w:sz w:val="18"/>
+              </w:rPr>
+              <w:t>192</w:t>
+            </w:r>
+          </w:p>
+        </w:tc>
+        <w:tc>
+          <w:tcPr>
+            <w:tcW w:type="dxa" w:w="1904"/>
+          </w:tcPr>
+          <w:p>
+            <w:r>
+              <w:rPr>
+                <w:rFonts w:ascii="微软雅黑" w:hAnsi="微软雅黑" w:eastAsia="微软雅黑"/>
+                <w:b w:val="0"/>
+                <w:i w:val="0"/>
+                <w:sz w:val="18"/>
+              </w:rPr>
+              <w:t>960</w:t>
+            </w:r>
+          </w:p>
+        </w:tc>
+      </w:tr>
+      <w:tr>
+        <w:tc>
+          <w:tcPr>
+            <w:tcW w:type="dxa" w:w="1904"/>
+          </w:tcPr>
+          <w:p>
+            <w:r>
+              <w:rPr>
+                <w:rFonts w:ascii="微软雅黑" w:hAnsi="微软雅黑" w:eastAsia="微软雅黑"/>
+                <w:b w:val="0"/>
+                <w:i w:val="0"/>
+                <w:sz w:val="18"/>
+              </w:rPr>
+              <w:t>FNN 标签 + 选择</w:t>
+            </w:r>
+          </w:p>
+        </w:tc>
+        <w:tc>
+          <w:tcPr>
+            <w:tcW w:type="dxa" w:w="1904"/>
+          </w:tcPr>
+          <w:p>
+            <w:r>
+              <w:rPr>
+                <w:rFonts w:ascii="微软雅黑" w:hAnsi="微软雅黑" w:eastAsia="微软雅黑"/>
+                <w:b w:val="0"/>
+                <w:i w:val="0"/>
+                <w:sz w:val="18"/>
+              </w:rPr>
+              <w:t>48 / 16</w:t>
+            </w:r>
+          </w:p>
+        </w:tc>
+        <w:tc>
+          <w:tcPr>
+            <w:tcW w:type="dxa" w:w="1904"/>
+          </w:tcPr>
+          <w:p>
+            <w:r>
+              <w:rPr>
+                <w:rFonts w:ascii="微软雅黑" w:hAnsi="微软雅黑" w:eastAsia="微软雅黑"/>
+                <w:b w:val="0"/>
+                <w:i w:val="0"/>
+                <w:sz w:val="18"/>
+              </w:rPr>
+              <w:t>见备注</w:t>
+            </w:r>
+          </w:p>
+        </w:tc>
+        <w:tc>
+          <w:tcPr>
+            <w:tcW w:type="dxa" w:w="1904"/>
+          </w:tcPr>
+          <w:p>
+            <w:r>
+              <w:rPr>
+                <w:rFonts w:ascii="微软雅黑" w:hAnsi="微软雅黑" w:eastAsia="微软雅黑"/>
+                <w:b w:val="0"/>
+                <w:i w:val="0"/>
+                <w:sz w:val="18"/>
+              </w:rPr>
+              <w:t>768 + 32</w:t>
+            </w:r>
+          </w:p>
+        </w:tc>
+        <w:tc>
+          <w:tcPr>
+            <w:tcW w:type="dxa" w:w="1904"/>
+          </w:tcPr>
+          <w:p>
+            <w:r>
+              <w:rPr>
+                <w:rFonts w:ascii="微软雅黑" w:hAnsi="微软雅黑" w:eastAsia="微软雅黑"/>
+                <w:b w:val="0"/>
+                <w:i w:val="0"/>
+                <w:sz w:val="18"/>
+              </w:rPr>
+              <w:t>3840 + 160</w:t>
+            </w:r>
+          </w:p>
+        </w:tc>
+      </w:tr>
+      <w:tr>
+        <w:tc>
+          <w:tcPr>
+            <w:tcW w:type="dxa" w:w="1904"/>
+          </w:tcPr>
+          <w:p>
+            <w:r>
+              <w:rPr>
+                <w:rFonts w:ascii="微软雅黑" w:hAnsi="微软雅黑" w:eastAsia="微软雅黑"/>
+                <w:b w:val="0"/>
+                <w:i w:val="0"/>
+                <w:sz w:val="18"/>
+              </w:rPr>
+              <w:t>RL 离线步数 + 选择</w:t>
+            </w:r>
+          </w:p>
+        </w:tc>
+        <w:tc>
+          <w:tcPr>
+            <w:tcW w:type="dxa" w:w="1904"/>
+          </w:tcPr>
+          <w:p>
+            <w:r>
+              <w:rPr>
+                <w:rFonts w:ascii="微软雅黑" w:hAnsi="微软雅黑" w:eastAsia="微软雅黑"/>
+                <w:b w:val="0"/>
+                <w:i w:val="0"/>
+                <w:sz w:val="18"/>
+              </w:rPr>
+              <w:t>48</w:t>
+            </w:r>
+          </w:p>
+        </w:tc>
+        <w:tc>
+          <w:tcPr>
+            <w:tcW w:type="dxa" w:w="1904"/>
+          </w:tcPr>
+          <w:p>
+            <w:r>
+              <w:rPr>
+                <w:rFonts w:ascii="微软雅黑" w:hAnsi="微软雅黑" w:eastAsia="微软雅黑"/>
+                <w:b w:val="0"/>
+                <w:i w:val="0"/>
+                <w:sz w:val="18"/>
+              </w:rPr>
+              <w:t>环境步（另计）</w:t>
+            </w:r>
+          </w:p>
+        </w:tc>
+        <w:tc>
+          <w:tcPr>
+            <w:tcW w:type="dxa" w:w="1904"/>
+          </w:tcPr>
+          <w:p>
+            <w:r>
+              <w:rPr>
+                <w:rFonts w:ascii="微软雅黑" w:hAnsi="微软雅黑" w:eastAsia="微软雅黑"/>
+                <w:b w:val="0"/>
+                <w:i w:val="0"/>
+                <w:sz w:val="18"/>
+              </w:rPr>
+              <w:t>496（选择）</w:t>
+            </w:r>
+          </w:p>
+        </w:tc>
+        <w:tc>
+          <w:tcPr>
+            <w:tcW w:type="dxa" w:w="1904"/>
+          </w:tcPr>
+          <w:p>
+            <w:r>
+              <w:rPr>
+                <w:rFonts w:ascii="微软雅黑" w:hAnsi="微软雅黑" w:eastAsia="微软雅黑"/>
+                <w:b w:val="0"/>
+                <w:i w:val="0"/>
+                <w:sz w:val="18"/>
+              </w:rPr>
+              <w:t>2480</w:t>
+            </w:r>
+          </w:p>
+        </w:tc>
+      </w:tr>
+      <w:tr>
+        <w:tc>
+          <w:tcPr>
+            <w:tcW w:type="dxa" w:w="1904"/>
+          </w:tcPr>
+          <w:p>
+            <w:r>
+              <w:rPr>
+                <w:rFonts w:ascii="微软雅黑" w:hAnsi="微软雅黑" w:eastAsia="微软雅黑"/>
+                <w:b w:val="0"/>
+                <w:i w:val="0"/>
+                <w:sz w:val="18"/>
+              </w:rPr>
+              <w:t>部署门（资格集）</w:t>
+            </w:r>
+          </w:p>
+        </w:tc>
+        <w:tc>
+          <w:tcPr>
+            <w:tcW w:type="dxa" w:w="1904"/>
+          </w:tcPr>
+          <w:p>
+            <w:r>
+              <w:rPr>
+                <w:rFonts w:ascii="微软雅黑" w:hAnsi="微软雅黑" w:eastAsia="微软雅黑"/>
+                <w:b w:val="0"/>
+                <w:i w:val="0"/>
+                <w:sz w:val="18"/>
+              </w:rPr>
+              <w:t>16</w:t>
+            </w:r>
+          </w:p>
+        </w:tc>
+        <w:tc>
+          <w:tcPr>
+            <w:tcW w:type="dxa" w:w="1904"/>
+          </w:tcPr>
+          <w:p>
+            <w:r>
+              <w:rPr>
+                <w:rFonts w:ascii="微软雅黑" w:hAnsi="微软雅黑" w:eastAsia="微软雅黑"/>
+                <w:b w:val="0"/>
+                <w:i w:val="0"/>
+                <w:sz w:val="18"/>
+              </w:rPr>
+              <w:t>3/场景</w:t>
+            </w:r>
+          </w:p>
+        </w:tc>
+        <w:tc>
+          <w:tcPr>
+            <w:tcW w:type="dxa" w:w="1904"/>
+          </w:tcPr>
+          <w:p>
+            <w:r>
+              <w:rPr>
+                <w:rFonts w:ascii="微软雅黑" w:hAnsi="微软雅黑" w:eastAsia="微软雅黑"/>
+                <w:b w:val="0"/>
+                <w:i w:val="0"/>
+                <w:sz w:val="18"/>
+              </w:rPr>
+              <w:t>48</w:t>
+            </w:r>
+          </w:p>
+        </w:tc>
+        <w:tc>
+          <w:tcPr>
+            <w:tcW w:type="dxa" w:w="1904"/>
+          </w:tcPr>
+          <w:p>
+            <w:r>
+              <w:rPr>
+                <w:rFonts w:ascii="微软雅黑" w:hAnsi="微软雅黑" w:eastAsia="微软雅黑"/>
+                <w:b w:val="0"/>
+                <w:i w:val="0"/>
+                <w:sz w:val="18"/>
+              </w:rPr>
+              <w:t>240</w:t>
+            </w:r>
+          </w:p>
+        </w:tc>
+      </w:tr>
+      <w:tr>
+        <w:tc>
+          <w:tcPr>
+            <w:tcW w:type="dxa" w:w="1904"/>
+          </w:tcPr>
+          <w:p>
+            <w:r>
+              <w:rPr>
+                <w:rFonts w:ascii="微软雅黑" w:hAnsi="微软雅黑" w:eastAsia="微软雅黑"/>
+                <w:b w:val="0"/>
+                <w:i w:val="0"/>
+                <w:sz w:val="18"/>
+              </w:rPr>
+              <w:t>密封终评</w:t>
+            </w:r>
+          </w:p>
+        </w:tc>
+        <w:tc>
+          <w:tcPr>
+            <w:tcW w:type="dxa" w:w="1904"/>
+          </w:tcPr>
+          <w:p>
+            <w:r>
+              <w:rPr>
+                <w:rFonts w:ascii="微软雅黑" w:hAnsi="微软雅黑" w:eastAsia="微软雅黑"/>
+                <w:b w:val="0"/>
+                <w:i w:val="0"/>
+                <w:sz w:val="18"/>
+              </w:rPr>
+              <w:t>80</w:t>
+            </w:r>
+          </w:p>
+        </w:tc>
+        <w:tc>
+          <w:tcPr>
+            <w:tcW w:type="dxa" w:w="1904"/>
+          </w:tcPr>
+          <w:p>
+            <w:r>
+              <w:rPr>
+                <w:rFonts w:ascii="微软雅黑" w:hAnsi="微软雅黑" w:eastAsia="微软雅黑"/>
+                <w:b w:val="0"/>
+                <w:i w:val="0"/>
+                <w:sz w:val="18"/>
+              </w:rPr>
+              <w:t>7 算法</w:t>
+            </w:r>
+          </w:p>
+        </w:tc>
+        <w:tc>
+          <w:tcPr>
+            <w:tcW w:type="dxa" w:w="1904"/>
+          </w:tcPr>
+          <w:p>
+            <w:r>
+              <w:rPr>
+                <w:rFonts w:ascii="微软雅黑" w:hAnsi="微软雅黑" w:eastAsia="微软雅黑"/>
+                <w:b w:val="0"/>
+                <w:i w:val="0"/>
+                <w:sz w:val="18"/>
+              </w:rPr>
+              <w:t>560</w:t>
+            </w:r>
+          </w:p>
+        </w:tc>
+        <w:tc>
+          <w:tcPr>
+            <w:tcW w:type="dxa" w:w="1904"/>
+          </w:tcPr>
+          <w:p>
+            <w:r>
+              <w:rPr>
+                <w:rFonts w:ascii="微软雅黑" w:hAnsi="微软雅黑" w:eastAsia="微软雅黑"/>
+                <w:b w:val="0"/>
+                <w:i w:val="0"/>
+                <w:sz w:val="18"/>
+              </w:rPr>
+              <w:t>2800</w:t>
+            </w:r>
+          </w:p>
+        </w:tc>
+      </w:tr>
+    </w:tbl>
+    <w:p/>
+    <w:p>
+      <w:pPr>
+        <w:spacing w:after="80"/>
+      </w:pPr>
+      <w:r>
+        <w:rPr>
+          <w:rFonts w:ascii="微软雅黑" w:hAnsi="微软雅黑" w:eastAsia="微软雅黑"/>
+          <w:b w:val="0"/>
+          <w:i w:val="0"/>
+          <w:sz w:val="21"/>
+        </w:rPr>
+        <w:t>E3 消融：同 80 场景随机/保守对照（历史）；E3+ 严格对照：同初值同噪声，4 搜索种子，GP/随机各追加 7 评估，报告混合池配对差。</w:t>
       </w:r>
     </w:p>
     <w:p>
@@ -1525,7 +2386,7 @@
           <w:i w:val="0"/>
           <w:sz w:val="21"/>
         </w:rPr>
-        <w:t>E5 对拍/SIL：75 组 Python/C++ 对拍 ~2.98e-8、CRC、PC-SIL 分频、ESP32 目标编译（RAM/Flash 记录）；历史 Modelica DASSL 12 h 为历史证据，当前未复现。</w:t>
+        <w:t>E5 对拍/SIL：75 组 Python/C++ 对拍 ~2.98e-8、CRC、PC-SIL 分频；历史 Modelica DASSL 12 h 为历史证据，当前未复现。</w:t>
       </w:r>
     </w:p>
     <w:p>
@@ -1558,7 +2419,21 @@
           <w:i w:val="0"/>
           <w:sz w:val="21"/>
         </w:rPr>
-        <w:t xml:space="preserve"> + bootstrap CI（2000，seed+77），非劣界 1.02（上界≤1.02），显著优要求上界&lt;1.0；次 </w:t>
+        <w:t xml:space="preserve"> + bootstrap CI（2000，seed+77），非劣界 1.02（上界≤1.02），显著优要求上界&lt;1.0；</w:t>
+      </w:r>
+    </w:p>
+    <w:p>
+      <w:pPr>
+        <w:spacing w:after="80"/>
+      </w:pPr>
+      <w:r>
+        <w:rPr>
+          <w:rFonts w:ascii="微软雅黑" w:hAnsi="微软雅黑" w:eastAsia="微软雅黑"/>
+          <w:b w:val="0"/>
+          <w:i w:val="0"/>
+          <w:sz w:val="21"/>
+        </w:rPr>
+        <w:t xml:space="preserve">“CI 含 1”读作“未发现显著优势”，不得径称“持平/等效”。次 </w:t>
       </w:r>
       <w:r>
         <w:rPr>
@@ -1601,7 +2476,7 @@
           <w:color w:val="A31515"/>
           <w:sz w:val="19"/>
         </w:rPr>
-        <w:t>python run.py sealed --artifact-dir &lt;bundle&gt; --output &lt;run&gt;</w:t>
+        <w:t>python run.py pipeline --output &lt;run&gt; --seed 7</w:t>
       </w:r>
       <w:r>
         <w:rPr>
@@ -1610,7 +2485,7 @@
           <w:i w:val="0"/>
           <w:sz w:val="21"/>
         </w:rPr>
-        <w:t xml:space="preserve">；一致性 </w:t>
+        <w:t xml:space="preserve"> → </w:t>
       </w:r>
       <w:r>
         <w:rPr>
@@ -1620,7 +2495,7 @@
           <w:color w:val="A31515"/>
           <w:sz w:val="19"/>
         </w:rPr>
-        <w:t>python tools/check_results_consistency.py --sealed-dir &lt;run&gt;</w:t>
+        <w:t>python run.py sealed --artifact-dir &lt;run&gt; --output &lt;sealed&gt; --protocol-label E2-B3</w:t>
       </w:r>
       <w:r>
         <w:rPr>
@@ -1629,7 +2504,78 @@
           <w:i w:val="0"/>
           <w:sz w:val="21"/>
         </w:rPr>
-        <w:t>（重算均值/双统计量/CI/验收/回退定义/溯源）。</w:t>
+        <w:t>；</w:t>
+      </w:r>
+    </w:p>
+    <w:p>
+      <w:pPr>
+        <w:spacing w:after="80"/>
+      </w:pPr>
+      <w:r>
+        <w:rPr>
+          <w:rFonts w:ascii="微软雅黑" w:hAnsi="微软雅黑" w:eastAsia="微软雅黑"/>
+          <w:b w:val="0"/>
+          <w:i w:val="0"/>
+          <w:sz w:val="21"/>
+        </w:rPr>
+        <w:t xml:space="preserve">一致性 </w:t>
+      </w:r>
+      <w:r>
+        <w:rPr>
+          <w:rFonts w:ascii="Consolas" w:hAnsi="Consolas" w:eastAsia="微软雅黑"/>
+          <w:b w:val="0"/>
+          <w:i w:val="0"/>
+          <w:color w:val="A31515"/>
+          <w:sz w:val="19"/>
+        </w:rPr>
+        <w:t>python tools/check_results_consistency.py --sealed-dir &lt;sealed&gt;</w:t>
+      </w:r>
+      <w:r>
+        <w:rPr>
+          <w:rFonts w:ascii="微软雅黑" w:hAnsi="微软雅黑" w:eastAsia="微软雅黑"/>
+          <w:b w:val="0"/>
+          <w:i w:val="0"/>
+          <w:sz w:val="21"/>
+        </w:rPr>
+        <w:t xml:space="preserve">；归因 </w:t>
+      </w:r>
+      <w:r>
+        <w:rPr>
+          <w:rFonts w:ascii="Consolas" w:hAnsi="Consolas" w:eastAsia="微软雅黑"/>
+          <w:b w:val="0"/>
+          <w:i w:val="0"/>
+          <w:color w:val="A31515"/>
+          <w:sz w:val="19"/>
+        </w:rPr>
+        <w:t>python tools/run_gp_attribution.py</w:t>
+      </w:r>
+      <w:r>
+        <w:rPr>
+          <w:rFonts w:ascii="微软雅黑" w:hAnsi="微软雅黑" w:eastAsia="微软雅黑"/>
+          <w:b w:val="0"/>
+          <w:i w:val="0"/>
+          <w:sz w:val="21"/>
+        </w:rPr>
+        <w:t xml:space="preserve">；失败分析 </w:t>
+      </w:r>
+      <w:r>
+        <w:rPr>
+          <w:rFonts w:ascii="Consolas" w:hAnsi="Consolas" w:eastAsia="微软雅黑"/>
+          <w:b w:val="0"/>
+          <w:i w:val="0"/>
+          <w:color w:val="A31515"/>
+          <w:sz w:val="19"/>
+        </w:rPr>
+        <w:t>python tools/analyze_failures.py --sealed &lt;sealed&gt;</w:t>
+      </w:r>
+      <w:r>
+        <w:rPr>
+          <w:rFonts w:ascii="微软雅黑" w:hAnsi="微软雅黑" w:eastAsia="微软雅黑"/>
+          <w:b w:val="0"/>
+          <w:i w:val="0"/>
+          <w:sz w:val="21"/>
+        </w:rPr>
+        <w:t>。</w:t>
       </w:r>
     </w:p>
     <w:p>
@@ -1644,7 +2590,7 @@
           <w:color w:val="1F4E79"/>
           <w:sz w:val="30"/>
         </w:rPr>
-        <w:t>5 结果与失败分析</w:t>
+        <w:t>5 结果与失败分析（E2-B3；B1/B2 见历史对照附件）</w:t>
       </w:r>
     </w:p>
     <w:p>
@@ -1658,7 +2604,7 @@
           <w:i w:val="0"/>
           <w:sz w:val="21"/>
         </w:rPr>
-        <w:t>主结果（E2-B1 混合冻结轮，</w:t>
+        <w:t>主结果（</w:t>
       </w:r>
       <w:r>
         <w:rPr>
@@ -1668,7 +2614,7 @@
           <w:color w:val="A31515"/>
           <w:sz w:val="19"/>
         </w:rPr>
-        <w:t>sealed-80x7-v4/sealed_80_summary.csv:2-8</w:t>
+        <w:t>sealed-80x7-b3/sealed_80_summary.csv:2-8</w:t>
       </w:r>
       <w:r>
         <w:rPr>
@@ -1840,848 +2786,6 @@
                 <w:i w:val="0"/>
                 <w:sz w:val="18"/>
               </w:rPr>
-              <w:t>1.6520 [1.5427,1.7666]</w:t>
-            </w:r>
-          </w:p>
-        </w:tc>
-        <w:tc>
-          <w:tcPr>
-            <w:tcW w:type="dxa" w:w="1904"/>
-          </w:tcPr>
-          <w:p>
-            <w:r>
-              <w:rPr>
-                <w:rFonts w:ascii="微软雅黑" w:hAnsi="微软雅黑" w:eastAsia="微软雅黑"/>
-                <w:b w:val="0"/>
-                <w:i w:val="0"/>
-                <w:sz w:val="18"/>
-              </w:rPr>
-              <w:t>6/80</w:t>
-            </w:r>
-          </w:p>
-        </w:tc>
-        <w:tc>
-          <w:tcPr>
-            <w:tcW w:type="dxa" w:w="1904"/>
-          </w:tcPr>
-          <w:p>
-            <w:r>
-              <w:rPr>
-                <w:rFonts w:ascii="微软雅黑" w:hAnsi="微软雅黑" w:eastAsia="微软雅黑"/>
-                <w:b w:val="0"/>
-                <w:i w:val="0"/>
-                <w:sz w:val="18"/>
-              </w:rPr>
-              <w:t>E2 内显著差</w:t>
-            </w:r>
-          </w:p>
-        </w:tc>
-      </w:tr>
-      <w:tr>
-        <w:tc>
-          <w:tcPr>
-            <w:tcW w:type="dxa" w:w="1904"/>
-          </w:tcPr>
-          <w:p>
-            <w:r>
-              <w:rPr>
-                <w:rFonts w:ascii="微软雅黑" w:hAnsi="微软雅黑" w:eastAsia="微软雅黑"/>
-                <w:b w:val="0"/>
-                <w:i w:val="0"/>
-                <w:sz w:val="18"/>
-              </w:rPr>
-              <w:t>IMC</w:t>
-            </w:r>
-          </w:p>
-        </w:tc>
-        <w:tc>
-          <w:tcPr>
-            <w:tcW w:type="dxa" w:w="1904"/>
-          </w:tcPr>
-          <w:p>
-            <w:r>
-              <w:rPr>
-                <w:rFonts w:ascii="微软雅黑" w:hAnsi="微软雅黑" w:eastAsia="微软雅黑"/>
-                <w:b w:val="0"/>
-                <w:i w:val="0"/>
-                <w:sz w:val="18"/>
-              </w:rPr>
-              <w:t>41.24</w:t>
-            </w:r>
-          </w:p>
-        </w:tc>
-        <w:tc>
-          <w:tcPr>
-            <w:tcW w:type="dxa" w:w="1904"/>
-          </w:tcPr>
-          <w:p>
-            <w:r>
-              <w:rPr>
-                <w:rFonts w:ascii="微软雅黑" w:hAnsi="微软雅黑" w:eastAsia="微软雅黑"/>
-                <w:b w:val="0"/>
-                <w:i w:val="0"/>
-                <w:sz w:val="18"/>
-              </w:rPr>
-              <w:t>基准</w:t>
-            </w:r>
-          </w:p>
-        </w:tc>
-        <w:tc>
-          <w:tcPr>
-            <w:tcW w:type="dxa" w:w="1904"/>
-          </w:tcPr>
-          <w:p>
-            <w:r>
-              <w:rPr>
-                <w:rFonts w:ascii="微软雅黑" w:hAnsi="微软雅黑" w:eastAsia="微软雅黑"/>
-                <w:b w:val="0"/>
-                <w:i w:val="0"/>
-                <w:sz w:val="18"/>
-              </w:rPr>
-              <w:t>39/80</w:t>
-            </w:r>
-          </w:p>
-        </w:tc>
-        <w:tc>
-          <w:tcPr>
-            <w:tcW w:type="dxa" w:w="1904"/>
-          </w:tcPr>
-          <w:p>
-            <w:r>
-              <w:rPr>
-                <w:rFonts w:ascii="微软雅黑" w:hAnsi="微软雅黑" w:eastAsia="微软雅黑"/>
-                <w:b w:val="0"/>
-                <w:i w:val="0"/>
-                <w:sz w:val="18"/>
-              </w:rPr>
-              <w:t>基准；有界全过但验收不足半数</w:t>
-            </w:r>
-          </w:p>
-        </w:tc>
-      </w:tr>
-      <w:tr>
-        <w:tc>
-          <w:tcPr>
-            <w:tcW w:type="dxa" w:w="1904"/>
-          </w:tcPr>
-          <w:p>
-            <w:r>
-              <w:rPr>
-                <w:rFonts w:ascii="微软雅黑" w:hAnsi="微软雅黑" w:eastAsia="微软雅黑"/>
-                <w:b w:val="0"/>
-                <w:i w:val="0"/>
-                <w:sz w:val="18"/>
-              </w:rPr>
-              <w:t>BO</w:t>
-            </w:r>
-          </w:p>
-        </w:tc>
-        <w:tc>
-          <w:tcPr>
-            <w:tcW w:type="dxa" w:w="1904"/>
-          </w:tcPr>
-          <w:p>
-            <w:r>
-              <w:rPr>
-                <w:rFonts w:ascii="微软雅黑" w:hAnsi="微软雅黑" w:eastAsia="微软雅黑"/>
-                <w:b w:val="0"/>
-                <w:i w:val="0"/>
-                <w:sz w:val="18"/>
-              </w:rPr>
-              <w:t>41.95</w:t>
-            </w:r>
-          </w:p>
-        </w:tc>
-        <w:tc>
-          <w:tcPr>
-            <w:tcW w:type="dxa" w:w="1904"/>
-          </w:tcPr>
-          <w:p>
-            <w:r>
-              <w:rPr>
-                <w:rFonts w:ascii="微软雅黑" w:hAnsi="微软雅黑" w:eastAsia="微软雅黑"/>
-                <w:b w:val="0"/>
-                <w:i w:val="0"/>
-                <w:sz w:val="18"/>
-              </w:rPr>
-              <w:t>0.9996 [0.9808,1.0193]</w:t>
-            </w:r>
-          </w:p>
-        </w:tc>
-        <w:tc>
-          <w:tcPr>
-            <w:tcW w:type="dxa" w:w="1904"/>
-          </w:tcPr>
-          <w:p>
-            <w:r>
-              <w:rPr>
-                <w:rFonts w:ascii="微软雅黑" w:hAnsi="微软雅黑" w:eastAsia="微软雅黑"/>
-                <w:b w:val="0"/>
-                <w:i w:val="0"/>
-                <w:sz w:val="18"/>
-              </w:rPr>
-              <w:t>38/80</w:t>
-            </w:r>
-          </w:p>
-        </w:tc>
-        <w:tc>
-          <w:tcPr>
-            <w:tcW w:type="dxa" w:w="1904"/>
-          </w:tcPr>
-          <w:p>
-            <w:r>
-              <w:rPr>
-                <w:rFonts w:ascii="微软雅黑" w:hAnsi="微软雅黑" w:eastAsia="微软雅黑"/>
-                <w:b w:val="0"/>
-                <w:i w:val="0"/>
-                <w:sz w:val="18"/>
-              </w:rPr>
-              <w:t>与 IMC 相当，不称优</w:t>
-            </w:r>
-          </w:p>
-        </w:tc>
-      </w:tr>
-      <w:tr>
-        <w:tc>
-          <w:tcPr>
-            <w:tcW w:type="dxa" w:w="1904"/>
-          </w:tcPr>
-          <w:p>
-            <w:r>
-              <w:rPr>
-                <w:rFonts w:ascii="微软雅黑" w:hAnsi="微软雅黑" w:eastAsia="微软雅黑"/>
-                <w:b w:val="0"/>
-                <w:i w:val="0"/>
-                <w:sz w:val="18"/>
-              </w:rPr>
-              <w:t>Safe-BO 保守参数</w:t>
-            </w:r>
-          </w:p>
-        </w:tc>
-        <w:tc>
-          <w:tcPr>
-            <w:tcW w:type="dxa" w:w="1904"/>
-          </w:tcPr>
-          <w:p>
-            <w:r>
-              <w:rPr>
-                <w:rFonts w:ascii="微软雅黑" w:hAnsi="微软雅黑" w:eastAsia="微软雅黑"/>
-                <w:b w:val="0"/>
-                <w:i w:val="0"/>
-                <w:sz w:val="18"/>
-              </w:rPr>
-              <w:t>36.72</w:t>
-            </w:r>
-          </w:p>
-        </w:tc>
-        <w:tc>
-          <w:tcPr>
-            <w:tcW w:type="dxa" w:w="1904"/>
-          </w:tcPr>
-          <w:p>
-            <w:r>
-              <w:rPr>
-                <w:rFonts w:ascii="微软雅黑" w:hAnsi="微软雅黑" w:eastAsia="微软雅黑"/>
-                <w:b w:val="0"/>
-                <w:i w:val="0"/>
-                <w:sz w:val="18"/>
-              </w:rPr>
-              <w:t>0.9185 [0.8863,0.9516]</w:t>
-            </w:r>
-          </w:p>
-        </w:tc>
-        <w:tc>
-          <w:tcPr>
-            <w:tcW w:type="dxa" w:w="1904"/>
-          </w:tcPr>
-          <w:p>
-            <w:r>
-              <w:rPr>
-                <w:rFonts w:ascii="微软雅黑" w:hAnsi="微软雅黑" w:eastAsia="微软雅黑"/>
-                <w:b w:val="0"/>
-                <w:i w:val="0"/>
-                <w:sz w:val="18"/>
-              </w:rPr>
-              <w:t>51/80</w:t>
-            </w:r>
-          </w:p>
-        </w:tc>
-        <w:tc>
-          <w:tcPr>
-            <w:tcW w:type="dxa" w:w="1904"/>
-          </w:tcPr>
-          <w:p>
-            <w:r>
-              <w:rPr>
-                <w:rFonts w:ascii="微软雅黑" w:hAnsi="微软雅黑" w:eastAsia="微软雅黑"/>
-                <w:b w:val="0"/>
-                <w:i w:val="0"/>
-                <w:sz w:val="18"/>
-              </w:rPr>
-              <w:t>本轮最优；归属为参数集</w:t>
-            </w:r>
-          </w:p>
-        </w:tc>
-      </w:tr>
-      <w:tr>
-        <w:tc>
-          <w:tcPr>
-            <w:tcW w:type="dxa" w:w="1904"/>
-          </w:tcPr>
-          <w:p>
-            <w:r>
-              <w:rPr>
-                <w:rFonts w:ascii="微软雅黑" w:hAnsi="微软雅黑" w:eastAsia="微软雅黑"/>
-                <w:b w:val="0"/>
-                <w:i w:val="0"/>
-                <w:sz w:val="18"/>
-              </w:rPr>
-              <w:t>FNN</w:t>
-            </w:r>
-          </w:p>
-        </w:tc>
-        <w:tc>
-          <w:tcPr>
-            <w:tcW w:type="dxa" w:w="1904"/>
-          </w:tcPr>
-          <w:p>
-            <w:r>
-              <w:rPr>
-                <w:rFonts w:ascii="微软雅黑" w:hAnsi="微软雅黑" w:eastAsia="微软雅黑"/>
-                <w:b w:val="0"/>
-                <w:i w:val="0"/>
-                <w:sz w:val="18"/>
-              </w:rPr>
-              <w:t>41.44</w:t>
-            </w:r>
-          </w:p>
-        </w:tc>
-        <w:tc>
-          <w:tcPr>
-            <w:tcW w:type="dxa" w:w="1904"/>
-          </w:tcPr>
-          <w:p>
-            <w:r>
-              <w:rPr>
-                <w:rFonts w:ascii="微软雅黑" w:hAnsi="微软雅黑" w:eastAsia="微软雅黑"/>
-                <w:b w:val="0"/>
-                <w:i w:val="0"/>
-                <w:sz w:val="18"/>
-              </w:rPr>
-              <w:t>0.9980 [0.9886,1.0084]</w:t>
-            </w:r>
-          </w:p>
-        </w:tc>
-        <w:tc>
-          <w:tcPr>
-            <w:tcW w:type="dxa" w:w="1904"/>
-          </w:tcPr>
-          <w:p>
-            <w:r>
-              <w:rPr>
-                <w:rFonts w:ascii="微软雅黑" w:hAnsi="微软雅黑" w:eastAsia="微软雅黑"/>
-                <w:b w:val="0"/>
-                <w:i w:val="0"/>
-                <w:sz w:val="18"/>
-              </w:rPr>
-              <w:t>40/80</w:t>
-            </w:r>
-          </w:p>
-        </w:tc>
-        <w:tc>
-          <w:tcPr>
-            <w:tcW w:type="dxa" w:w="1904"/>
-          </w:tcPr>
-          <w:p>
-            <w:r>
-              <w:rPr>
-                <w:rFonts w:ascii="微软雅黑" w:hAnsi="微软雅黑" w:eastAsia="微软雅黑"/>
-                <w:b w:val="0"/>
-                <w:i w:val="0"/>
-                <w:sz w:val="18"/>
-              </w:rPr>
-              <w:t>非劣，未证显著优</w:t>
-            </w:r>
-          </w:p>
-        </w:tc>
-      </w:tr>
-      <w:tr>
-        <w:tc>
-          <w:tcPr>
-            <w:tcW w:type="dxa" w:w="1904"/>
-          </w:tcPr>
-          <w:p>
-            <w:r>
-              <w:rPr>
-                <w:rFonts w:ascii="微软雅黑" w:hAnsi="微软雅黑" w:eastAsia="微软雅黑"/>
-                <w:b w:val="0"/>
-                <w:i w:val="0"/>
-                <w:sz w:val="18"/>
-              </w:rPr>
-              <w:t>RL</w:t>
-            </w:r>
-          </w:p>
-        </w:tc>
-        <w:tc>
-          <w:tcPr>
-            <w:tcW w:type="dxa" w:w="1904"/>
-          </w:tcPr>
-          <w:p>
-            <w:r>
-              <w:rPr>
-                <w:rFonts w:ascii="微软雅黑" w:hAnsi="微软雅黑" w:eastAsia="微软雅黑"/>
-                <w:b w:val="0"/>
-                <w:i w:val="0"/>
-                <w:sz w:val="18"/>
-              </w:rPr>
-              <w:t>39.83</w:t>
-            </w:r>
-          </w:p>
-        </w:tc>
-        <w:tc>
-          <w:tcPr>
-            <w:tcW w:type="dxa" w:w="1904"/>
-          </w:tcPr>
-          <w:p>
-            <w:r>
-              <w:rPr>
-                <w:rFonts w:ascii="微软雅黑" w:hAnsi="微软雅黑" w:eastAsia="微软雅黑"/>
-                <w:b w:val="0"/>
-                <w:i w:val="0"/>
-                <w:sz w:val="18"/>
-              </w:rPr>
-              <w:t>0.9817 [0.9620,1.0070]</w:t>
-            </w:r>
-          </w:p>
-        </w:tc>
-        <w:tc>
-          <w:tcPr>
-            <w:tcW w:type="dxa" w:w="1904"/>
-          </w:tcPr>
-          <w:p>
-            <w:r>
-              <w:rPr>
-                <w:rFonts w:ascii="微软雅黑" w:hAnsi="微软雅黑" w:eastAsia="微软雅黑"/>
-                <w:b w:val="0"/>
-                <w:i w:val="0"/>
-                <w:sz w:val="18"/>
-              </w:rPr>
-              <w:t>39/80</w:t>
-            </w:r>
-          </w:p>
-        </w:tc>
-        <w:tc>
-          <w:tcPr>
-            <w:tcW w:type="dxa" w:w="1904"/>
-          </w:tcPr>
-          <w:p>
-            <w:r>
-              <w:rPr>
-                <w:rFonts w:ascii="微软雅黑" w:hAnsi="微软雅黑" w:eastAsia="微软雅黑"/>
-                <w:b w:val="0"/>
-                <w:i w:val="0"/>
-                <w:sz w:val="18"/>
-              </w:rPr>
-              <w:t>非劣，未证显著优；4 回退后仍未过</w:t>
-            </w:r>
-          </w:p>
-        </w:tc>
-      </w:tr>
-      <w:tr>
-        <w:tc>
-          <w:tcPr>
-            <w:tcW w:type="dxa" w:w="1904"/>
-          </w:tcPr>
-          <w:p>
-            <w:r>
-              <w:rPr>
-                <w:rFonts w:ascii="微软雅黑" w:hAnsi="微软雅黑" w:eastAsia="微软雅黑"/>
-                <w:b w:val="0"/>
-                <w:i w:val="0"/>
-                <w:sz w:val="18"/>
-              </w:rPr>
-              <w:t>LLM replay</w:t>
-            </w:r>
-          </w:p>
-        </w:tc>
-        <w:tc>
-          <w:tcPr>
-            <w:tcW w:type="dxa" w:w="1904"/>
-          </w:tcPr>
-          <w:p>
-            <w:r>
-              <w:rPr>
-                <w:rFonts w:ascii="微软雅黑" w:hAnsi="微软雅黑" w:eastAsia="微软雅黑"/>
-                <w:b w:val="0"/>
-                <w:i w:val="0"/>
-                <w:sz w:val="18"/>
-              </w:rPr>
-              <w:t>41.24</w:t>
-            </w:r>
-          </w:p>
-        </w:tc>
-        <w:tc>
-          <w:tcPr>
-            <w:tcW w:type="dxa" w:w="1904"/>
-          </w:tcPr>
-          <w:p>
-            <w:r>
-              <w:rPr>
-                <w:rFonts w:ascii="微软雅黑" w:hAnsi="微软雅黑" w:eastAsia="微软雅黑"/>
-                <w:b w:val="0"/>
-                <w:i w:val="0"/>
-                <w:sz w:val="18"/>
-              </w:rPr>
-              <w:t>持平 IMC</w:t>
-            </w:r>
-          </w:p>
-        </w:tc>
-        <w:tc>
-          <w:tcPr>
-            <w:tcW w:type="dxa" w:w="1904"/>
-          </w:tcPr>
-          <w:p>
-            <w:r>
-              <w:rPr>
-                <w:rFonts w:ascii="微软雅黑" w:hAnsi="微软雅黑" w:eastAsia="微软雅黑"/>
-                <w:b w:val="0"/>
-                <w:i w:val="0"/>
-                <w:sz w:val="18"/>
-              </w:rPr>
-              <w:t>39/80</w:t>
-            </w:r>
-          </w:p>
-        </w:tc>
-        <w:tc>
-          <w:tcPr>
-            <w:tcW w:type="dxa" w:w="1904"/>
-          </w:tcPr>
-          <w:p>
-            <w:r>
-              <w:rPr>
-                <w:rFonts w:ascii="微软雅黑" w:hAnsi="微软雅黑" w:eastAsia="微软雅黑"/>
-                <w:b w:val="0"/>
-                <w:i w:val="0"/>
-                <w:sz w:val="18"/>
-              </w:rPr>
-              <w:t>等于 IMC，非实时调用</w:t>
-            </w:r>
-          </w:p>
-        </w:tc>
-      </w:tr>
-    </w:tbl>
-    <w:p/>
-    <w:p>
-      <w:pPr>
-        <w:spacing w:after="80"/>
-      </w:pPr>
-      <w:r>
-        <w:rPr>
-          <w:rFonts w:ascii="微软雅黑" w:hAnsi="微软雅黑" w:eastAsia="微软雅黑"/>
-          <w:b w:val="0"/>
-          <w:i w:val="0"/>
-          <w:sz w:val="21"/>
-        </w:rPr>
-        <w:t xml:space="preserve">失败分析：有界 80/80、执行器 80/80 全过；瓶颈在 </w:t>
-      </w:r>
-      <w:r>
-        <w:rPr>
-          <w:rFonts w:ascii="Consolas" w:hAnsi="Consolas" w:eastAsia="微软雅黑"/>
-          <w:b w:val="0"/>
-          <w:i w:val="0"/>
-          <w:color w:val="A31515"/>
-          <w:sz w:val="19"/>
-        </w:rPr>
-        <w:t>comfort_held</w:t>
-      </w:r>
-      <w:r>
-        <w:rPr>
-          <w:rFonts w:ascii="微软雅黑" w:hAnsi="微软雅黑" w:eastAsia="微软雅黑"/>
-          <w:b w:val="0"/>
-          <w:i w:val="0"/>
-          <w:sz w:val="21"/>
-        </w:rPr>
-        <w:t xml:space="preserve">（IMC 44/80→验收 39/80）与 </w:t>
-      </w:r>
-      <w:r>
-        <w:rPr>
-          <w:rFonts w:ascii="Consolas" w:hAnsi="Consolas" w:eastAsia="微软雅黑"/>
-          <w:b w:val="0"/>
-          <w:i w:val="0"/>
-          <w:color w:val="A31515"/>
-          <w:sz w:val="19"/>
-        </w:rPr>
-        <w:t>recovery_ok</w:t>
-      </w:r>
-      <w:r>
-        <w:rPr>
-          <w:rFonts w:ascii="微软雅黑" w:hAnsi="微软雅黑" w:eastAsia="微软雅黑"/>
-          <w:b w:val="0"/>
-          <w:i w:val="0"/>
-          <w:sz w:val="21"/>
-        </w:rPr>
-        <w:t>（Safe-BO 60→51）。即 J 尚可但未持续在带——回退基准在困难谱同样不合格，否定“回退基准本身合格”。</w:t>
-      </w:r>
-    </w:p>
-    <w:p>
-      <w:pPr>
-        <w:spacing w:after="80"/>
-      </w:pPr>
-      <w:r>
-        <w:rPr>
-          <w:rFonts w:ascii="微软雅黑" w:hAnsi="微软雅黑" w:eastAsia="微软雅黑"/>
-          <w:b w:val="0"/>
-          <w:i w:val="0"/>
-          <w:sz w:val="21"/>
-        </w:rPr>
-        <w:t xml:space="preserve">归因：E3 随机 3–8× 更差说明非随机已是价值；Safe-BO 选中 </w:t>
-      </w:r>
-      <w:r>
-        <w:rPr>
-          <w:rFonts w:ascii="Consolas" w:hAnsi="Consolas" w:eastAsia="微软雅黑"/>
-          <w:b w:val="0"/>
-          <w:i w:val="0"/>
-          <w:color w:val="A31515"/>
-          <w:sz w:val="19"/>
-        </w:rPr>
-        <w:t>evaluation=2/local qualification seed</w:t>
-      </w:r>
-      <w:r>
-        <w:rPr>
-          <w:rFonts w:ascii="微软雅黑" w:hAnsi="微软雅黑" w:eastAsia="微软雅黑"/>
-          <w:b w:val="0"/>
-          <w:i w:val="0"/>
-          <w:sz w:val="21"/>
-        </w:rPr>
-        <w:t>，机制未证，需同初始化同预算随机搜索对照补强（E3 已有随机对照，固定保守对照为公式默认，GP 机制对照仍缺）。</w:t>
-      </w:r>
-    </w:p>
-    <w:p>
-      <w:pPr>
-        <w:spacing w:after="80"/>
-      </w:pPr>
-      <w:r>
-        <w:rPr>
-          <w:rFonts w:ascii="微软雅黑" w:hAnsi="微软雅黑" w:eastAsia="微软雅黑"/>
-          <w:b w:val="0"/>
-          <w:i w:val="0"/>
-          <w:sz w:val="21"/>
-        </w:rPr>
-        <w:t>成本：BO 14、SafeBO 7 评估最轻；FNN ~4181 h、RL ~4018 h 等效对象时最重；LLM 单次 5–25 s + API 最贵。RL 回退 5%（4/80）全部记失败，FNN 无回退。</w:t>
-      </w:r>
-    </w:p>
-    <w:p>
-      <w:pPr>
-        <w:spacing w:after="80"/>
-      </w:pPr>
-      <w:r>
-        <w:rPr>
-          <w:rFonts w:ascii="微软雅黑" w:hAnsi="微软雅黑" w:eastAsia="微软雅黑"/>
-          <w:b w:val="0"/>
-          <w:i w:val="0"/>
-          <w:sz w:val="21"/>
-        </w:rPr>
-        <w:t>统一重训轮（E2-B2，</w:t>
-      </w:r>
-      <w:r>
-        <w:rPr>
-          <w:rFonts w:ascii="Consolas" w:hAnsi="Consolas" w:eastAsia="微软雅黑"/>
-          <w:b w:val="0"/>
-          <w:i w:val="0"/>
-          <w:color w:val="A31515"/>
-          <w:sz w:val="19"/>
-        </w:rPr>
-        <w:t>sealed-80x7-v4-retrain/sealed_80_summary.csv</w:t>
-      </w:r>
-      <w:r>
-        <w:rPr>
-          <w:rFonts w:ascii="微软雅黑" w:hAnsi="微软雅黑" w:eastAsia="微软雅黑"/>
-          <w:b w:val="0"/>
-          <w:i w:val="0"/>
-          <w:sz w:val="21"/>
-        </w:rPr>
-        <w:t>，同一流水线冻结，</w:t>
-      </w:r>
-      <w:r>
-        <w:rPr>
-          <w:rFonts w:ascii="Consolas" w:hAnsi="Consolas" w:eastAsia="微软雅黑"/>
-          <w:b w:val="0"/>
-          <w:i w:val="0"/>
-          <w:color w:val="A31515"/>
-          <w:sz w:val="19"/>
-        </w:rPr>
-        <w:t>bo_legacy_fallback=0/safe_bo_legacy_fallback=0</w:t>
-      </w:r>
-      <w:r>
-        <w:rPr>
-          <w:rFonts w:ascii="微软雅黑" w:hAnsi="微软雅黑" w:eastAsia="微软雅黑"/>
-          <w:b w:val="0"/>
-          <w:i w:val="0"/>
-          <w:sz w:val="21"/>
-        </w:rPr>
-        <w:t>，一致性校验通过）：</w:t>
-      </w:r>
-    </w:p>
-    <w:tbl>
-      <w:tblPr>
-        <w:tblStyle w:val="TableGrid"/>
-        <w:tblW w:type="auto" w:w="0"/>
-        <w:tblLook w:firstColumn="1" w:firstRow="1" w:lastColumn="0" w:lastRow="0" w:noHBand="0" w:noVBand="1" w:val="04A0"/>
-      </w:tblPr>
-      <w:tblGrid>
-        <w:gridCol w:w="1904"/>
-        <w:gridCol w:w="1904"/>
-        <w:gridCol w:w="1904"/>
-        <w:gridCol w:w="1904"/>
-        <w:gridCol w:w="1904"/>
-      </w:tblGrid>
-      <w:tr>
-        <w:tc>
-          <w:tcPr>
-            <w:tcW w:type="dxa" w:w="1904"/>
-            <w:shd w:fill="DEEAF6" w:val="clear"/>
-          </w:tcPr>
-          <w:p>
-            <w:pPr>
-              <w:jc w:val="center"/>
-            </w:pPr>
-            <w:r>
-              <w:rPr>
-                <w:rFonts w:ascii="微软雅黑" w:hAnsi="微软雅黑" w:eastAsia="微软雅黑"/>
-                <w:b/>
-                <w:i w:val="0"/>
-                <w:sz w:val="18"/>
-              </w:rPr>
-              <w:t>算法</w:t>
-            </w:r>
-          </w:p>
-        </w:tc>
-        <w:tc>
-          <w:tcPr>
-            <w:tcW w:type="dxa" w:w="1904"/>
-            <w:shd w:fill="DEEAF6" w:val="clear"/>
-          </w:tcPr>
-          <w:p>
-            <w:pPr>
-              <w:jc w:val="center"/>
-            </w:pPr>
-            <w:r>
-              <w:rPr>
-                <w:rFonts w:ascii="微软雅黑" w:hAnsi="微软雅黑" w:eastAsia="微软雅黑"/>
-                <w:b/>
-                <w:i w:val="0"/>
-                <w:sz w:val="18"/>
-              </w:rPr>
-              <w:t>平均 J↓</w:t>
-            </w:r>
-          </w:p>
-        </w:tc>
-        <w:tc>
-          <w:tcPr>
-            <w:tcW w:type="dxa" w:w="1904"/>
-            <w:shd w:fill="DEEAF6" w:val="clear"/>
-          </w:tcPr>
-          <w:p>
-            <w:pPr>
-              <w:jc w:val="center"/>
-            </w:pPr>
-            <w:r>
-              <w:rPr>
-                <w:rFonts w:ascii="微软雅黑" w:hAnsi="微软雅黑" w:eastAsia="微软雅黑"/>
-                <w:b/>
-                <w:i w:val="0"/>
-                <w:sz w:val="18"/>
-              </w:rPr>
-              <w:t>主配对比 [95% CI]</w:t>
-            </w:r>
-          </w:p>
-        </w:tc>
-        <w:tc>
-          <w:tcPr>
-            <w:tcW w:type="dxa" w:w="1904"/>
-            <w:shd w:fill="DEEAF6" w:val="clear"/>
-          </w:tcPr>
-          <w:p>
-            <w:pPr>
-              <w:jc w:val="center"/>
-            </w:pPr>
-            <w:r>
-              <w:rPr>
-                <w:rFonts w:ascii="微软雅黑" w:hAnsi="微软雅黑" w:eastAsia="微软雅黑"/>
-                <w:b/>
-                <w:i w:val="0"/>
-                <w:sz w:val="18"/>
-              </w:rPr>
-              <w:t>验收</w:t>
-            </w:r>
-          </w:p>
-        </w:tc>
-        <w:tc>
-          <w:tcPr>
-            <w:tcW w:type="dxa" w:w="1904"/>
-            <w:shd w:fill="DEEAF6" w:val="clear"/>
-          </w:tcPr>
-          <w:p>
-            <w:pPr>
-              <w:jc w:val="center"/>
-            </w:pPr>
-            <w:r>
-              <w:rPr>
-                <w:rFonts w:ascii="微软雅黑" w:hAnsi="微软雅黑" w:eastAsia="微软雅黑"/>
-                <w:b/>
-                <w:i w:val="0"/>
-                <w:sz w:val="18"/>
-              </w:rPr>
-              <w:t>读法</w:t>
-            </w:r>
-          </w:p>
-        </w:tc>
-      </w:tr>
-      <w:tr>
-        <w:tc>
-          <w:tcPr>
-            <w:tcW w:type="dxa" w:w="1904"/>
-          </w:tcPr>
-          <w:p>
-            <w:r>
-              <w:rPr>
-                <w:rFonts w:ascii="微软雅黑" w:hAnsi="微软雅黑" w:eastAsia="微软雅黑"/>
-                <w:b w:val="0"/>
-                <w:i w:val="0"/>
-                <w:sz w:val="18"/>
-              </w:rPr>
-              <w:t>Z-N</w:t>
-            </w:r>
-          </w:p>
-        </w:tc>
-        <w:tc>
-          <w:tcPr>
-            <w:tcW w:type="dxa" w:w="1904"/>
-          </w:tcPr>
-          <w:p>
-            <w:r>
-              <w:rPr>
-                <w:rFonts w:ascii="微软雅黑" w:hAnsi="微软雅黑" w:eastAsia="微软雅黑"/>
-                <w:b w:val="0"/>
-                <w:i w:val="0"/>
-                <w:sz w:val="18"/>
-              </w:rPr>
-              <w:t>61.72</w:t>
-            </w:r>
-          </w:p>
-        </w:tc>
-        <w:tc>
-          <w:tcPr>
-            <w:tcW w:type="dxa" w:w="1904"/>
-          </w:tcPr>
-          <w:p>
-            <w:r>
-              <w:rPr>
-                <w:rFonts w:ascii="微软雅黑" w:hAnsi="微软雅黑" w:eastAsia="微软雅黑"/>
-                <w:b w:val="0"/>
-                <w:i w:val="0"/>
-                <w:sz w:val="18"/>
-              </w:rPr>
               <w:t>1.6509 [1.5407,1.7630]</w:t>
             </w:r>
           </w:p>
@@ -2796,7 +2900,7 @@
                 <w:i w:val="0"/>
                 <w:sz w:val="18"/>
               </w:rPr>
-              <w:t>基准（本轮 λ 重扫，增益与 B1 基本一致）</w:t>
+              <w:t>基准；有界全过但验收仅半数</w:t>
             </w:r>
           </w:p>
         </w:tc>
@@ -2878,7 +2982,7 @@
                 <w:i w:val="0"/>
                 <w:sz w:val="18"/>
               </w:rPr>
-              <w:t>显著差于 IMC：14 次评估过拟合训练谱，同预算下不可靠</w:t>
+              <w:t>显著差于 IMC；原因尚未完成归因</w:t>
             </w:r>
           </w:p>
         </w:tc>
@@ -2960,26 +3064,7 @@
                 <w:i w:val="0"/>
                 <w:sz w:val="18"/>
               </w:rPr>
-              <w:t>本轮选中基线本身（</w:t>
-            </w:r>
-            <w:r>
-              <w:rPr>
-                <w:rFonts w:ascii="Consolas" w:hAnsi="Consolas" w:eastAsia="微软雅黑"/>
-                <w:b w:val="0"/>
-                <w:i w:val="0"/>
-                <w:color w:val="A31515"/>
-                <w:sz w:val="16"/>
-              </w:rPr>
-              <w:t>evaluation=1/known baseline</w:t>
-            </w:r>
-            <w:r>
-              <w:rPr>
-                <w:rFonts w:ascii="微软雅黑" w:hAnsi="微软雅黑" w:eastAsia="微软雅黑"/>
-                <w:b w:val="0"/>
-                <w:i w:val="0"/>
-                <w:sz w:val="18"/>
-              </w:rPr>
-              <w:t>），无增益、无损失</w:t>
+              <w:t>选中基线本身，无增益无损失</w:t>
             </w:r>
           </w:p>
         </w:tc>
@@ -3013,7 +3098,7 @@
                 <w:i w:val="0"/>
                 <w:sz w:val="18"/>
               </w:rPr>
-              <w:t>41.17</w:t>
+              <w:t>41.24</w:t>
             </w:r>
           </w:p>
         </w:tc>
@@ -3029,7 +3114,7 @@
                 <w:i w:val="0"/>
                 <w:sz w:val="18"/>
               </w:rPr>
-              <w:t>0.9920 [0.9762,1.0102]</w:t>
+              <w:t>1.0000 等于 IMC</w:t>
             </w:r>
           </w:p>
         </w:tc>
@@ -3045,7 +3130,7 @@
                 <w:i w:val="0"/>
                 <w:sz w:val="18"/>
               </w:rPr>
-              <w:t>41/80</w:t>
+              <w:t>40/80</w:t>
             </w:r>
           </w:p>
         </w:tc>
@@ -3061,7 +3146,7 @@
                 <w:i w:val="0"/>
                 <w:sz w:val="18"/>
               </w:rPr>
-              <w:t>与 IMC 持平（部署验收通过，但密封未显著优）</w:t>
+              <w:t>资格门未通过→回退 IMC</w:t>
             </w:r>
           </w:p>
         </w:tc>
@@ -3143,7 +3228,7 @@
                 <w:i w:val="0"/>
                 <w:sz w:val="18"/>
               </w:rPr>
-              <w:t>与 IMC 持平，CI 含 1</w:t>
+              <w:t>未发现显著优势；非劣成立（上界 ≤1.02）</w:t>
             </w:r>
           </w:p>
         </w:tc>
@@ -3225,7 +3310,7 @@
                 <w:i w:val="0"/>
                 <w:sz w:val="18"/>
               </w:rPr>
-              <w:t>等于 IMC，非实时调用</w:t>
+              <w:t>完整 48 训练集仍无接受候选；非实时调用</w:t>
             </w:r>
           </w:p>
         </w:tc>
@@ -3243,7 +3328,7 @@
           <w:i w:val="0"/>
           <w:sz w:val="21"/>
         </w:rPr>
-        <w:t>E3+ 同预算归因（</w:t>
+        <w:t>同轴曲线（确定性复现，</w:t>
       </w:r>
       <w:r>
         <w:rPr>
@@ -3253,7 +3338,7 @@
           <w:color w:val="A31515"/>
           <w:sz w:val="19"/>
         </w:rPr>
-        <w:t>sealed-80x7-v4-retrain/gp_attribution.csv</w:t>
+        <w:t>sealed-80x7-b3/figures/</w:t>
       </w:r>
       <w:r>
         <w:rPr>
@@ -3262,7 +3347,163 @@
           <w:i w:val="0"/>
           <w:sz w:val="21"/>
         </w:rPr>
-        <w:t>，同 48 训练谱选型、同 80 密封评价）：</w:t>
+        <w:t>，时序与清单同目录；复现断言已通过）：</w:t>
+      </w:r>
+    </w:p>
+    <w:p>
+      <w:pPr>
+        <w:jc w:val="center"/>
+      </w:pPr>
+      <w:r>
+        <w:drawing>
+          <wp:inline xmlns:a="http://schemas.openxmlformats.org/drawingml/2006/main" xmlns:pic="http://schemas.openxmlformats.org/drawingml/2006/picture">
+            <wp:extent cx="5580000" cy="3524211"/>
+            <wp:docPr id="3" name="Picture 3"/>
+            <wp:cNvGraphicFramePr>
+              <a:graphicFrameLocks noChangeAspect="1"/>
+            </wp:cNvGraphicFramePr>
+            <a:graphic>
+              <a:graphicData uri="http://schemas.openxmlformats.org/drawingml/2006/picture">
+                <pic:pic>
+                  <pic:nvPicPr>
+                    <pic:cNvPr id="0" name="fig_median_coaxial.png"/>
+                    <pic:cNvPicPr/>
+                  </pic:nvPicPr>
+                  <pic:blipFill>
+                    <a:blip r:embed="rId11"/>
+                    <a:stretch>
+                      <a:fillRect/>
+                    </a:stretch>
+                  </pic:blipFill>
+                  <pic:spPr>
+                    <a:xfrm>
+                      <a:off x="0" y="0"/>
+                      <a:ext cx="5580000" cy="3524211"/>
+                    </a:xfrm>
+                    <a:prstGeom prst="rect"/>
+                  </pic:spPr>
+                </pic:pic>
+              </a:graphicData>
+            </a:graphic>
+          </wp:inline>
+        </w:drawing>
+      </w:r>
+    </w:p>
+    <w:p>
+      <w:pPr>
+        <w:jc w:val="center"/>
+      </w:pPr>
+      <w:r>
+        <w:rPr>
+          <w:rFonts w:ascii="微软雅黑" w:hAnsi="微软雅黑" w:eastAsia="微软雅黑"/>
+          <w:b w:val="0"/>
+          <w:i w:val="0"/>
+          <w:color w:val="595959"/>
+          <w:sz w:val="18"/>
+        </w:rPr>
+        <w:t>中位场景七算法同轴（ordinal=38，IMC J=35.12）</w:t>
+      </w:r>
+    </w:p>
+    <w:p>
+      <w:pPr>
+        <w:spacing w:after="40"/>
+        <w:ind w:left="340"/>
+      </w:pPr>
+      <w:r>
+        <w:rPr>
+          <w:rFonts w:ascii="微软雅黑" w:hAnsi="微软雅黑" w:eastAsia="微软雅黑"/>
+          <w:b w:val="0"/>
+          <w:i w:val="0"/>
+          <w:color w:val="595959"/>
+          <w:sz w:val="19"/>
+        </w:rPr>
+        <w:t>中位场景：七算法轨迹基本重合，IMC 与自适应方法无实质差异——与配对比结论一致。</w:t>
+      </w:r>
+    </w:p>
+    <w:p>
+      <w:pPr>
+        <w:jc w:val="center"/>
+      </w:pPr>
+      <w:r>
+        <w:drawing>
+          <wp:inline xmlns:a="http://schemas.openxmlformats.org/drawingml/2006/main" xmlns:pic="http://schemas.openxmlformats.org/drawingml/2006/picture">
+            <wp:extent cx="5580000" cy="3524211"/>
+            <wp:docPr id="4" name="Picture 4"/>
+            <wp:cNvGraphicFramePr>
+              <a:graphicFrameLocks noChangeAspect="1"/>
+            </wp:cNvGraphicFramePr>
+            <a:graphic>
+              <a:graphicData uri="http://schemas.openxmlformats.org/drawingml/2006/picture">
+                <pic:pic>
+                  <pic:nvPicPr>
+                    <pic:cNvPr id="0" name="fig_failure_coaxial.png"/>
+                    <pic:cNvPicPr/>
+                  </pic:nvPicPr>
+                  <pic:blipFill>
+                    <a:blip r:embed="rId12"/>
+                    <a:stretch>
+                      <a:fillRect/>
+                    </a:stretch>
+                  </pic:blipFill>
+                  <pic:spPr>
+                    <a:xfrm>
+                      <a:off x="0" y="0"/>
+                      <a:ext cx="5580000" cy="3524211"/>
+                    </a:xfrm>
+                    <a:prstGeom prst="rect"/>
+                  </pic:spPr>
+                </pic:pic>
+              </a:graphicData>
+            </a:graphic>
+          </wp:inline>
+        </w:drawing>
+      </w:r>
+    </w:p>
+    <w:p>
+      <w:pPr>
+        <w:jc w:val="center"/>
+      </w:pPr>
+      <w:r>
+        <w:rPr>
+          <w:rFonts w:ascii="微软雅黑" w:hAnsi="微软雅黑" w:eastAsia="微软雅黑"/>
+          <w:b w:val="0"/>
+          <w:i w:val="0"/>
+          <w:color w:val="595959"/>
+          <w:sz w:val="18"/>
+        </w:rPr>
+        <w:t>失败场景七算法同轴（ordinal=70，IMC J=111.08，振荡型恢复失败）</w:t>
+      </w:r>
+    </w:p>
+    <w:p>
+      <w:pPr>
+        <w:spacing w:after="40"/>
+        <w:ind w:left="340"/>
+      </w:pPr>
+      <w:r>
+        <w:rPr>
+          <w:rFonts w:ascii="微软雅黑" w:hAnsi="微软雅黑" w:eastAsia="微软雅黑"/>
+          <w:b w:val="0"/>
+          <w:i w:val="0"/>
+          <w:color w:val="595959"/>
+          <w:sz w:val="19"/>
+        </w:rPr>
+        <w:t>失败场景：无扰动热启动，负荷比仅 0.10、窗口充足，但全部算法出现大幅欠调（IMC 4.2°C）与压缩机反复启停振荡，</w:t>
+      </w:r>
+    </w:p>
+    <w:p>
+      <w:pPr>
+        <w:spacing w:after="40"/>
+        <w:ind w:left="340"/>
+      </w:pPr>
+      <w:r>
+        <w:rPr>
+          <w:rFonts w:ascii="微软雅黑" w:hAnsi="微软雅黑" w:eastAsia="微软雅黑"/>
+          <w:b w:val="0"/>
+          <w:i w:val="0"/>
+          <w:color w:val="595959"/>
+          <w:sz w:val="19"/>
+        </w:rPr>
+        <w:t>始终无法持续在带——典型的调参残余失败（RL 略好 106.6，BO 更差 133.0，方向与总量表一致）。</w:t>
       </w:r>
     </w:p>
     <w:p>
@@ -3276,7 +3517,26 @@
           <w:i w:val="0"/>
           <w:sz w:val="21"/>
         </w:rPr>
-        <w:t>BO-full 密封 45.02（1.0785）vs 初值最优 init-only-7 密封 46.30（1.1567）vs 同预算纯随机 random-14 密封 49.52（1.3266）vs 保守公式 250.23（7.98×）。</w:t>
+        <w:t>失败归因（</w:t>
+      </w:r>
+      <w:r>
+        <w:rPr>
+          <w:rFonts w:ascii="Consolas" w:hAnsi="Consolas" w:eastAsia="微软雅黑"/>
+          <w:b w:val="0"/>
+          <w:i w:val="0"/>
+          <w:color w:val="A31515"/>
+          <w:sz w:val="19"/>
+        </w:rPr>
+        <w:t>failure_cause_summary.csv</w:t>
+      </w:r>
+      <w:r>
+        <w:rPr>
+          <w:rFonts w:ascii="微软雅黑" w:hAnsi="微软雅黑" w:eastAsia="微软雅黑"/>
+          <w:b w:val="0"/>
+          <w:i w:val="0"/>
+          <w:sz w:val="21"/>
+        </w:rPr>
+        <w:t>，322 个失败点）：7 个场景全算法失败——1 个容量紧张（负荷比&gt;0.85）+ 6 个观察窗不足（扰动结束距终点&lt;60 min），属物理/设计边界；</w:t>
       </w:r>
     </w:p>
     <w:p>
@@ -3290,7 +3550,45 @@
           <w:i w:val="0"/>
           <w:sz w:val="21"/>
         </w:rPr>
-        <w:t>GP 相对贡献为正（训练均值好 6.0%，密封配对比好约 6.8%，比纯随机好约 18.7%），但绝对值仍不如 IMC——结论是“GP 搜索机制有效，但在本预算/种子下不足以超越调好的 IMC”，</w:t>
+        <w:t xml:space="preserve">IMC 系 33 个调参残余失败全部含 </w:t>
+      </w:r>
+      <w:r>
+        <w:rPr>
+          <w:rFonts w:ascii="Consolas" w:hAnsi="Consolas" w:eastAsia="微软雅黑"/>
+          <w:b w:val="0"/>
+          <w:i w:val="0"/>
+          <w:color w:val="A31515"/>
+          <w:sz w:val="19"/>
+        </w:rPr>
+        <w:t>recovery_ok</w:t>
+      </w:r>
+      <w:r>
+        <w:rPr>
+          <w:rFonts w:ascii="微软雅黑" w:hAnsi="微软雅黑" w:eastAsia="微软雅黑"/>
+          <w:b w:val="0"/>
+          <w:i w:val="0"/>
+          <w:sz w:val="21"/>
+        </w:rPr>
+        <w:t xml:space="preserve"> 未过（29 个兼 </w:t>
+      </w:r>
+      <w:r>
+        <w:rPr>
+          <w:rFonts w:ascii="Consolas" w:hAnsi="Consolas" w:eastAsia="微软雅黑"/>
+          <w:b w:val="0"/>
+          <w:i w:val="0"/>
+          <w:color w:val="A31515"/>
+          <w:sz w:val="19"/>
+        </w:rPr>
+        <w:t>comfort_held</w:t>
+      </w:r>
+      <w:r>
+        <w:rPr>
+          <w:rFonts w:ascii="微软雅黑" w:hAnsi="微软雅黑" w:eastAsia="微软雅黑"/>
+          <w:b w:val="0"/>
+          <w:i w:val="0"/>
+          <w:sz w:val="21"/>
+        </w:rPr>
+        <w:t xml:space="preserve"> 未过），负荷比 ≤0.62 且窗口 ≥1 h，</w:t>
       </w:r>
     </w:p>
     <w:p>
@@ -3304,7 +3602,175 @@
           <w:i w:val="0"/>
           <w:sz w:val="21"/>
         </w:rPr>
-        <w:t>而不是“BO 无用”或“BO 最优”，两种简化读法都禁止。</w:t>
+        <w:t>即容量与窗口均无问题——真实短板在扰动恢复控制。无任何方法系统性挽救 IMC 失败场景：</w:t>
+      </w:r>
+    </w:p>
+    <w:p>
+      <w:pPr>
+        <w:spacing w:after="80"/>
+      </w:pPr>
+      <w:r>
+        <w:rPr>
+          <w:rFonts w:ascii="微软雅黑" w:hAnsi="微软雅黑" w:eastAsia="微软雅黑"/>
+          <w:b w:val="0"/>
+          <w:i w:val="0"/>
+          <w:sz w:val="21"/>
+        </w:rPr>
+        <w:t>RL 挽救 #36 但新增 #25/#37（净 +1），BO 新增 7 个失败、挽救 0，Safe-BO/FNN/LLM 与 IMC 失败集完全一致。</w:t>
+      </w:r>
+    </w:p>
+    <w:p>
+      <w:pPr>
+        <w:spacing w:after="80"/>
+      </w:pPr>
+      <w:r>
+        <w:rPr>
+          <w:rFonts w:ascii="微软雅黑" w:hAnsi="微软雅黑" w:eastAsia="微软雅黑"/>
+          <w:b w:val="0"/>
+          <w:i w:val="0"/>
+          <w:sz w:val="21"/>
+        </w:rPr>
+        <w:t>J 方向一致：失败均值 ~55 vs 通过均值 ~27（约 2×），综合目标与四门验收无系统性冲突——不存在“J 很好但验收不过”的目标设计问题。</w:t>
+      </w:r>
+    </w:p>
+    <w:p>
+      <w:pPr>
+        <w:spacing w:after="80"/>
+      </w:pPr>
+      <w:r>
+        <w:rPr>
+          <w:rFonts w:ascii="微软雅黑" w:hAnsi="微软雅黑" w:eastAsia="微软雅黑"/>
+          <w:b w:val="0"/>
+          <w:i w:val="0"/>
+          <w:sz w:val="21"/>
+        </w:rPr>
+        <w:t>E3+ 严格对照（</w:t>
+      </w:r>
+      <w:r>
+        <w:rPr>
+          <w:rFonts w:ascii="Consolas" w:hAnsi="Consolas" w:eastAsia="微软雅黑"/>
+          <w:b w:val="0"/>
+          <w:i w:val="0"/>
+          <w:color w:val="A31515"/>
+          <w:sz w:val="19"/>
+        </w:rPr>
+        <w:t>gp_attribution.csv</w:t>
+      </w:r>
+      <w:r>
+        <w:rPr>
+          <w:rFonts w:ascii="微软雅黑" w:hAnsi="微软雅黑" w:eastAsia="微软雅黑"/>
+          <w:b w:val="0"/>
+          <w:i w:val="0"/>
+          <w:sz w:val="21"/>
+        </w:rPr>
+        <w:t xml:space="preserve"> 12 行 + </w:t>
+      </w:r>
+      <w:r>
+        <w:rPr>
+          <w:rFonts w:ascii="Consolas" w:hAnsi="Consolas" w:eastAsia="微软雅黑"/>
+          <w:b w:val="0"/>
+          <w:i w:val="0"/>
+          <w:color w:val="A31515"/>
+          <w:sz w:val="19"/>
+        </w:rPr>
+        <w:t>gp_attribution_summary.json</w:t>
+      </w:r>
+      <w:r>
+        <w:rPr>
+          <w:rFonts w:ascii="微软雅黑" w:hAnsi="微软雅黑" w:eastAsia="微软雅黑"/>
+          <w:b w:val="0"/>
+          <w:i w:val="0"/>
+          <w:sz w:val="21"/>
+        </w:rPr>
+        <w:t>；同初值同噪声，4 搜索种子，经典种子 815 精确复现冻结 BO）：</w:t>
+      </w:r>
+    </w:p>
+    <w:p>
+      <w:pPr>
+        <w:spacing w:after="80"/>
+      </w:pPr>
+      <w:r>
+        <w:rPr>
+          <w:rFonts w:ascii="微软雅黑" w:hAnsi="微软雅黑" w:eastAsia="微软雅黑"/>
+          <w:b w:val="0"/>
+          <w:i w:val="0"/>
+          <w:sz w:val="21"/>
+        </w:rPr>
+        <w:t>混合池配对差 GP−随机 −0.0057 [−0.0373,+0.0284]（含 0），GP−初值 −0.1115 [−0.1419,−0.0791]（追加评估优于原地踏步）。</w:t>
+      </w:r>
+    </w:p>
+    <w:p>
+      <w:pPr>
+        <w:spacing w:after="80"/>
+      </w:pPr>
+      <w:r>
+        <w:rPr>
+          <w:rFonts w:ascii="微软雅黑" w:hAnsi="微软雅黑" w:eastAsia="微软雅黑"/>
+          <w:b w:val="0"/>
+          <w:i w:val="0"/>
+          <w:sz w:val="21"/>
+        </w:rPr>
+        <w:t>结论：</w:t>
+      </w:r>
+      <w:r>
+        <w:rPr>
+          <w:rFonts w:ascii="微软雅黑" w:hAnsi="微软雅黑" w:eastAsia="微软雅黑"/>
+          <w:b/>
+          <w:i w:val="0"/>
+          <w:sz w:val="21"/>
+        </w:rPr>
+        <w:t>未发现 GP 相对同预算随机的优势，机制贡献未经证实</w:t>
+      </w:r>
+      <w:r>
+        <w:rPr>
+          <w:rFonts w:ascii="微软雅黑" w:hAnsi="微软雅黑" w:eastAsia="微软雅黑"/>
+          <w:b w:val="0"/>
+          <w:i w:val="0"/>
+          <w:sz w:val="21"/>
+        </w:rPr>
+        <w:t>；逐种子波动大（9002 种子纯随机 0.9287 反超 GP 1.1048），单次比较不可作机制结论。</w:t>
+      </w:r>
+    </w:p>
+    <w:p>
+      <w:pPr>
+        <w:spacing w:after="80"/>
+      </w:pPr>
+      <w:r>
+        <w:rPr>
+          <w:rFonts w:ascii="微软雅黑" w:hAnsi="微软雅黑" w:eastAsia="微软雅黑"/>
+          <w:b w:val="0"/>
+          <w:i w:val="0"/>
+          <w:sz w:val="21"/>
+        </w:rPr>
+        <w:t>旧版“GP 机制有效”表述撤回。</w:t>
+      </w:r>
+    </w:p>
+    <w:p>
+      <w:pPr>
+        <w:spacing w:after="80"/>
+      </w:pPr>
+      <w:r>
+        <w:rPr>
+          <w:rFonts w:ascii="微软雅黑" w:hAnsi="微软雅黑" w:eastAsia="微软雅黑"/>
+          <w:b w:val="0"/>
+          <w:i w:val="0"/>
+          <w:sz w:val="21"/>
+        </w:rPr>
+        <w:t>历史对照一句话：B1（混合冻结）Safe-BO 保守参数曾显著优（0.9185）但归属为参数集；</w:t>
+      </w:r>
+    </w:p>
+    <w:p>
+      <w:pPr>
+        <w:spacing w:after="80"/>
+      </w:pPr>
+      <w:r>
+        <w:rPr>
+          <w:rFonts w:ascii="微软雅黑" w:hAnsi="微软雅黑" w:eastAsia="微软雅黑"/>
+          <w:b w:val="0"/>
+          <w:i w:val="0"/>
+          <w:sz w:val="21"/>
+        </w:rPr>
+        <w:t>B2 与 B3 同训练配置结论一致（BO 差、其余持平），B2 因部署门误用密封集降为历史，数字不再并列。</w:t>
       </w:r>
     </w:p>
     <w:p>
@@ -3390,8 +3856,13 @@
           <w:i w:val="0"/>
           <w:sz w:val="21"/>
         </w:rPr>
-        <w:t xml:space="preserve"> 存全场景清单，</w:t>
+        <w:t xml:space="preserve"> 存全字段场景清单（任意曲线可精确复现），</w:t>
       </w:r>
+    </w:p>
+    <w:p>
+      <w:pPr>
+        <w:spacing w:after="80"/>
+      </w:pPr>
       <w:r>
         <w:rPr>
           <w:rFonts w:ascii="Consolas" w:hAnsi="Consolas" w:eastAsia="微软雅黑"/>
@@ -3409,7 +3880,26 @@
           <w:i w:val="0"/>
           <w:sz w:val="21"/>
         </w:rPr>
-        <w:t xml:space="preserve"> + 脏位如实记录。</w:t>
+        <w:t xml:space="preserve"> + 脏位如实记录；B3 另有裁剪前完整 147 文件 </w:t>
+      </w:r>
+      <w:r>
+        <w:rPr>
+          <w:rFonts w:ascii="Consolas" w:hAnsi="Consolas" w:eastAsia="微软雅黑"/>
+          <w:b w:val="0"/>
+          <w:i w:val="0"/>
+          <w:color w:val="A31515"/>
+          <w:sz w:val="19"/>
+        </w:rPr>
+        <w:t>SHA256SUMS</w:t>
+      </w:r>
+      <w:r>
+        <w:rPr>
+          <w:rFonts w:ascii="微软雅黑" w:hAnsi="微软雅黑" w:eastAsia="微软雅黑"/>
+          <w:b w:val="0"/>
+          <w:i w:val="0"/>
+          <w:sz w:val="21"/>
+        </w:rPr>
+        <w:t xml:space="preserve"> 索引。</w:t>
       </w:r>
     </w:p>
     <w:p>
@@ -3423,7 +3913,7 @@
           <w:i w:val="0"/>
           <w:sz w:val="21"/>
         </w:rPr>
-        <w:t xml:space="preserve">B2 轮 </w:t>
+        <w:t xml:space="preserve">B3 </w:t>
       </w:r>
       <w:r>
         <w:rPr>
@@ -3442,26 +3932,7 @@
           <w:i w:val="0"/>
           <w:sz w:val="21"/>
         </w:rPr>
-        <w:t xml:space="preserve"> 中 </w:t>
-      </w:r>
-      <w:r>
-        <w:rPr>
-          <w:rFonts w:ascii="Consolas" w:hAnsi="Consolas" w:eastAsia="微软雅黑"/>
-          <w:b w:val="0"/>
-          <w:i w:val="0"/>
-          <w:color w:val="A31515"/>
-          <w:sz w:val="19"/>
-        </w:rPr>
-        <w:t>bo_legacy_fallback=0/safe_bo_legacy_fallback=0</w:t>
-      </w:r>
-      <w:r>
-        <w:rPr>
-          <w:rFonts w:ascii="微软雅黑" w:hAnsi="微软雅黑" w:eastAsia="微软雅黑"/>
-          <w:b w:val="0"/>
-          <w:i w:val="0"/>
-          <w:sz w:val="21"/>
-        </w:rPr>
-        <w:t xml:space="preserve">，RL 掩码为冻结 </w:t>
+        <w:t xml:space="preserve"> 中 legacy 双零，RL 掩码为冻结 </w:t>
       </w:r>
       <w:r>
         <w:rPr>
@@ -3480,7 +3951,7 @@
           <w:i w:val="0"/>
           <w:sz w:val="21"/>
         </w:rPr>
-        <w:t>（非重建），FNN/RL 部署验收均为通过。</w:t>
+        <w:t>，部署门在资格集判定（FNN 回退、RL 通过）。</w:t>
       </w:r>
     </w:p>
     <w:p>
@@ -3494,7 +3965,7 @@
           <w:i w:val="0"/>
           <w:sz w:val="21"/>
         </w:rPr>
-        <w:t xml:space="preserve">对拍：Python/C++ 差 ~3e-8 量级；CRC 校验；PC-SIL 按 100 ms/2 s 分频跑通（B2 run 内 </w:t>
+        <w:t xml:space="preserve">对拍：Python/C++ 差 ~3e-8 量级；CRC 校验；PC-SIL 按 100 ms/2 s 分频跑通（B3 run 内 </w:t>
       </w:r>
       <w:r>
         <w:rPr>
@@ -3513,7 +3984,7 @@
           <w:i w:val="0"/>
           <w:sz w:val="21"/>
         </w:rPr>
-        <w:t>，worst PI 300 ns / AI 42.2 µs 均为 HOST 二进制计时）；</w:t>
+        <w:t>）；</w:t>
       </w:r>
     </w:p>
     <w:p>
@@ -3546,7 +4017,7 @@
           <w:i w:val="0"/>
           <w:sz w:val="21"/>
         </w:rPr>
-        <w:t>（PC Python 单步约 10–230 µs，HOST-ONLY）；ESP32 目标编译在本机刷新失败</w:t>
+        <w:t>（HOST-ONLY）；ESP32 目标编译在本机刷新失败</w:t>
       </w:r>
     </w:p>
     <w:p>
@@ -3669,7 +4140,7 @@
           <w:i w:val="0"/>
           <w:sz w:val="21"/>
         </w:rPr>
-        <w:t>分条件结论：B1 谱内，保守 Safe-BO 参数集性能与验收双优但机制未证；B2 统一预算下，无任何方法显著优于 IMC（BO 显著差，Safe-BO 持平，FNN/RL/LLM 持平区间）；Z-N 两轮均显著差。</w:t>
+        <w:t>分条件结论（E2-B3）：无任何方法显著优于 IMC；BO 显著差（归因未完成）；Safe-BO/FNN 等于 IMC；</w:t>
       </w:r>
     </w:p>
     <w:p>
@@ -3683,7 +4154,7 @@
           <w:i w:val="0"/>
           <w:sz w:val="21"/>
         </w:rPr>
-        <w:t>局限：B2 只完成单一种子单预算统一重训，多种子重复、更大 BO 预算、GP 机制“仅初始化不搜索”长期对照仍缺；实体/HIL/目标 WCET 全缺（3/3 PENDING）；</w:t>
+        <w:t>RL 未发现显著优势但非劣成立；Z-N 显著差。验收最高仅 40/80——主要矛盾是扰动恢复控制与合格率，不是排名。</w:t>
       </w:r>
     </w:p>
     <w:p>
@@ -3697,26 +4168,7 @@
           <w:i w:val="0"/>
           <w:sz w:val="21"/>
         </w:rPr>
-        <w:t xml:space="preserve">DOCX 排版以 </w:t>
-      </w:r>
-      <w:r>
-        <w:rPr>
-          <w:rFonts w:ascii="Consolas" w:hAnsi="Consolas" w:eastAsia="微软雅黑"/>
-          <w:b w:val="0"/>
-          <w:i w:val="0"/>
-          <w:color w:val="A31515"/>
-          <w:sz w:val="19"/>
-        </w:rPr>
-        <w:t>tools/check_docx.py</w:t>
-      </w:r>
-      <w:r>
-        <w:rPr>
-          <w:rFonts w:ascii="微软雅黑" w:hAnsi="微软雅黑" w:eastAsia="微软雅黑"/>
-          <w:b w:val="0"/>
-          <w:i w:val="0"/>
-          <w:sz w:val="21"/>
-        </w:rPr>
-        <w:t xml:space="preserve"> 逐节核对为准，PDF 未生成。</w:t>
+        <w:t>局限：单一种子单预算（多种子重复缺）；BO 预算仅 14 评估；实体/HIL/目标 WCET 全缺（3/3 PENDING）；</w:t>
       </w:r>
     </w:p>
     <w:p>
@@ -3730,7 +4182,7 @@
           <w:i w:val="0"/>
           <w:sz w:val="21"/>
         </w:rPr>
-        <w:t>下一步：固定 E2 两轮批次不再覆盖（新批次换 run_id）；补多种子重复与更大预算 BO；</w:t>
+        <w:t>GP 机制贡献未经证实；PDF 未生成（DOCX 为准，人工逐页清单见附件交付检查）。</w:t>
       </w:r>
     </w:p>
     <w:p>
@@ -3744,7 +4196,21 @@
           <w:i w:val="0"/>
           <w:sz w:val="21"/>
         </w:rPr>
-        <w:t>补 E4 真实调用矩阵的失败原因与成本明细；随后实测辨识→遥测→HIL 逐层验收，每层追溯到同一策略版本。</w:t>
+        <w:t>下一步：多种子重复与更大预算 BO；E4 真实调用矩阵失败原因与成本明细；实测辨识→遥测→HIL 逐层验收，每层追溯到同一策略版本。</w:t>
+      </w:r>
+    </w:p>
+    <w:p>
+      <w:pPr>
+        <w:spacing w:after="80"/>
+      </w:pPr>
+      <w:r>
+        <w:rPr>
+          <w:rFonts w:ascii="微软雅黑" w:hAnsi="微软雅黑" w:eastAsia="微软雅黑"/>
+          <w:b w:val="0"/>
+          <w:i w:val="0"/>
+          <w:sz w:val="21"/>
+        </w:rPr>
+        <w:t>历史批次（B1/B2）冻结保留，不再覆盖；新批次一律换 run_id。</w:t>
       </w:r>
     </w:p>
     <w:p>
@@ -3841,25 +4307,6 @@
           <w:i w:val="0"/>
           <w:sz w:val="21"/>
         </w:rPr>
-        <w:t xml:space="preserve">（环境/快速运行/冻结重评/完整训练/图表/排查）；算法差异见 </w:t>
-      </w:r>
-      <w:r>
-        <w:rPr>
-          <w:rFonts w:ascii="Consolas" w:hAnsi="Consolas" w:eastAsia="微软雅黑"/>
-          <w:b w:val="0"/>
-          <w:i w:val="0"/>
-          <w:color w:val="A31515"/>
-          <w:sz w:val="19"/>
-        </w:rPr>
-        <w:t>docs/ALGORITHM_GUIDE.md</w:t>
-      </w:r>
-      <w:r>
-        <w:rPr>
-          <w:rFonts w:ascii="微软雅黑" w:hAnsi="微软雅黑" w:eastAsia="微软雅黑"/>
-          <w:b w:val="0"/>
-          <w:i w:val="0"/>
-          <w:sz w:val="21"/>
-        </w:rPr>
         <w:t>。</w:t>
       </w:r>
     </w:p>
@@ -3874,26 +4321,7 @@
           <w:i w:val="0"/>
           <w:sz w:val="21"/>
         </w:rPr>
-        <w:t>完整重训：</w:t>
-      </w:r>
-      <w:r>
-        <w:rPr>
-          <w:rFonts w:ascii="Consolas" w:hAnsi="Consolas" w:eastAsia="微软雅黑"/>
-          <w:b w:val="0"/>
-          <w:i w:val="0"/>
-          <w:color w:val="A31515"/>
-          <w:sz w:val="19"/>
-        </w:rPr>
-        <w:t>python run.py pipeline --output artifacts/runs/&lt;run_id&gt; --seed 7</w:t>
-      </w:r>
-      <w:r>
-        <w:rPr>
-          <w:rFonts w:ascii="微软雅黑" w:hAnsi="微软雅黑" w:eastAsia="微软雅黑"/>
-          <w:b w:val="0"/>
-          <w:i w:val="0"/>
-          <w:sz w:val="21"/>
-        </w:rPr>
-        <w:t>（本轮约 227 s）→</w:t>
+        <w:t>B3 全链（约 200 s + 评价约 8 min）：</w:t>
       </w:r>
     </w:p>
     <w:p>
@@ -3908,7 +4336,7 @@
           <w:color w:val="A31515"/>
           <w:sz w:val="19"/>
         </w:rPr>
-        <w:t>python run.py sealed --artifact-dir artifacts/runs/&lt;run_id&gt; --output artifacts/runs/&lt;sealed_id&gt;</w:t>
+        <w:t>python run.py pipeline --output artifacts/runs/&lt;run_id&gt; --seed 7</w:t>
       </w:r>
       <w:r>
         <w:rPr>
@@ -3932,7 +4360,7 @@
           <w:color w:val="A31515"/>
           <w:sz w:val="19"/>
         </w:rPr>
-        <w:t>python tools/run_gp_attribution.py --artifact-dir artifacts/runs/&lt;run_id&gt; --output artifacts/runs/&lt;sealed_id&gt;/gp_attribution.csv</w:t>
+        <w:t>python run.py sealed --artifact-dir &lt;run_id&gt; --output &lt;sealed&gt; --protocol-label E2-B3</w:t>
       </w:r>
       <w:r>
         <w:rPr>
@@ -3941,7 +4369,50 @@
           <w:i w:val="0"/>
           <w:sz w:val="21"/>
         </w:rPr>
-        <w:t>。</w:t>
+        <w:t xml:space="preserve"> →</w:t>
+      </w:r>
+    </w:p>
+    <w:p>
+      <w:pPr>
+        <w:spacing w:after="80"/>
+      </w:pPr>
+      <w:r>
+        <w:rPr>
+          <w:rFonts w:ascii="Consolas" w:hAnsi="Consolas" w:eastAsia="微软雅黑"/>
+          <w:b w:val="0"/>
+          <w:i w:val="0"/>
+          <w:color w:val="A31515"/>
+          <w:sz w:val="19"/>
+        </w:rPr>
+        <w:t>python tools/run_gp_attribution.py / make_budget_table.py / analyze_failures.py / make_sealed_figures.py</w:t>
+      </w:r>
+      <w:r>
+        <w:rPr>
+          <w:rFonts w:ascii="微软雅黑" w:hAnsi="微软雅黑" w:eastAsia="微软雅黑"/>
+          <w:b w:val="0"/>
+          <w:i w:val="0"/>
+          <w:sz w:val="21"/>
+        </w:rPr>
+        <w:t xml:space="preserve">（参数见各 </w:t>
+      </w:r>
+      <w:r>
+        <w:rPr>
+          <w:rFonts w:ascii="Consolas" w:hAnsi="Consolas" w:eastAsia="微软雅黑"/>
+          <w:b w:val="0"/>
+          <w:i w:val="0"/>
+          <w:color w:val="A31515"/>
+          <w:sz w:val="19"/>
+        </w:rPr>
+        <w:t>--help</w:t>
+      </w:r>
+      <w:r>
+        <w:rPr>
+          <w:rFonts w:ascii="微软雅黑" w:hAnsi="微软雅黑" w:eastAsia="微软雅黑"/>
+          <w:b w:val="0"/>
+          <w:i w:val="0"/>
+          <w:sz w:val="21"/>
+        </w:rPr>
+        <w:t>）。</w:t>
       </w:r>
     </w:p>
     <w:p>
@@ -3976,7 +4447,74 @@
           <w:color w:val="A31515"/>
           <w:sz w:val="19"/>
         </w:rPr>
-        <w:t>artifacts/runs/sealed-80x7-v4/</w:t>
+        <w:t>artifacts/runs/sealed-80x7-b3/</w:t>
+      </w:r>
+      <w:r>
+        <w:rPr>
+          <w:rFonts w:ascii="微软雅黑" w:hAnsi="微软雅黑" w:eastAsia="微软雅黑"/>
+          <w:b w:val="0"/>
+          <w:i w:val="0"/>
+          <w:sz w:val="21"/>
+        </w:rPr>
+        <w:t>（B3 主：汇总/归因/预算/失败/曲线/溯源）+</w:t>
+      </w:r>
+    </w:p>
+    <w:p>
+      <w:pPr>
+        <w:spacing w:after="80"/>
+      </w:pPr>
+      <w:r>
+        <w:rPr>
+          <w:rFonts w:ascii="Consolas" w:hAnsi="Consolas" w:eastAsia="微软雅黑"/>
+          <w:b w:val="0"/>
+          <w:i w:val="0"/>
+          <w:color w:val="A31515"/>
+          <w:sz w:val="19"/>
+        </w:rPr>
+        <w:t>artifacts/runs/v4-20260906-bf6bda6/</w:t>
+      </w:r>
+      <w:r>
+        <w:rPr>
+          <w:rFonts w:ascii="微软雅黑" w:hAnsi="微软雅黑" w:eastAsia="微软雅黑"/>
+          <w:b w:val="0"/>
+          <w:i w:val="0"/>
+          <w:sz w:val="21"/>
+        </w:rPr>
+        <w:t xml:space="preserve">（B3 训练冻结 + </w:t>
+      </w:r>
+      <w:r>
+        <w:rPr>
+          <w:rFonts w:ascii="Consolas" w:hAnsi="Consolas" w:eastAsia="微软雅黑"/>
+          <w:b w:val="0"/>
+          <w:i w:val="0"/>
+          <w:color w:val="A31515"/>
+          <w:sz w:val="19"/>
+        </w:rPr>
+        <w:t>SHA256SUMS</w:t>
+      </w:r>
+      <w:r>
+        <w:rPr>
+          <w:rFonts w:ascii="微软雅黑" w:hAnsi="微软雅黑" w:eastAsia="微软雅黑"/>
+          <w:b w:val="0"/>
+          <w:i w:val="0"/>
+          <w:sz w:val="21"/>
+        </w:rPr>
+        <w:t xml:space="preserve"> 完整索引）+</w:t>
+      </w:r>
+    </w:p>
+    <w:p>
+      <w:pPr>
+        <w:spacing w:after="80"/>
+      </w:pPr>
+      <w:r>
+        <w:rPr>
+          <w:rFonts w:ascii="Consolas" w:hAnsi="Consolas" w:eastAsia="微软雅黑"/>
+          <w:b w:val="0"/>
+          <w:i w:val="0"/>
+          <w:color w:val="A31515"/>
+          <w:sz w:val="19"/>
+        </w:rPr>
+        <w:t>sealed-80x7-v4/</w:t>
       </w:r>
       <w:r>
         <w:rPr>
@@ -3995,7 +4533,7 @@
           <w:color w:val="A31515"/>
           <w:sz w:val="19"/>
         </w:rPr>
-        <w:t>artifacts/runs/sealed-80x7-v4-retrain/</w:t>
+        <w:t>sealed-80x7-v4-retrain/</w:t>
       </w:r>
       <w:r>
         <w:rPr>
@@ -4004,145 +4542,7 @@
           <w:i w:val="0"/>
           <w:sz w:val="21"/>
         </w:rPr>
-        <w:t xml:space="preserve">（B2，含 </w:t>
-      </w:r>
-      <w:r>
-        <w:rPr>
-          <w:rFonts w:ascii="Consolas" w:hAnsi="Consolas" w:eastAsia="微软雅黑"/>
-          <w:b w:val="0"/>
-          <w:i w:val="0"/>
-          <w:color w:val="A31515"/>
-          <w:sz w:val="19"/>
-        </w:rPr>
-        <w:t>gp_attribution.csv</w:t>
-      </w:r>
-      <w:r>
-        <w:rPr>
-          <w:rFonts w:ascii="微软雅黑" w:hAnsi="微软雅黑" w:eastAsia="微软雅黑"/>
-          <w:b w:val="0"/>
-          <w:i w:val="0"/>
-          <w:sz w:val="21"/>
-        </w:rPr>
-        <w:t>）+</w:t>
-      </w:r>
-    </w:p>
-    <w:p>
-      <w:pPr>
-        <w:spacing w:after="80"/>
-      </w:pPr>
-      <w:r>
-        <w:rPr>
-          <w:rFonts w:ascii="Consolas" w:hAnsi="Consolas" w:eastAsia="微软雅黑"/>
-          <w:b w:val="0"/>
-          <w:i w:val="0"/>
-          <w:color w:val="A31515"/>
-          <w:sz w:val="19"/>
-        </w:rPr>
-        <w:t>artifacts/runs/v4-20260907-8f3fd5f/</w:t>
-      </w:r>
-      <w:r>
-        <w:rPr>
-          <w:rFonts w:ascii="微软雅黑" w:hAnsi="微软雅黑" w:eastAsia="微软雅黑"/>
-          <w:b w:val="0"/>
-          <w:i w:val="0"/>
-          <w:sz w:val="21"/>
-        </w:rPr>
-        <w:t>（B2 训练冻结：</w:t>
-      </w:r>
-      <w:r>
-        <w:rPr>
-          <w:rFonts w:ascii="Consolas" w:hAnsi="Consolas" w:eastAsia="微软雅黑"/>
-          <w:b w:val="0"/>
-          <w:i w:val="0"/>
-          <w:color w:val="A31515"/>
-          <w:sz w:val="19"/>
-        </w:rPr>
-        <w:t>bo_policy.json</w:t>
-      </w:r>
-      <w:r>
-        <w:rPr>
-          <w:rFonts w:ascii="微软雅黑" w:hAnsi="微软雅黑" w:eastAsia="微软雅黑"/>
-          <w:b w:val="0"/>
-          <w:i w:val="0"/>
-          <w:sz w:val="21"/>
-        </w:rPr>
-        <w:t>/</w:t>
-      </w:r>
-      <w:r>
-        <w:rPr>
-          <w:rFonts w:ascii="Consolas" w:hAnsi="Consolas" w:eastAsia="微软雅黑"/>
-          <w:b w:val="0"/>
-          <w:i w:val="0"/>
-          <w:color w:val="A31515"/>
-          <w:sz w:val="19"/>
-        </w:rPr>
-        <w:t>safe_bo_policy.json</w:t>
-      </w:r>
-      <w:r>
-        <w:rPr>
-          <w:rFonts w:ascii="微软雅黑" w:hAnsi="微软雅黑" w:eastAsia="微软雅黑"/>
-          <w:b w:val="0"/>
-          <w:i w:val="0"/>
-          <w:sz w:val="21"/>
-        </w:rPr>
-        <w:t>/</w:t>
-      </w:r>
-      <w:r>
-        <w:rPr>
-          <w:rFonts w:ascii="Consolas" w:hAnsi="Consolas" w:eastAsia="微软雅黑"/>
-          <w:b w:val="0"/>
-          <w:i w:val="0"/>
-          <w:color w:val="A31515"/>
-          <w:sz w:val="19"/>
-        </w:rPr>
-        <w:t>rl_covered_mask.npy</w:t>
-      </w:r>
-      <w:r>
-        <w:rPr>
-          <w:rFonts w:ascii="微软雅黑" w:hAnsi="微软雅黑" w:eastAsia="微软雅黑"/>
-          <w:b w:val="0"/>
-          <w:i w:val="0"/>
-          <w:sz w:val="21"/>
-        </w:rPr>
-        <w:t>/</w:t>
-      </w:r>
-      <w:r>
-        <w:rPr>
-          <w:rFonts w:ascii="Consolas" w:hAnsi="Consolas" w:eastAsia="微软雅黑"/>
-          <w:b w:val="0"/>
-          <w:i w:val="0"/>
-          <w:color w:val="A31515"/>
-          <w:sz w:val="19"/>
-        </w:rPr>
-        <w:t>host_wcet.csv</w:t>
-      </w:r>
-      <w:r>
-        <w:rPr>
-          <w:rFonts w:ascii="微软雅黑" w:hAnsi="微软雅黑" w:eastAsia="微软雅黑"/>
-          <w:b w:val="0"/>
-          <w:i w:val="0"/>
-          <w:sz w:val="21"/>
-        </w:rPr>
-        <w:t>/</w:t>
-      </w:r>
-      <w:r>
-        <w:rPr>
-          <w:rFonts w:ascii="Consolas" w:hAnsi="Consolas" w:eastAsia="微软雅黑"/>
-          <w:b w:val="0"/>
-          <w:i w:val="0"/>
-          <w:color w:val="A31515"/>
-          <w:sz w:val="19"/>
-        </w:rPr>
-        <w:t>mcu_pc_sil_log.txt</w:t>
-      </w:r>
-      <w:r>
-        <w:rPr>
-          <w:rFonts w:ascii="微软雅黑" w:hAnsi="微软雅黑" w:eastAsia="微软雅黑"/>
-          <w:b w:val="0"/>
-          <w:i w:val="0"/>
-          <w:sz w:val="21"/>
-        </w:rPr>
-        <w:t>）+</w:t>
+        <w:t>（B2，旧归因作废）+</w:t>
       </w:r>
     </w:p>
     <w:p>
@@ -4311,7 +4711,21 @@
           <w:i w:val="0"/>
           <w:sz w:val="21"/>
         </w:rPr>
-        <w:t xml:space="preserve">（操作教程与单算法曲线，主文用同轴对比，单曲线放附件）；旧总报告/DOCX/PPT 归 </w:t>
+        <w:t>（B3 视角下第 03 篇划分描述与第 11 篇 B1 表格为历史版本，结论以本主报告 Ch5 为准）；</w:t>
+      </w:r>
+    </w:p>
+    <w:p>
+      <w:pPr>
+        <w:spacing w:after="80"/>
+      </w:pPr>
+      <w:r>
+        <w:rPr>
+          <w:rFonts w:ascii="微软雅黑" w:hAnsi="微软雅黑" w:eastAsia="微软雅黑"/>
+          <w:b w:val="0"/>
+          <w:i w:val="0"/>
+          <w:sz w:val="21"/>
+        </w:rPr>
+        <w:t xml:space="preserve">旧总报告/DOCX/PPT 归 </w:t>
       </w:r>
       <w:r>
         <w:rPr>
@@ -4349,7 +4763,7 @@
           <w:i w:val="0"/>
           <w:sz w:val="21"/>
         </w:rPr>
-        <w:t xml:space="preserve">，核对见 </w:t>
+        <w:t xml:space="preserve">，机器核对 </w:t>
       </w:r>
       <w:r>
         <w:rPr>
@@ -4368,7 +4782,7 @@
           <w:i w:val="0"/>
           <w:sz w:val="21"/>
         </w:rPr>
-        <w:t>）。</w:t>
+        <w:t xml:space="preserve"> + 下述人工清单）。</w:t>
       </w:r>
     </w:p>
     <w:p>
@@ -4393,7 +4807,98 @@
           <w:i w:val="0"/>
           <w:sz w:val="21"/>
         </w:rPr>
-        <w:t>实验登记：正文/图表/CSV 统一用 E1–E5；</w:t>
+        <w:t>交付检查（人工逐页，机器无法替代）：① DOCX 逐页翻阅——分页无表格断裂、无图注分离；② 四张图可读（坐标轴/图例/在带底纹）；</w:t>
+      </w:r>
+    </w:p>
+    <w:p>
+      <w:pPr>
+        <w:spacing w:after="80"/>
+      </w:pPr>
+      <w:r>
+        <w:rPr>
+          <w:rFonts w:ascii="微软雅黑" w:hAnsi="微软雅黑" w:eastAsia="微软雅黑"/>
+          <w:b w:val="0"/>
+          <w:i w:val="0"/>
+          <w:sz w:val="21"/>
+        </w:rPr>
+        <w:t>③ Ch3/Ch5 表格数字与 CSV 逐项对过（</w:t>
+      </w:r>
+      <w:r>
+        <w:rPr>
+          <w:rFonts w:ascii="Consolas" w:hAnsi="Consolas" w:eastAsia="微软雅黑"/>
+          <w:b w:val="0"/>
+          <w:i w:val="0"/>
+          <w:color w:val="A31515"/>
+          <w:sz w:val="19"/>
+        </w:rPr>
+        <w:t>check_docx.py</w:t>
+      </w:r>
+      <w:r>
+        <w:rPr>
+          <w:rFonts w:ascii="微软雅黑" w:hAnsi="微软雅黑" w:eastAsia="微软雅黑"/>
+          <w:b w:val="0"/>
+          <w:i w:val="0"/>
+          <w:sz w:val="21"/>
+        </w:rPr>
+        <w:t xml:space="preserve"> 已做机器部分）；④ </w:t>
+      </w:r>
+      <w:r>
+        <w:rPr>
+          <w:rFonts w:ascii="Consolas" w:hAnsi="Consolas" w:eastAsia="微软雅黑"/>
+          <w:b w:val="0"/>
+          <w:i w:val="0"/>
+          <w:color w:val="A31515"/>
+          <w:sz w:val="19"/>
+        </w:rPr>
+        <w:t>node tests/check_interactive_html.mjs</w:t>
+      </w:r>
+      <w:r>
+        <w:rPr>
+          <w:rFonts w:ascii="微软雅黑" w:hAnsi="微软雅黑" w:eastAsia="微软雅黑"/>
+          <w:b w:val="0"/>
+          <w:i w:val="0"/>
+          <w:sz w:val="21"/>
+        </w:rPr>
+        <w:t xml:space="preserve"> 在 CI 烟雾 HTML 上实跑通过；</w:t>
+      </w:r>
+    </w:p>
+    <w:p>
+      <w:pPr>
+        <w:spacing w:after="80"/>
+      </w:pPr>
+      <w:r>
+        <w:rPr>
+          <w:rFonts w:ascii="微软雅黑" w:hAnsi="微软雅黑" w:eastAsia="微软雅黑"/>
+          <w:b w:val="0"/>
+          <w:i w:val="0"/>
+          <w:sz w:val="21"/>
+        </w:rPr>
+        <w:t>⑤ 公式以 katex 烟雾 + 详细文档构建为准（本主报告无行内公式 debt）。</w:t>
+      </w:r>
+    </w:p>
+    <w:p>
+      <w:pPr>
+        <w:spacing w:after="40"/>
+        <w:ind w:left="425"/>
+      </w:pPr>
+      <w:r>
+        <w:rPr>
+          <w:rFonts w:ascii="微软雅黑" w:hAnsi="微软雅黑" w:eastAsia="微软雅黑"/>
+          <w:b w:val="0"/>
+          <w:i w:val="0"/>
+          <w:color w:val="1F4E79"/>
+          <w:sz w:val="21"/>
+        </w:rPr>
+        <w:t xml:space="preserve">•  </w:t>
+      </w:r>
+      <w:r>
+        <w:rPr>
+          <w:rFonts w:ascii="微软雅黑" w:hAnsi="微软雅黑" w:eastAsia="微软雅黑"/>
+          <w:b w:val="0"/>
+          <w:i w:val="0"/>
+          <w:sz w:val="21"/>
+        </w:rPr>
+        <w:t>实验登记：正文/图表/CSV 统一用 E1–E5（B1/B2/B3 后缀区分轮次）；</w:t>
       </w:r>
       <w:r>
         <w:rPr>

</xml_diff>

<commit_message>
E2-B4 fresh-seed round: cluster GP intervals, counted budget, control-tested failures, converged main report
</commit_message>
<xml_diff>
--- a/docs/主报告.docx
+++ b/docs/主报告.docx
@@ -31,7 +31,7 @@
           <w:color w:val="595959"/>
           <w:sz w:val="19"/>
         </w:rPr>
-        <w:t>范围声明（必读）：本报告主结论为 E2-B3 独立密封重评 + E1/E3–E5 工程验证。</w:t>
+        <w:t>范围声明（必读）：本报告主结论为 E2-B4 全新密封集复评 + E1/E3–E5 工程验证。</w:t>
       </w:r>
     </w:p>
     <w:p>
@@ -47,7 +47,7 @@
           <w:color w:val="595959"/>
           <w:sz w:val="19"/>
         </w:rPr>
-        <w:t>B3（</w:t>
+        <w:t>B4（</w:t>
       </w:r>
       <w:r>
         <w:rPr>
@@ -57,7 +57,7 @@
           <w:color w:val="A31515"/>
           <w:sz w:val="17"/>
         </w:rPr>
-        <w:t>sealed-80x7-b3</w:t>
+        <w:t>sealed-80x7-b4</w:t>
       </w:r>
       <w:r>
         <w:rPr>
@@ -67,7 +67,7 @@
           <w:color w:val="595959"/>
           <w:sz w:val="19"/>
         </w:rPr>
-        <w:t>）：统一重训冻结 + 部署门仅用资格集 + 密封集选择全程未见 + LLM 在完整 48 训练集冻结。</w:t>
+        <w:t>）：新场景（601–641，从未参与任何分析）+ 冻结策略评价一次，不重训。</w:t>
       </w:r>
     </w:p>
     <w:p>
@@ -83,7 +83,7 @@
           <w:color w:val="595959"/>
           <w:sz w:val="19"/>
         </w:rPr>
-        <w:t>B1（混合冻结）与 B2（部署门误用密封集）保留为历史对照，不再承担主结论。</w:t>
+        <w:t>B1（混合冻结）、B2（部署门误用密封集）、B3（场景复用 B2）保留为历史对照。</w:t>
       </w:r>
     </w:p>
     <w:p>
@@ -119,43 +119,7 @@
           <w:color w:val="595959"/>
           <w:sz w:val="19"/>
         </w:rPr>
-        <w:t>），只有 BO/随机臂可用“同预算”措辞。</w:t>
-      </w:r>
-    </w:p>
-    <w:p>
-      <w:pPr>
-        <w:spacing w:after="40"/>
-        <w:ind w:left="340"/>
-      </w:pPr>
-      <w:r>
-        <w:rPr>
-          <w:rFonts w:ascii="微软雅黑" w:hAnsi="微软雅黑" w:eastAsia="微软雅黑"/>
-          <w:b w:val="0"/>
-          <w:i w:val="0"/>
-          <w:color w:val="595959"/>
-          <w:sz w:val="19"/>
-        </w:rPr>
-        <w:t>教程式操作步骤、分算法曲线、历史批次说明分别见附件（</w:t>
-      </w:r>
-      <w:r>
-        <w:rPr>
-          <w:rFonts w:ascii="Consolas" w:hAnsi="Consolas" w:eastAsia="微软雅黑"/>
-          <w:b w:val="0"/>
-          <w:i w:val="0"/>
-          <w:color w:val="A31515"/>
-          <w:sz w:val="17"/>
-        </w:rPr>
-        <w:t>reports/分报告/00–12</w:t>
-      </w:r>
-      <w:r>
-        <w:rPr>
-          <w:rFonts w:ascii="微软雅黑" w:hAnsi="微软雅黑" w:eastAsia="微软雅黑"/>
-          <w:b w:val="0"/>
-          <w:i w:val="0"/>
-          <w:color w:val="595959"/>
-          <w:sz w:val="19"/>
-        </w:rPr>
-        <w:t xml:space="preserve"> 为教学附件，非正文）。</w:t>
+        <w:t>，已计入的计算预算，非完整实测成本），只有 BO/随机臂可用“同预算”措辞。</w:t>
       </w:r>
     </w:p>
     <w:p>
@@ -220,7 +184,7 @@
           <w:i w:val="0"/>
           <w:sz w:val="21"/>
         </w:rPr>
-        <w:t>对象为小型机柜空调单区 3R2C 热对象（执行器含延迟/惯性/ slew/量化/最小运行约束，传感器含噪声与滤波）。</w:t>
+        <w:t>对象为小型机柜空调单区 3R2C 热对象（执行器含延迟/惯性/slew/量化/最小运行约束，传感器含噪声与滤波）。</w:t>
       </w:r>
     </w:p>
     <w:p>
@@ -234,7 +198,7 @@
           <w:i w:val="0"/>
           <w:sz w:val="21"/>
         </w:rPr>
-        <w:t>工作分为离线整定/训练、冻结策略、在线增益调度、安全 PI 四段边界；LLM 不进入快速控制环，仅做离线建议。</w:t>
+        <w:t>方法侧分为离线整定/训练、冻结策略、在线增益调度、安全 PI 四段边界；LLM 不进入快速控制环，仅做离线建议。</w:t>
       </w:r>
     </w:p>
     <w:p>
@@ -248,7 +212,7 @@
           <w:i w:val="0"/>
           <w:sz w:val="21"/>
         </w:rPr>
-        <w:t>主实验 E2-B3 将 7 种冻结策略放在同一 80 场景独立密封清单（部署门在资格集已结束，密封场景选择全程未见）、</w:t>
+        <w:t>协议为四向隔离：48 训练定参数、16 验证做选择、16 资格集做部署门、80 全新密封场景只打分（601–641，与一切历史数据零重叠）。</w:t>
       </w:r>
     </w:p>
     <w:p>
@@ -262,7 +226,7 @@
           <w:i w:val="0"/>
           <w:sz w:val="21"/>
         </w:rPr>
-        <w:t>同一噪声种子、同一六子步 v4 积分器、同一指标下评价（560 条记录）。</w:t>
+        <w:t>主统计量为逐场景配对比均值 + bootstrap 95% CI；验收为 bounded/舒适保持/扰动恢复/执行器合规四项全过；非劣界 1.02。</w:t>
       </w:r>
     </w:p>
     <w:p>
@@ -276,26 +240,7 @@
           <w:i w:val="0"/>
           <w:sz w:val="21"/>
         </w:rPr>
-        <w:t xml:space="preserve">主统计量为逐场景配对比均值 </w:t>
-      </w:r>
-      <w:r>
-        <w:rPr>
-          <w:rFonts w:ascii="Consolas" w:hAnsi="Consolas" w:eastAsia="微软雅黑"/>
-          <w:b w:val="0"/>
-          <w:i w:val="0"/>
-          <w:color w:val="A31515"/>
-          <w:sz w:val="19"/>
-        </w:rPr>
-        <w:t>mean(J/J_imc)</w:t>
-      </w:r>
-      <w:r>
-        <w:rPr>
-          <w:rFonts w:ascii="微软雅黑" w:hAnsi="微软雅黑" w:eastAsia="微软雅黑"/>
-          <w:b w:val="0"/>
-          <w:i w:val="0"/>
-          <w:sz w:val="21"/>
-        </w:rPr>
-        <w:t xml:space="preserve"> + bootstrap 95% CI；验收为四项全过；非劣界 1.02。</w:t>
+        <w:t>主要结果（E2-B4，560 条记录）：数值有界 7/7 全过，但温控验收最高仅 37/80（RL）。</w:t>
       </w:r>
     </w:p>
     <w:p>
@@ -309,7 +254,7 @@
           <w:i w:val="0"/>
           <w:sz w:val="21"/>
         </w:rPr>
-        <w:t>主要发现：数值有界 7/7 达 80/80，但温控验收最高仅 40/80（IMC/Safe-BO/FNN/LLM 并列），Z-N 6/80。</w:t>
+        <w:t>RL 0.9614 [0.9429,0.9795] 显著优于 IMC，幅度约 4%，且在新集挽救 2 个 IMC 失败场景、零新增；</w:t>
       </w:r>
     </w:p>
     <w:p>
@@ -323,7 +268,7 @@
           <w:i w:val="0"/>
           <w:sz w:val="21"/>
         </w:rPr>
-        <w:t>性能上无任何方法显著优于 IMC：BO 1.0785 [1.0424,1.1146] 显著更差（原因尚未完成归因，禁止径称过拟合），</w:t>
+        <w:t>BO 1.0630 [1.0306,1.0964] 显著差于 IMC（原因尚未完成归因）；</w:t>
       </w:r>
     </w:p>
     <w:p>
@@ -337,7 +282,7 @@
           <w:i w:val="0"/>
           <w:sz w:val="21"/>
         </w:rPr>
-        <w:t>Safe-BO 与 FNN 回落到等于 IMC（前者选中基线本身，后者资格集门未通过→回退），RL 0.9801 [0.9611,1.0041] 未发现显著优势（非劣成立）。</w:t>
+        <w:t>Safe-BO、FNN（实际执行）、LLM replay 均等于 IMC——三者不是三种独立算法性能证明，其中 FNN 候选本身 0.9792 [0.9680,0.9895]，</w:t>
       </w:r>
     </w:p>
     <w:p>
@@ -351,7 +296,7 @@
           <w:i w:val="0"/>
           <w:sz w:val="21"/>
         </w:rPr>
-        <w:t>失败归因：7 个场景全算法失败（1 容量紧张 + 6 观察窗不足）；33 个调参残余失败全部卡在扰动恢复，</w:t>
+        <w:t>但资格门已拒绝部署，事后对照不得作为部署结论。</w:t>
       </w:r>
     </w:p>
     <w:p>
@@ -365,7 +310,7 @@
           <w:i w:val="0"/>
           <w:sz w:val="21"/>
         </w:rPr>
-        <w:t>无任何方法系统性挽救 IMC 失败场景——下一步优先级是解释并改善合格率，而非继续排名。</w:t>
+        <w:t>失败控制实验：疑似调参失败中减半增益翻转 28/41（确证增益敏感），疑似窗口失败延长观察翻转 2/4；</w:t>
       </w:r>
     </w:p>
     <w:p>
@@ -379,7 +324,7 @@
           <w:i w:val="0"/>
           <w:sz w:val="21"/>
         </w:rPr>
-        <w:t>E3+ 严格对照（同初值同噪声，4 搜索种子）：GP 对同预算随机的混合池配对差 −0.0057 [−0.0373,+0.0284]（含 0），</w:t>
+        <w:t>E3+ 严格对照（双向聚类）：GP 对同预算随机 −0.0059 [−0.1040,+0.1335]（含 0），机制贡献未经证实。</w:t>
       </w:r>
     </w:p>
     <w:p>
@@ -393,7 +338,7 @@
           <w:i w:val="0"/>
           <w:sz w:val="21"/>
         </w:rPr>
-        <w:t>机制贡献未经证实。E4 LLM 真实矩阵独立报告（v3 5/18 部署，v4 1/18 部署），不参与排名。</w:t>
+        <w:t>边界：最高验收 46.2%、实体三门待验证；若定位为仿真平台与方法评估报告，已接近提交；</w:t>
       </w:r>
     </w:p>
     <w:p>
@@ -407,7 +352,7 @@
           <w:i w:val="0"/>
           <w:sz w:val="21"/>
         </w:rPr>
-        <w:t>E5 软件一致性成立（PC-SIL PASS），实体三门仍待验证。</w:t>
+        <w:t>若定位为可部署方案或算法优势证明，缺口仍明确。</w:t>
       </w:r>
     </w:p>
     <w:p>
@@ -786,7 +731,7 @@
           <w:color w:val="1F4E79"/>
           <w:sz w:val="30"/>
         </w:rPr>
-        <w:t>3 七类方法及统一接口（B3 冻结值；B1/B2 值见历史批次附件）</w:t>
+        <w:t>3 七类方法及统一接口（B3/B4 共用冻结值；B1/B2 值见历史批次附件）</w:t>
       </w:r>
     </w:p>
     <w:tbl>
@@ -1439,7 +1384,7 @@
           <w:i w:val="0"/>
           <w:sz w:val="21"/>
         </w:rPr>
-        <w:t>E2-B3 独立密封：四向隔离（48 训练/16 验证/16 资格/80 密封，</w:t>
+        <w:t>E2-B4 全新密封：80 新场景（</w:t>
       </w:r>
       <w:r>
         <w:rPr>
@@ -1449,7 +1394,7 @@
           <w:color w:val="A31515"/>
           <w:sz w:val="19"/>
         </w:rPr>
-        <w:t>dataset_manifest.csv</w:t>
+        <w:t>acceptance_seeds=601,611,621,631,641</w:t>
       </w:r>
       <w:r>
         <w:rPr>
@@ -1458,7 +1403,7 @@
           <w:i w:val="0"/>
           <w:sz w:val="21"/>
         </w:rPr>
-        <w:t xml:space="preserve"> SHA-256 防泄漏）；</w:t>
+        <w:t>，与训练/验证/资格/旧密封零摘要重叠，已验），</w:t>
       </w:r>
     </w:p>
     <w:p>
@@ -1472,73 +1417,7 @@
           <w:i w:val="0"/>
           <w:sz w:val="21"/>
         </w:rPr>
-        <w:t>部署门只用资格集（FNN 未通过→回退 IMC，RL 通过），冻结后密封集只打分；</w:t>
-      </w:r>
-    </w:p>
-    <w:p>
-      <w:pPr>
-        <w:spacing w:after="80"/>
-      </w:pPr>
-      <w:r>
-        <w:rPr>
-          <w:rFonts w:ascii="微软雅黑" w:hAnsi="微软雅黑" w:eastAsia="微软雅黑"/>
-          <w:b w:val="0"/>
-          <w:i w:val="0"/>
-          <w:sz w:val="21"/>
-        </w:rPr>
-        <w:t>80 场景（</w:t>
-      </w:r>
-      <w:r>
-        <w:rPr>
-          <w:rFonts w:ascii="Consolas" w:hAnsi="Consolas" w:eastAsia="微软雅黑"/>
-          <w:b w:val="0"/>
-          <w:i w:val="0"/>
-          <w:color w:val="A31515"/>
-          <w:sz w:val="19"/>
-        </w:rPr>
-        <w:t>acceptance_seeds=101,211,307,401,503</w:t>
-      </w:r>
-      <w:r>
-        <w:rPr>
-          <w:rFonts w:ascii="微软雅黑" w:hAnsi="微软雅黑" w:eastAsia="微软雅黑"/>
-          <w:b w:val="0"/>
-          <w:i w:val="0"/>
-          <w:sz w:val="21"/>
-        </w:rPr>
-        <w:t xml:space="preserve">，噪声 </w:t>
-      </w:r>
-      <w:r>
-        <w:rPr>
-          <w:rFonts w:ascii="Consolas" w:hAnsi="Consolas" w:eastAsia="微软雅黑"/>
-          <w:b w:val="0"/>
-          <w:i w:val="0"/>
-          <w:color w:val="A31515"/>
-          <w:sz w:val="19"/>
-        </w:rPr>
-        <w:t>seed+700000+ordinal</w:t>
-      </w:r>
-      <w:r>
-        <w:rPr>
-          <w:rFonts w:ascii="微软雅黑" w:hAnsi="微软雅黑" w:eastAsia="微软雅黑"/>
-          <w:b w:val="0"/>
-          <w:i w:val="0"/>
-          <w:sz w:val="21"/>
-        </w:rPr>
-        <w:t>，门噪声系独立）；</w:t>
-      </w:r>
-    </w:p>
-    <w:p>
-      <w:pPr>
-        <w:spacing w:after="80"/>
-      </w:pPr>
-      <w:r>
-        <w:rPr>
-          <w:rFonts w:ascii="微软雅黑" w:hAnsi="微软雅黑" w:eastAsia="微软雅黑"/>
-          <w:b w:val="0"/>
-          <w:i w:val="0"/>
-          <w:sz w:val="21"/>
-        </w:rPr>
-        <w:t>七算法同场景同种子同积分器同指标；测试后调参换新密封集。</w:t>
+        <w:t>冻结策略评价一次，不重训；七算法同场景同种子同积分器同指标；测试后调参换新密封集。</w:t>
       </w:r>
     </w:p>
     <w:p>
@@ -1562,7 +1441,7 @@
           <w:color w:val="A31515"/>
           <w:sz w:val="19"/>
         </w:rPr>
-        <w:t>sealed-80x7-b3/budget_table.csv</w:t>
+        <w:t>sealed-80x7-b4/budget_table.csv</w:t>
       </w:r>
       <w:r>
         <w:rPr>
@@ -1571,7 +1450,39 @@
           <w:i w:val="0"/>
           <w:sz w:val="21"/>
         </w:rPr>
-        <w:t>，每闭环 = 5 对象小时）：</w:t>
+        <w:t>，</w:t>
+      </w:r>
+      <w:r>
+        <w:rPr>
+          <w:rFonts w:ascii="微软雅黑" w:hAnsi="微软雅黑" w:eastAsia="微软雅黑"/>
+          <w:b/>
+          <w:i w:val="0"/>
+          <w:sz w:val="21"/>
+        </w:rPr>
+        <w:t>已计入的计算预算</w:t>
+      </w:r>
+      <w:r>
+        <w:rPr>
+          <w:rFonts w:ascii="微软雅黑" w:hAnsi="微软雅黑" w:eastAsia="微软雅黑"/>
+          <w:b w:val="0"/>
+          <w:i w:val="0"/>
+          <w:sz w:val="21"/>
+        </w:rPr>
+        <w:t>，非完整实测成本；每闭环 = 5 对象小时；</w:t>
+      </w:r>
+    </w:p>
+    <w:p>
+      <w:pPr>
+        <w:spacing w:after="80"/>
+      </w:pPr>
+      <w:r>
+        <w:rPr>
+          <w:rFonts w:ascii="微软雅黑" w:hAnsi="微软雅黑" w:eastAsia="微软雅黑"/>
+          <w:b w:val="0"/>
+          <w:i w:val="0"/>
+          <w:sz w:val="21"/>
+        </w:rPr>
+        <w:t>遗漏项：短时域回放、循环内重复评价、积分步数、绘图渲染、分方法墙钟——精确成本排名禁用）：</w:t>
       </w:r>
     </w:p>
     <w:tbl>
@@ -2358,7 +2269,7 @@
           <w:i w:val="0"/>
           <w:sz w:val="21"/>
         </w:rPr>
-        <w:t>E3 消融：同 80 场景随机/保守对照（历史）；E3+ 严格对照：同初值同噪声，4 搜索种子，GP/随机各追加 7 评估，报告混合池配对差。</w:t>
+        <w:t>E3 消融：同 80 场景随机/保守对照（历史）；E3+ 严格对照：同初值同噪声，4 搜索种子，GP/随机各追加 7 评估，报告双向聚类配对差。</w:t>
       </w:r>
     </w:p>
     <w:p>
@@ -2466,7 +2377,7 @@
           <w:i w:val="0"/>
           <w:sz w:val="21"/>
         </w:rPr>
-        <w:t>复现：</w:t>
+        <w:t>复现（每条可直接复制；</w:t>
       </w:r>
       <w:r>
         <w:rPr>
@@ -2476,7 +2387,7 @@
           <w:color w:val="A31515"/>
           <w:sz w:val="19"/>
         </w:rPr>
-        <w:t>python run.py pipeline --output &lt;run&gt; --seed 7</w:t>
+        <w:t>&lt;run&gt;</w:t>
       </w:r>
       <w:r>
         <w:rPr>
@@ -2485,7 +2396,7 @@
           <w:i w:val="0"/>
           <w:sz w:val="21"/>
         </w:rPr>
-        <w:t xml:space="preserve"> → </w:t>
+        <w:t>=</w:t>
       </w:r>
       <w:r>
         <w:rPr>
@@ -2495,7 +2406,7 @@
           <w:color w:val="A31515"/>
           <w:sz w:val="19"/>
         </w:rPr>
-        <w:t>python run.py sealed --artifact-dir &lt;run&gt; --output &lt;sealed&gt; --protocol-label E2-B3</w:t>
+        <w:t>artifacts/runs/v4-20260906-bf6bda6</w:t>
       </w:r>
       <w:r>
         <w:rPr>
@@ -2504,21 +2415,7 @@
           <w:i w:val="0"/>
           <w:sz w:val="21"/>
         </w:rPr>
-        <w:t>；</w:t>
-      </w:r>
-    </w:p>
-    <w:p>
-      <w:pPr>
-        <w:spacing w:after="80"/>
-      </w:pPr>
-      <w:r>
-        <w:rPr>
-          <w:rFonts w:ascii="微软雅黑" w:hAnsi="微软雅黑" w:eastAsia="微软雅黑"/>
-          <w:b w:val="0"/>
-          <w:i w:val="0"/>
-          <w:sz w:val="21"/>
-        </w:rPr>
-        <w:t xml:space="preserve">一致性 </w:t>
+        <w:t>，</w:t>
       </w:r>
       <w:r>
         <w:rPr>
@@ -2528,7 +2425,7 @@
           <w:color w:val="A31515"/>
           <w:sz w:val="19"/>
         </w:rPr>
-        <w:t>python tools/check_results_consistency.py --sealed-dir &lt;sealed&gt;</w:t>
+        <w:t>&lt;sealed&gt;</w:t>
       </w:r>
       <w:r>
         <w:rPr>
@@ -2537,7 +2434,7 @@
           <w:i w:val="0"/>
           <w:sz w:val="21"/>
         </w:rPr>
-        <w:t xml:space="preserve">；归因 </w:t>
+        <w:t>=</w:t>
       </w:r>
       <w:r>
         <w:rPr>
@@ -2547,7 +2444,7 @@
           <w:color w:val="A31515"/>
           <w:sz w:val="19"/>
         </w:rPr>
-        <w:t>python tools/run_gp_attribution.py</w:t>
+        <w:t>artifacts/runs/sealed-80x7-b4</w:t>
       </w:r>
       <w:r>
         <w:rPr>
@@ -2556,26 +2453,105 @@
           <w:i w:val="0"/>
           <w:sz w:val="21"/>
         </w:rPr>
-        <w:t xml:space="preserve">；失败分析 </w:t>
+        <w:t>）：</w:t>
       </w:r>
+    </w:p>
+    <w:p>
+      <w:pPr>
+        <w:ind w:left="283"/>
+      </w:pPr>
       <w:r>
         <w:rPr>
           <w:rFonts w:ascii="Consolas" w:hAnsi="Consolas" w:eastAsia="微软雅黑"/>
           <w:b w:val="0"/>
           <w:i w:val="0"/>
-          <w:color w:val="A31515"/>
-          <w:sz w:val="19"/>
+          <w:sz w:val="18"/>
         </w:rPr>
-        <w:t>python tools/analyze_failures.py --sealed &lt;sealed&gt;</w:t>
+        <w:t>python run.py sealed --artifact-dir &lt;run&gt; --output &lt;sealed&gt; --protocol-label E2-B4 --acceptance-seeds 601,611,621,631,641 --design-note "fresh sealed scenarios unseen in any prior analysis"</w:t>
       </w:r>
+    </w:p>
+    <w:p>
+      <w:pPr>
+        <w:ind w:left="283"/>
+      </w:pPr>
       <w:r>
         <w:rPr>
-          <w:rFonts w:ascii="微软雅黑" w:hAnsi="微软雅黑" w:eastAsia="微软雅黑"/>
+          <w:rFonts w:ascii="Consolas" w:hAnsi="Consolas" w:eastAsia="微软雅黑"/>
           <w:b w:val="0"/>
           <w:i w:val="0"/>
-          <w:sz w:val="21"/>
+          <w:sz w:val="18"/>
         </w:rPr>
-        <w:t>。</w:t>
+        <w:t>python run.py attribution --artifact-dir &lt;run&gt; --output &lt;sealed&gt;/gp_attribution.csv --seed 7 --train-seed 7 --acceptance-seeds 601,611,621,631,641</w:t>
+      </w:r>
+    </w:p>
+    <w:p>
+      <w:pPr>
+        <w:ind w:left="283"/>
+      </w:pPr>
+      <w:r>
+        <w:rPr>
+          <w:rFonts w:ascii="Consolas" w:hAnsi="Consolas" w:eastAsia="微软雅黑"/>
+          <w:b w:val="0"/>
+          <w:i w:val="0"/>
+          <w:sz w:val="18"/>
+        </w:rPr>
+        <w:t>python run.py budget --run &lt;run&gt; --sealed &lt;sealed&gt; --wall-seconds 197.8</w:t>
+      </w:r>
+    </w:p>
+    <w:p>
+      <w:pPr>
+        <w:ind w:left="283"/>
+      </w:pPr>
+      <w:r>
+        <w:rPr>
+          <w:rFonts w:ascii="Consolas" w:hAnsi="Consolas" w:eastAsia="微软雅黑"/>
+          <w:b w:val="0"/>
+          <w:i w:val="0"/>
+          <w:sz w:val="18"/>
+        </w:rPr>
+        <w:t>python run.py failures --sealed &lt;sealed&gt;</w:t>
+      </w:r>
+    </w:p>
+    <w:p>
+      <w:pPr>
+        <w:ind w:left="283"/>
+      </w:pPr>
+      <w:r>
+        <w:rPr>
+          <w:rFonts w:ascii="Consolas" w:hAnsi="Consolas" w:eastAsia="微软雅黑"/>
+          <w:b w:val="0"/>
+          <w:i w:val="0"/>
+          <w:sz w:val="18"/>
+        </w:rPr>
+        <w:t>python run.py controls --artifact-dir &lt;run&gt; --sealed &lt;sealed&gt;</w:t>
+      </w:r>
+    </w:p>
+    <w:p>
+      <w:pPr>
+        <w:ind w:left="283"/>
+      </w:pPr>
+      <w:r>
+        <w:rPr>
+          <w:rFonts w:ascii="Consolas" w:hAnsi="Consolas" w:eastAsia="微软雅黑"/>
+          <w:b w:val="0"/>
+          <w:i w:val="0"/>
+          <w:sz w:val="18"/>
+        </w:rPr>
+        <w:t>python run.py figures --artifact-dir &lt;run&gt; --sealed &lt;sealed&gt;</w:t>
+      </w:r>
+    </w:p>
+    <w:p>
+      <w:pPr>
+        <w:ind w:left="283"/>
+      </w:pPr>
+      <w:r>
+        <w:rPr>
+          <w:rFonts w:ascii="Consolas" w:hAnsi="Consolas" w:eastAsia="微软雅黑"/>
+          <w:b w:val="0"/>
+          <w:i w:val="0"/>
+          <w:sz w:val="18"/>
+        </w:rPr>
+        <w:t>python tools/check_results_consistency.py --sealed-dir &lt;sealed&gt;</w:t>
       </w:r>
     </w:p>
     <w:p>
@@ -2590,7 +2566,7 @@
           <w:color w:val="1F4E79"/>
           <w:sz w:val="30"/>
         </w:rPr>
-        <w:t>5 结果与失败分析（E2-B3；B1/B2 见历史对照附件）</w:t>
+        <w:t>5 结果与失败分析（E2-B4；B1/B2/B3 见历史对照附件）</w:t>
       </w:r>
     </w:p>
     <w:p>
@@ -2614,7 +2590,7 @@
           <w:color w:val="A31515"/>
           <w:sz w:val="19"/>
         </w:rPr>
-        <w:t>sealed-80x7-b3/sealed_80_summary.csv:2-8</w:t>
+        <w:t>sealed-80x7-b4/sealed_80_summary.csv:2-8</w:t>
       </w:r>
       <w:r>
         <w:rPr>
@@ -2770,7 +2746,7 @@
                 <w:i w:val="0"/>
                 <w:sz w:val="18"/>
               </w:rPr>
-              <w:t>61.72</w:t>
+              <w:t>59.86</w:t>
             </w:r>
           </w:p>
         </w:tc>
@@ -2786,7 +2762,7 @@
                 <w:i w:val="0"/>
                 <w:sz w:val="18"/>
               </w:rPr>
-              <w:t>1.6509 [1.5407,1.7630]</w:t>
+              <w:t>1.7803 [1.6208,1.9623]</w:t>
             </w:r>
           </w:p>
         </w:tc>
@@ -2802,7 +2778,7 @@
                 <w:i w:val="0"/>
                 <w:sz w:val="18"/>
               </w:rPr>
-              <w:t>6/80</w:t>
+              <w:t>2/80</w:t>
             </w:r>
           </w:p>
         </w:tc>
@@ -2852,7 +2828,7 @@
                 <w:i w:val="0"/>
                 <w:sz w:val="18"/>
               </w:rPr>
-              <w:t>41.24</w:t>
+              <w:t>38.24</w:t>
             </w:r>
           </w:p>
         </w:tc>
@@ -2884,7 +2860,7 @@
                 <w:i w:val="0"/>
                 <w:sz w:val="18"/>
               </w:rPr>
-              <w:t>40/80</w:t>
+              <w:t>35/80</w:t>
             </w:r>
           </w:p>
         </w:tc>
@@ -2900,7 +2876,7 @@
                 <w:i w:val="0"/>
                 <w:sz w:val="18"/>
               </w:rPr>
-              <w:t>基准；有界全过但验收仅半数</w:t>
+              <w:t>基准；有界全过但验收不足半数</w:t>
             </w:r>
           </w:p>
         </w:tc>
@@ -2934,7 +2910,7 @@
                 <w:i w:val="0"/>
                 <w:sz w:val="18"/>
               </w:rPr>
-              <w:t>45.02</w:t>
+              <w:t>41.28</w:t>
             </w:r>
           </w:p>
         </w:tc>
@@ -2950,7 +2926,7 @@
                 <w:i w:val="0"/>
                 <w:sz w:val="18"/>
               </w:rPr>
-              <w:t>1.0785 [1.0424,1.1146]</w:t>
+              <w:t>1.0630 [1.0306,1.0964]</w:t>
             </w:r>
           </w:p>
         </w:tc>
@@ -2966,7 +2942,7 @@
                 <w:i w:val="0"/>
                 <w:sz w:val="18"/>
               </w:rPr>
-              <w:t>33/80</w:t>
+              <w:t>29/80</w:t>
             </w:r>
           </w:p>
         </w:tc>
@@ -3016,7 +2992,7 @@
                 <w:i w:val="0"/>
                 <w:sz w:val="18"/>
               </w:rPr>
-              <w:t>41.24</w:t>
+              <w:t>38.24</w:t>
             </w:r>
           </w:p>
         </w:tc>
@@ -3048,7 +3024,7 @@
                 <w:i w:val="0"/>
                 <w:sz w:val="18"/>
               </w:rPr>
-              <w:t>40/80</w:t>
+              <w:t>35/80</w:t>
             </w:r>
           </w:p>
         </w:tc>
@@ -3082,7 +3058,7 @@
                 <w:i w:val="0"/>
                 <w:sz w:val="18"/>
               </w:rPr>
-              <w:t>FNN</w:t>
+              <w:t>FNN（实际执行）</w:t>
             </w:r>
           </w:p>
         </w:tc>
@@ -3098,7 +3074,7 @@
                 <w:i w:val="0"/>
                 <w:sz w:val="18"/>
               </w:rPr>
-              <w:t>41.24</w:t>
+              <w:t>38.24</w:t>
             </w:r>
           </w:p>
         </w:tc>
@@ -3130,7 +3106,7 @@
                 <w:i w:val="0"/>
                 <w:sz w:val="18"/>
               </w:rPr>
-              <w:t>40/80</w:t>
+              <w:t>35/80</w:t>
             </w:r>
           </w:p>
         </w:tc>
@@ -3146,7 +3122,7 @@
                 <w:i w:val="0"/>
                 <w:sz w:val="18"/>
               </w:rPr>
-              <w:t>资格门未通过→回退 IMC</w:t>
+              <w:t>资格门拒绝→回退 IMC；候选本身 0.9792 [0.9680,0.9895]，事后对照不得作为部署结论</w:t>
             </w:r>
           </w:p>
         </w:tc>
@@ -3180,7 +3156,7 @@
                 <w:i w:val="0"/>
                 <w:sz w:val="18"/>
               </w:rPr>
-              <w:t>39.80</w:t>
+              <w:t>36.41</w:t>
             </w:r>
           </w:p>
         </w:tc>
@@ -3196,7 +3172,7 @@
                 <w:i w:val="0"/>
                 <w:sz w:val="18"/>
               </w:rPr>
-              <w:t>0.9801 [0.9611,1.0041]</w:t>
+              <w:t>0.9614 [0.9429,0.9795]</w:t>
             </w:r>
           </w:p>
         </w:tc>
@@ -3212,7 +3188,7 @@
                 <w:i w:val="0"/>
                 <w:sz w:val="18"/>
               </w:rPr>
-              <w:t>39/80</w:t>
+              <w:t>37/80</w:t>
             </w:r>
           </w:p>
         </w:tc>
@@ -3228,7 +3204,7 @@
                 <w:i w:val="0"/>
                 <w:sz w:val="18"/>
               </w:rPr>
-              <w:t>未发现显著优势；非劣成立（上界 ≤1.02）</w:t>
+              <w:t>显著优于 IMC，幅度约 4%；挽救 #17/#51 且零新增，但单次新集，需多种子重复确认</w:t>
             </w:r>
           </w:p>
         </w:tc>
@@ -3262,7 +3238,7 @@
                 <w:i w:val="0"/>
                 <w:sz w:val="18"/>
               </w:rPr>
-              <w:t>41.24</w:t>
+              <w:t>38.24</w:t>
             </w:r>
           </w:p>
         </w:tc>
@@ -3294,7 +3270,7 @@
                 <w:i w:val="0"/>
                 <w:sz w:val="18"/>
               </w:rPr>
-              <w:t>40/80</w:t>
+              <w:t>35/80</w:t>
             </w:r>
           </w:p>
         </w:tc>
@@ -3338,7 +3314,7 @@
           <w:color w:val="A31515"/>
           <w:sz w:val="19"/>
         </w:rPr>
-        <w:t>sealed-80x7-b3/figures/</w:t>
+        <w:t>sealed-80x7-b4/figures/</w:t>
       </w:r>
       <w:r>
         <w:rPr>
@@ -3401,7 +3377,7 @@
           <w:color w:val="595959"/>
           <w:sz w:val="18"/>
         </w:rPr>
-        <w:t>中位场景七算法同轴（ordinal=38，IMC J=35.12）</w:t>
+        <w:t>中位场景七算法同轴（ordinal=37，IMC J=34.34）</w:t>
       </w:r>
     </w:p>
     <w:p>
@@ -3417,7 +3393,7 @@
           <w:color w:val="595959"/>
           <w:sz w:val="19"/>
         </w:rPr>
-        <w:t>中位场景：七算法轨迹基本重合，IMC 与自适应方法无实质差异——与配对比结论一致。</w:t>
+        <w:t>中位场景：除 Z-N 外七算法轨迹基本重合——与总量结论一致，典型场景下方法间无实质差异。</w:t>
       </w:r>
     </w:p>
     <w:p>
@@ -3471,7 +3447,7 @@
           <w:color w:val="595959"/>
           <w:sz w:val="18"/>
         </w:rPr>
-        <w:t>失败场景七算法同轴（ordinal=70，IMC J=111.08，振荡型恢复失败）</w:t>
+        <w:t>失败场景七算法同轴（ordinal=13，IMC J=119.61，极限环振荡）</w:t>
       </w:r>
     </w:p>
     <w:p>
@@ -3487,7 +3463,7 @@
           <w:color w:val="595959"/>
           <w:sz w:val="19"/>
         </w:rPr>
-        <w:t>失败场景：无扰动热启动，负荷比仅 0.10、窗口充足，但全部算法出现大幅欠调（IMC 4.2°C）与压缩机反复启停振荡，</w:t>
+        <w:t>失败场景：全部算法陷入持续极限环（温度 ±2.5°C 摆动，压缩机 0↔100% 猛烈启停），</w:t>
       </w:r>
     </w:p>
     <w:p>
@@ -3503,7 +3479,7 @@
           <w:color w:val="595959"/>
           <w:sz w:val="19"/>
         </w:rPr>
-        <w:t>始终无法持续在带——典型的调参残余失败（RL 略好 106.6，BO 更差 133.0，方向与总量表一致）。</w:t>
+        <w:t>单因素控制（延长/加容量/减半增益/加倍增益）无一翻转——最硬的未解决案例，减半增益仅改善 J（119.6→74.8）仍未通过。</w:t>
       </w:r>
     </w:p>
     <w:p>
@@ -3517,7 +3493,7 @@
           <w:i w:val="0"/>
           <w:sz w:val="21"/>
         </w:rPr>
-        <w:t>失败归因（</w:t>
+        <w:t>失败分析分两层（</w:t>
       </w:r>
       <w:r>
         <w:rPr>
@@ -3536,7 +3512,62 @@
           <w:i w:val="0"/>
           <w:sz w:val="21"/>
         </w:rPr>
-        <w:t>，322 个失败点）：7 个场景全算法失败——1 个容量紧张（负荷比&gt;0.85）+ 6 个观察窗不足（扰动结束距终点&lt;60 min），属物理/设计边界；</w:t>
+        <w:t xml:space="preserve"> 为</w:t>
+      </w:r>
+      <w:r>
+        <w:rPr>
+          <w:rFonts w:ascii="微软雅黑" w:hAnsi="微软雅黑" w:eastAsia="微软雅黑"/>
+          <w:b/>
+          <w:i w:val="0"/>
+          <w:sz w:val="21"/>
+        </w:rPr>
+        <w:t>疑似初筛</w:t>
+      </w:r>
+      <w:r>
+        <w:rPr>
+          <w:rFonts w:ascii="微软雅黑" w:hAnsi="微软雅黑" w:eastAsia="微软雅黑"/>
+          <w:b w:val="0"/>
+          <w:i w:val="0"/>
+          <w:sz w:val="21"/>
+        </w:rPr>
+        <w:t>，</w:t>
+      </w:r>
+      <w:r>
+        <w:rPr>
+          <w:rFonts w:ascii="Consolas" w:hAnsi="Consolas" w:eastAsia="微软雅黑"/>
+          <w:b w:val="0"/>
+          <w:i w:val="0"/>
+          <w:color w:val="A31515"/>
+          <w:sz w:val="19"/>
+        </w:rPr>
+        <w:t>failure_control_summary.csv</w:t>
+      </w:r>
+      <w:r>
+        <w:rPr>
+          <w:rFonts w:ascii="微软雅黑" w:hAnsi="微软雅黑" w:eastAsia="微软雅黑"/>
+          <w:b w:val="0"/>
+          <w:i w:val="0"/>
+          <w:sz w:val="21"/>
+        </w:rPr>
+        <w:t xml:space="preserve"> 为</w:t>
+      </w:r>
+      <w:r>
+        <w:rPr>
+          <w:rFonts w:ascii="微软雅黑" w:hAnsi="微软雅黑" w:eastAsia="微软雅黑"/>
+          <w:b/>
+          <w:i w:val="0"/>
+          <w:sz w:val="21"/>
+        </w:rPr>
+        <w:t>控制验证</w:t>
+      </w:r>
+      <w:r>
+        <w:rPr>
+          <w:rFonts w:ascii="微软雅黑" w:hAnsi="微软雅黑" w:eastAsia="微软雅黑"/>
+          <w:b w:val="0"/>
+          <w:i w:val="0"/>
+          <w:sz w:val="21"/>
+        </w:rPr>
+        <w:t>，352 个失败点）：</w:t>
       </w:r>
     </w:p>
     <w:p>
@@ -3550,45 +3581,7 @@
           <w:i w:val="0"/>
           <w:sz w:val="21"/>
         </w:rPr>
-        <w:t xml:space="preserve">IMC 系 33 个调参残余失败全部含 </w:t>
-      </w:r>
-      <w:r>
-        <w:rPr>
-          <w:rFonts w:ascii="Consolas" w:hAnsi="Consolas" w:eastAsia="微软雅黑"/>
-          <w:b w:val="0"/>
-          <w:i w:val="0"/>
-          <w:color w:val="A31515"/>
-          <w:sz w:val="19"/>
-        </w:rPr>
-        <w:t>recovery_ok</w:t>
-      </w:r>
-      <w:r>
-        <w:rPr>
-          <w:rFonts w:ascii="微软雅黑" w:hAnsi="微软雅黑" w:eastAsia="微软雅黑"/>
-          <w:b w:val="0"/>
-          <w:i w:val="0"/>
-          <w:sz w:val="21"/>
-        </w:rPr>
-        <w:t xml:space="preserve"> 未过（29 个兼 </w:t>
-      </w:r>
-      <w:r>
-        <w:rPr>
-          <w:rFonts w:ascii="Consolas" w:hAnsi="Consolas" w:eastAsia="微软雅黑"/>
-          <w:b w:val="0"/>
-          <w:i w:val="0"/>
-          <w:color w:val="A31515"/>
-          <w:sz w:val="19"/>
-        </w:rPr>
-        <w:t>comfort_held</w:t>
-      </w:r>
-      <w:r>
-        <w:rPr>
-          <w:rFonts w:ascii="微软雅黑" w:hAnsi="微软雅黑" w:eastAsia="微软雅黑"/>
-          <w:b w:val="0"/>
-          <w:i w:val="0"/>
-          <w:sz w:val="21"/>
-        </w:rPr>
-        <w:t xml:space="preserve"> 未过），负荷比 ≤0.62 且窗口 ≥1 h，</w:t>
+        <w:t>初筛 4 个全算法失败场景疑似窗口不足 + 41 个 IMC 疑似调参残余（B4 新集无疑似容量场景）。</w:t>
       </w:r>
     </w:p>
     <w:p>
@@ -3602,7 +3595,7 @@
           <w:i w:val="0"/>
           <w:sz w:val="21"/>
         </w:rPr>
-        <w:t>即容量与窗口均无问题——真实短板在扰动恢复控制。无任何方法系统性挽救 IMC 失败场景：</w:t>
+        <w:t>控制验证：减半增益翻转 28/41 疑似调参（确证为增益敏感型；与 B3 的 21/33 同模式复现），延长观察翻转 9/41；</w:t>
       </w:r>
     </w:p>
     <w:p>
@@ -3616,7 +3609,7 @@
           <w:i w:val="0"/>
           <w:sz w:val="21"/>
         </w:rPr>
-        <w:t>RL 挽救 #36 但新增 #25/#37（净 +1），BO 新增 7 个失败、挽救 0，Safe-BO/FNN/LLM 与 IMC 失败集完全一致。</w:t>
+        <w:t>疑似窗口 4 例延长翻转 2 例；B3 的疑似容量 1 例在任何控制下均未翻转——初筛启发式存在误报，已改判未解决，不放宽阈值。</w:t>
       </w:r>
     </w:p>
     <w:p>
@@ -3630,7 +3623,7 @@
           <w:i w:val="0"/>
           <w:sz w:val="21"/>
         </w:rPr>
-        <w:t>J 方向一致：失败均值 ~55 vs 通过均值 ~27（约 2×），综合目标与四门验收无系统性冲突——不存在“J 很好但验收不过”的目标设计问题。</w:t>
+        <w:t>组均值仅作一致性旁证（失败 ~48 vs 通过 ~26）：它不能证明目标设计无冲突，仅说明本批失败同时伴随 J 显著恶化。</w:t>
       </w:r>
     </w:p>
     <w:p>
@@ -3692,11 +3685,20 @@
       <w:r>
         <w:rPr>
           <w:rFonts w:ascii="微软雅黑" w:hAnsi="微软雅黑" w:eastAsia="微软雅黑"/>
+          <w:b/>
+          <w:i w:val="0"/>
+          <w:sz w:val="21"/>
+        </w:rPr>
+        <w:t>PRIMARY 双向聚类 GP−随机 −0.0059 [−0.1040,+0.1335]（含 0）</w:t>
+      </w:r>
+      <w:r>
+        <w:rPr>
+          <w:rFonts w:ascii="微软雅黑" w:hAnsi="微软雅黑" w:eastAsia="微软雅黑"/>
           <w:b w:val="0"/>
           <w:i w:val="0"/>
           <w:sz w:val="21"/>
         </w:rPr>
-        <w:t>混合池配对差 GP−随机 −0.0057 [−0.0373,+0.0284]（含 0），GP−初值 −0.1115 [−0.1419,−0.0791]（追加评估优于原地踏步）。</w:t>
+        <w:t>，GP−初值聚类 −0.1129 [−0.2083,−0.0301]。</w:t>
       </w:r>
     </w:p>
     <w:p>
@@ -3728,7 +3730,7 @@
           <w:i w:val="0"/>
           <w:sz w:val="21"/>
         </w:rPr>
-        <w:t>；逐种子波动大（9002 种子纯随机 0.9287 反超 GP 1.1048），单次比较不可作机制结论。</w:t>
+        <w:t>（仅 4 次搜索重复，区间诚实地宽）；</w:t>
       </w:r>
     </w:p>
     <w:p>
@@ -3742,7 +3744,7 @@
           <w:i w:val="0"/>
           <w:sz w:val="21"/>
         </w:rPr>
-        <w:t>旧版“GP 机制有效”表述撤回。</w:t>
+        <w:t>逐种子波动大（9002 种子纯随机反超），单次比较不可作机制结论。旧版朴素混合池区间仅作参考。</w:t>
       </w:r>
     </w:p>
     <w:p>
@@ -3770,7 +3772,7 @@
           <w:i w:val="0"/>
           <w:sz w:val="21"/>
         </w:rPr>
-        <w:t>B2 与 B3 同训练配置结论一致（BO 差、其余持平），B2 因部署门误用密封集降为历史，数字不再并列。</w:t>
+        <w:t>B2/B3（BO 差、其余持平）因密封集复用降为历史；B3→B4 唯一显著变化是 RL 转为小幅显著优。</w:t>
       </w:r>
     </w:p>
     <w:p>
@@ -3880,7 +3882,7 @@
           <w:i w:val="0"/>
           <w:sz w:val="21"/>
         </w:rPr>
-        <w:t xml:space="preserve"> + 脏位如实记录；B3 另有裁剪前完整 147 文件 </w:t>
+        <w:t xml:space="preserve"> + 脏位如实记录；B3 训练冻结另有裁剪前完整 147 文件 </w:t>
       </w:r>
       <w:r>
         <w:rPr>
@@ -3899,7 +3901,59 @@
           <w:i w:val="0"/>
           <w:sz w:val="21"/>
         </w:rPr>
-        <w:t xml:space="preserve"> 索引。</w:t>
+        <w:t xml:space="preserve"> 索引（指纹非文件本身，部分原始证据未随仓库保存，重跑可恢复验哈希）。</w:t>
+      </w:r>
+    </w:p>
+    <w:p>
+      <w:pPr>
+        <w:spacing w:after="80"/>
+      </w:pPr>
+      <w:r>
+        <w:rPr>
+          <w:rFonts w:ascii="微软雅黑" w:hAnsi="微软雅黑" w:eastAsia="微软雅黑"/>
+          <w:b w:val="0"/>
+          <w:i w:val="0"/>
+          <w:sz w:val="21"/>
+        </w:rPr>
+        <w:t>B4（0.81 MB）全量入库，无裁剪，</w:t>
+      </w:r>
+      <w:r>
+        <w:rPr>
+          <w:rFonts w:ascii="Consolas" w:hAnsi="Consolas" w:eastAsia="微软雅黑"/>
+          <w:b w:val="0"/>
+          <w:i w:val="0"/>
+          <w:color w:val="A31515"/>
+          <w:sz w:val="19"/>
+        </w:rPr>
+        <w:t>SHA256SUMS</w:t>
+      </w:r>
+      <w:r>
+        <w:rPr>
+          <w:rFonts w:ascii="微软雅黑" w:hAnsi="微软雅黑" w:eastAsia="微软雅黑"/>
+          <w:b w:val="0"/>
+          <w:i w:val="0"/>
+          <w:sz w:val="21"/>
+        </w:rPr>
+        <w:t xml:space="preserve"> + </w:t>
+      </w:r>
+      <w:r>
+        <w:rPr>
+          <w:rFonts w:ascii="Consolas" w:hAnsi="Consolas" w:eastAsia="微软雅黑"/>
+          <w:b w:val="0"/>
+          <w:i w:val="0"/>
+          <w:color w:val="A31515"/>
+          <w:sz w:val="19"/>
+        </w:rPr>
+        <w:t>evidence_index.csv</w:t>
+      </w:r>
+      <w:r>
+        <w:rPr>
+          <w:rFonts w:ascii="微软雅黑" w:hAnsi="微软雅黑" w:eastAsia="微软雅黑"/>
+          <w:b w:val="0"/>
+          <w:i w:val="0"/>
+          <w:sz w:val="21"/>
+        </w:rPr>
+        <w:t xml:space="preserve"> 齐全。</w:t>
       </w:r>
     </w:p>
     <w:p>
@@ -4140,7 +4194,7 @@
           <w:i w:val="0"/>
           <w:sz w:val="21"/>
         </w:rPr>
-        <w:t>分条件结论（E2-B3）：无任何方法显著优于 IMC；BO 显著差（归因未完成）；Safe-BO/FNN 等于 IMC；</w:t>
+        <w:t>分条件结论（E2-B4）：RL 小幅显著优（~4%，待多种子重复确认）；BO 显著差（归因未完成）；</w:t>
       </w:r>
     </w:p>
     <w:p>
@@ -4154,7 +4208,7 @@
           <w:i w:val="0"/>
           <w:sz w:val="21"/>
         </w:rPr>
-        <w:t>RL 未发现显著优势但非劣成立；Z-N 显著差。验收最高仅 40/80——主要矛盾是扰动恢复控制与合格率，不是排名。</w:t>
+        <w:t>Safe-BO/FNN（执行）/LLM 等于 IMC；Z-N 显著差。验收最高仅 37/80——主要矛盾是扰动恢复控制与合格率，不是排名。</w:t>
       </w:r>
     </w:p>
     <w:p>
@@ -4168,7 +4222,7 @@
           <w:i w:val="0"/>
           <w:sz w:val="21"/>
         </w:rPr>
-        <w:t>局限：单一种子单预算（多种子重复缺）；BO 预算仅 14 评估；实体/HIL/目标 WCET 全缺（3/3 PENDING）；</w:t>
+        <w:t>局限：单一种子单预算；BO 预算仅 14 评估；GP 机制贡献未经证实（仅 4 搜索重复）；</w:t>
       </w:r>
     </w:p>
     <w:p>
@@ -4182,7 +4236,7 @@
           <w:i w:val="0"/>
           <w:sz w:val="21"/>
         </w:rPr>
-        <w:t>GP 机制贡献未经证实；PDF 未生成（DOCX 为准，人工逐页清单见附件交付检查）。</w:t>
+        <w:t>实体/HIL/目标 WCET 全缺（3/3 PENDING）；PDF 未生成（DOCX 为准，人工逐页清单见附件交付检查）。</w:t>
       </w:r>
     </w:p>
     <w:p>
@@ -4210,7 +4264,7 @@
           <w:i w:val="0"/>
           <w:sz w:val="21"/>
         </w:rPr>
-        <w:t>历史批次（B1/B2）冻结保留，不再覆盖；新批次一律换 run_id。</w:t>
+        <w:t>历史批次（B1/B2/B3）冻结保留，不再覆盖；新批次一律换 run_id。</w:t>
       </w:r>
     </w:p>
     <w:p>
@@ -4312,31 +4366,18 @@
     </w:p>
     <w:p>
       <w:pPr>
-        <w:spacing w:after="80"/>
+        <w:spacing w:after="40"/>
+        <w:ind w:left="425"/>
       </w:pPr>
       <w:r>
         <w:rPr>
           <w:rFonts w:ascii="微软雅黑" w:hAnsi="微软雅黑" w:eastAsia="微软雅黑"/>
           <w:b w:val="0"/>
           <w:i w:val="0"/>
+          <w:color w:val="1F4E79"/>
           <w:sz w:val="21"/>
         </w:rPr>
-        <w:t>B3 全链（约 200 s + 评价约 8 min）：</w:t>
-      </w:r>
-    </w:p>
-    <w:p>
-      <w:pPr>
-        <w:spacing w:after="80"/>
-      </w:pPr>
-      <w:r>
-        <w:rPr>
-          <w:rFonts w:ascii="Consolas" w:hAnsi="Consolas" w:eastAsia="微软雅黑"/>
-          <w:b w:val="0"/>
-          <w:i w:val="0"/>
-          <w:color w:val="A31515"/>
-          <w:sz w:val="19"/>
-        </w:rPr>
-        <w:t>python run.py pipeline --output artifacts/runs/&lt;run_id&gt; --seed 7</w:t>
+        <w:t xml:space="preserve">•  </w:t>
       </w:r>
       <w:r>
         <w:rPr>
@@ -4345,55 +4386,7 @@
           <w:i w:val="0"/>
           <w:sz w:val="21"/>
         </w:rPr>
-        <w:t xml:space="preserve"> →</w:t>
-      </w:r>
-    </w:p>
-    <w:p>
-      <w:pPr>
-        <w:spacing w:after="80"/>
-      </w:pPr>
-      <w:r>
-        <w:rPr>
-          <w:rFonts w:ascii="Consolas" w:hAnsi="Consolas" w:eastAsia="微软雅黑"/>
-          <w:b w:val="0"/>
-          <w:i w:val="0"/>
-          <w:color w:val="A31515"/>
-          <w:sz w:val="19"/>
-        </w:rPr>
-        <w:t>python run.py sealed --artifact-dir &lt;run_id&gt; --output &lt;sealed&gt; --protocol-label E2-B3</w:t>
-      </w:r>
-      <w:r>
-        <w:rPr>
-          <w:rFonts w:ascii="微软雅黑" w:hAnsi="微软雅黑" w:eastAsia="微软雅黑"/>
-          <w:b w:val="0"/>
-          <w:i w:val="0"/>
-          <w:sz w:val="21"/>
-        </w:rPr>
-        <w:t xml:space="preserve"> →</w:t>
-      </w:r>
-    </w:p>
-    <w:p>
-      <w:pPr>
-        <w:spacing w:after="80"/>
-      </w:pPr>
-      <w:r>
-        <w:rPr>
-          <w:rFonts w:ascii="Consolas" w:hAnsi="Consolas" w:eastAsia="微软雅黑"/>
-          <w:b w:val="0"/>
-          <w:i w:val="0"/>
-          <w:color w:val="A31515"/>
-          <w:sz w:val="19"/>
-        </w:rPr>
-        <w:t>python tools/run_gp_attribution.py / make_budget_table.py / analyze_failures.py / make_sealed_figures.py</w:t>
-      </w:r>
-      <w:r>
-        <w:rPr>
-          <w:rFonts w:ascii="微软雅黑" w:hAnsi="微软雅黑" w:eastAsia="微软雅黑"/>
-          <w:b w:val="0"/>
-          <w:i w:val="0"/>
-          <w:sz w:val="21"/>
-        </w:rPr>
-        <w:t xml:space="preserve">（参数见各 </w:t>
+        <w:t>B4 全链（每条可直接复制；</w:t>
       </w:r>
       <w:r>
         <w:rPr>
@@ -4403,7 +4396,7 @@
           <w:color w:val="A31515"/>
           <w:sz w:val="19"/>
         </w:rPr>
-        <w:t>--help</w:t>
+        <w:t>&lt;run&gt;</w:t>
       </w:r>
       <w:r>
         <w:rPr>
@@ -4412,7 +4405,176 @@
           <w:i w:val="0"/>
           <w:sz w:val="21"/>
         </w:rPr>
-        <w:t>）。</w:t>
+        <w:t>=</w:t>
+      </w:r>
+      <w:r>
+        <w:rPr>
+          <w:rFonts w:ascii="Consolas" w:hAnsi="Consolas" w:eastAsia="微软雅黑"/>
+          <w:b w:val="0"/>
+          <w:i w:val="0"/>
+          <w:color w:val="A31515"/>
+          <w:sz w:val="19"/>
+        </w:rPr>
+        <w:t>artifacts/runs/v4-20260906-bf6bda6</w:t>
+      </w:r>
+      <w:r>
+        <w:rPr>
+          <w:rFonts w:ascii="微软雅黑" w:hAnsi="微软雅黑" w:eastAsia="微软雅黑"/>
+          <w:b w:val="0"/>
+          <w:i w:val="0"/>
+          <w:sz w:val="21"/>
+        </w:rPr>
+        <w:t>，</w:t>
+      </w:r>
+      <w:r>
+        <w:rPr>
+          <w:rFonts w:ascii="Consolas" w:hAnsi="Consolas" w:eastAsia="微软雅黑"/>
+          <w:b w:val="0"/>
+          <w:i w:val="0"/>
+          <w:color w:val="A31515"/>
+          <w:sz w:val="19"/>
+        </w:rPr>
+        <w:t>&lt;sealed&gt;</w:t>
+      </w:r>
+      <w:r>
+        <w:rPr>
+          <w:rFonts w:ascii="微软雅黑" w:hAnsi="微软雅黑" w:eastAsia="微软雅黑"/>
+          <w:b w:val="0"/>
+          <w:i w:val="0"/>
+          <w:sz w:val="21"/>
+        </w:rPr>
+        <w:t>=</w:t>
+      </w:r>
+      <w:r>
+        <w:rPr>
+          <w:rFonts w:ascii="Consolas" w:hAnsi="Consolas" w:eastAsia="微软雅黑"/>
+          <w:b w:val="0"/>
+          <w:i w:val="0"/>
+          <w:color w:val="A31515"/>
+          <w:sz w:val="19"/>
+        </w:rPr>
+        <w:t>artifacts/runs/sealed-80x7-b4</w:t>
+      </w:r>
+      <w:r>
+        <w:rPr>
+          <w:rFonts w:ascii="微软雅黑" w:hAnsi="微软雅黑" w:eastAsia="微软雅黑"/>
+          <w:b w:val="0"/>
+          <w:i w:val="0"/>
+          <w:sz w:val="21"/>
+        </w:rPr>
+        <w:t>）：</w:t>
+      </w:r>
+    </w:p>
+    <w:p>
+      <w:pPr>
+        <w:ind w:left="283"/>
+      </w:pPr>
+      <w:r>
+        <w:rPr>
+          <w:rFonts w:ascii="Consolas" w:hAnsi="Consolas" w:eastAsia="微软雅黑"/>
+          <w:b w:val="0"/>
+          <w:i w:val="0"/>
+          <w:sz w:val="18"/>
+        </w:rPr>
+        <w:t>python run.py sealed --artifact-dir &lt;run&gt; --output &lt;sealed&gt; --protocol-label E2-B4 --acceptance-seeds 601,611,621,631,641 --design-note "fresh sealed scenarios unseen in any prior analysis"</w:t>
+      </w:r>
+    </w:p>
+    <w:p>
+      <w:pPr>
+        <w:ind w:left="283"/>
+      </w:pPr>
+      <w:r>
+        <w:rPr>
+          <w:rFonts w:ascii="Consolas" w:hAnsi="Consolas" w:eastAsia="微软雅黑"/>
+          <w:b w:val="0"/>
+          <w:i w:val="0"/>
+          <w:sz w:val="18"/>
+        </w:rPr>
+        <w:t>python run.py attribution --artifact-dir &lt;run&gt; --output &lt;sealed&gt;/gp_attribution.csv --seed 7 --train-seed 7 --acceptance-seeds 601,611,621,631,641</w:t>
+      </w:r>
+    </w:p>
+    <w:p>
+      <w:pPr>
+        <w:ind w:left="283"/>
+      </w:pPr>
+      <w:r>
+        <w:rPr>
+          <w:rFonts w:ascii="Consolas" w:hAnsi="Consolas" w:eastAsia="微软雅黑"/>
+          <w:b w:val="0"/>
+          <w:i w:val="0"/>
+          <w:sz w:val="18"/>
+        </w:rPr>
+        <w:t>python run.py budget --run &lt;run&gt; --sealed &lt;sealed&gt; --wall-seconds 197.8</w:t>
+      </w:r>
+    </w:p>
+    <w:p>
+      <w:pPr>
+        <w:ind w:left="283"/>
+      </w:pPr>
+      <w:r>
+        <w:rPr>
+          <w:rFonts w:ascii="Consolas" w:hAnsi="Consolas" w:eastAsia="微软雅黑"/>
+          <w:b w:val="0"/>
+          <w:i w:val="0"/>
+          <w:sz w:val="18"/>
+        </w:rPr>
+        <w:t>python run.py failures --sealed &lt;sealed&gt;</w:t>
+      </w:r>
+    </w:p>
+    <w:p>
+      <w:pPr>
+        <w:ind w:left="283"/>
+      </w:pPr>
+      <w:r>
+        <w:rPr>
+          <w:rFonts w:ascii="Consolas" w:hAnsi="Consolas" w:eastAsia="微软雅黑"/>
+          <w:b w:val="0"/>
+          <w:i w:val="0"/>
+          <w:sz w:val="18"/>
+        </w:rPr>
+        <w:t>python run.py controls --artifact-dir &lt;run&gt; --sealed &lt;sealed&gt;</w:t>
+      </w:r>
+    </w:p>
+    <w:p>
+      <w:pPr>
+        <w:ind w:left="283"/>
+      </w:pPr>
+      <w:r>
+        <w:rPr>
+          <w:rFonts w:ascii="Consolas" w:hAnsi="Consolas" w:eastAsia="微软雅黑"/>
+          <w:b w:val="0"/>
+          <w:i w:val="0"/>
+          <w:sz w:val="18"/>
+        </w:rPr>
+        <w:t>python run.py figures --artifact-dir &lt;run&gt; --sealed &lt;sealed&gt;</w:t>
+      </w:r>
+    </w:p>
+    <w:p>
+      <w:pPr>
+        <w:ind w:left="283"/>
+      </w:pPr>
+      <w:r>
+        <w:rPr>
+          <w:rFonts w:ascii="Consolas" w:hAnsi="Consolas" w:eastAsia="微软雅黑"/>
+          <w:b w:val="0"/>
+          <w:i w:val="0"/>
+          <w:sz w:val="18"/>
+        </w:rPr>
+        <w:t>python tools/check_results_consistency.py --sealed-dir &lt;sealed&gt;</w:t>
+      </w:r>
+    </w:p>
+    <w:p>
+      <w:pPr>
+        <w:ind w:left="283"/>
+      </w:pPr>
+      <w:r>
+        <w:rPr>
+          <w:rFonts w:ascii="Consolas" w:hAnsi="Consolas" w:eastAsia="微软雅黑"/>
+          <w:b w:val="0"/>
+          <w:i w:val="0"/>
+          <w:sz w:val="18"/>
+        </w:rPr>
+        <w:t>python tools/check_docx.py</w:t>
       </w:r>
     </w:p>
     <w:p>
@@ -4447,7 +4609,7 @@
           <w:color w:val="A31515"/>
           <w:sz w:val="19"/>
         </w:rPr>
-        <w:t>artifacts/runs/sealed-80x7-b3/</w:t>
+        <w:t>artifacts/runs/sealed-80x7-b4/</w:t>
       </w:r>
       <w:r>
         <w:rPr>
@@ -4456,7 +4618,7 @@
           <w:i w:val="0"/>
           <w:sz w:val="21"/>
         </w:rPr>
-        <w:t>（B3 主：汇总/归因/预算/失败/曲线/溯源）+</w:t>
+        <w:t>（B4 主，全量）+</w:t>
       </w:r>
     </w:p>
     <w:p>
@@ -4480,7 +4642,7 @@
           <w:i w:val="0"/>
           <w:sz w:val="21"/>
         </w:rPr>
-        <w:t xml:space="preserve">（B3 训练冻结 + </w:t>
+        <w:t xml:space="preserve">（训练冻结 + </w:t>
       </w:r>
       <w:r>
         <w:rPr>
@@ -4542,7 +4704,26 @@
           <w:i w:val="0"/>
           <w:sz w:val="21"/>
         </w:rPr>
-        <w:t>（B2，旧归因作废）+</w:t>
+        <w:t xml:space="preserve">（B2，旧归因作废）+ </w:t>
+      </w:r>
+      <w:r>
+        <w:rPr>
+          <w:rFonts w:ascii="Consolas" w:hAnsi="Consolas" w:eastAsia="微软雅黑"/>
+          <w:b w:val="0"/>
+          <w:i w:val="0"/>
+          <w:color w:val="A31515"/>
+          <w:sz w:val="19"/>
+        </w:rPr>
+        <w:t>sealed-80x7-b3/</w:t>
+      </w:r>
+      <w:r>
+        <w:rPr>
+          <w:rFonts w:ascii="微软雅黑" w:hAnsi="微软雅黑" w:eastAsia="微软雅黑"/>
+          <w:b w:val="0"/>
+          <w:i w:val="0"/>
+          <w:sz w:val="21"/>
+        </w:rPr>
+        <w:t>（B3，场景复用）+</w:t>
       </w:r>
     </w:p>
     <w:p>
@@ -4711,7 +4892,7 @@
           <w:i w:val="0"/>
           <w:sz w:val="21"/>
         </w:rPr>
-        <w:t>（B3 视角下第 03 篇划分描述与第 11 篇 B1 表格为历史版本，结论以本主报告 Ch5 为准）；</w:t>
+        <w:t>（B4 视角下第 03 篇划分描述与第 11 篇 B1 表格为历史版本，结论以本主报告 Ch5 为准）；</w:t>
       </w:r>
     </w:p>
     <w:p>
@@ -4898,7 +5079,7 @@
           <w:i w:val="0"/>
           <w:sz w:val="21"/>
         </w:rPr>
-        <w:t>实验登记：正文/图表/CSV 统一用 E1–E5（B1/B2/B3 后缀区分轮次）；</w:t>
+        <w:t>实验登记：正文/图表/CSV 统一用 E1–E5（B1/B2/B3/B4 后缀区分轮次）；</w:t>
       </w:r>
       <w:r>
         <w:rPr>

</xml_diff>